<commit_message>
Date: 21 Oct 2026
</commit_message>
<xml_diff>
--- a/Selenium Assignments.docx
+++ b/Selenium Assignments.docx
@@ -71,8 +71,524 @@
         </w:rPr>
         <w:t>) method (like getTitle) and tell me what is the return type of this method and what is the purpose of this method.</w:t>
       </w:r>
+    </w:p>
+    <w:p>
+      <w:pPr>
+        <w:rPr>
+          <w:b/>
+          <w:bCs/>
+          <w:sz w:val="28"/>
+          <w:szCs w:val="24"/>
+        </w:rPr>
+      </w:pPr>
       <w:bookmarkStart w:id="0" w:name="_GoBack"/>
+      <w:r>
+        <w:rPr>
+          <w:b/>
+          <w:bCs/>
+          <w:sz w:val="28"/>
+          <w:szCs w:val="24"/>
+        </w:rPr>
+        <w:t>Date: 21 Oct. 26</w:t>
+      </w:r>
+      <w:r>
+        <w:rPr>
+          <w:b/>
+          <w:bCs/>
+          <w:sz w:val="28"/>
+          <w:szCs w:val="24"/>
+        </w:rPr>
+        <w:br/>
+      </w:r>
       <w:bookmarkEnd w:id="0"/>
+    </w:p>
+    <w:p>
+      <w:pPr>
+        <w:pStyle w:val="ListParagraph"/>
+        <w:numPr>
+          <w:ilvl w:val="0"/>
+          <w:numId w:val="1"/>
+        </w:numPr>
+        <w:rPr>
+          <w:sz w:val="28"/>
+          <w:szCs w:val="24"/>
+        </w:rPr>
+      </w:pPr>
+      <w:r>
+        <w:rPr>
+          <w:sz w:val="28"/>
+          <w:szCs w:val="24"/>
+        </w:rPr>
+        <w:t xml:space="preserve">Open </w:t>
+      </w:r>
+      <w:hyperlink r:id="rId5" w:history="1">
+        <w:r>
+          <w:rPr>
+            <w:rStyle w:val="Hyperlink"/>
+            <w:sz w:val="28"/>
+            <w:szCs w:val="24"/>
+          </w:rPr>
+          <w:t>https://practicetestautomation.com/practice-test-login/</w:t>
+        </w:r>
+      </w:hyperlink>
+    </w:p>
+    <w:p>
+      <w:pPr>
+        <w:pStyle w:val="ListParagraph"/>
+        <w:numPr>
+          <w:ilvl w:val="1"/>
+          <w:numId w:val="1"/>
+        </w:numPr>
+        <w:rPr>
+          <w:sz w:val="28"/>
+          <w:szCs w:val="24"/>
+        </w:rPr>
+      </w:pPr>
+      <w:r>
+        <w:rPr>
+          <w:sz w:val="28"/>
+          <w:szCs w:val="24"/>
+        </w:rPr>
+        <w:t>Enter user name as your name</w:t>
+      </w:r>
+    </w:p>
+    <w:p>
+      <w:pPr>
+        <w:pStyle w:val="ListParagraph"/>
+        <w:numPr>
+          <w:ilvl w:val="1"/>
+          <w:numId w:val="1"/>
+        </w:numPr>
+        <w:rPr>
+          <w:sz w:val="28"/>
+          <w:szCs w:val="24"/>
+        </w:rPr>
+      </w:pPr>
+      <w:r>
+        <w:rPr>
+          <w:sz w:val="28"/>
+          <w:szCs w:val="24"/>
+        </w:rPr>
+        <w:t>Enter password as yourname@123</w:t>
+      </w:r>
+    </w:p>
+    <w:p>
+      <w:pPr>
+        <w:pStyle w:val="ListParagraph"/>
+        <w:numPr>
+          <w:ilvl w:val="1"/>
+          <w:numId w:val="1"/>
+        </w:numPr>
+        <w:rPr>
+          <w:sz w:val="28"/>
+          <w:szCs w:val="24"/>
+        </w:rPr>
+      </w:pPr>
+      <w:r>
+        <w:rPr>
+          <w:sz w:val="28"/>
+          <w:szCs w:val="24"/>
+        </w:rPr>
+        <w:t>Click on Login button</w:t>
+      </w:r>
+      <w:r>
+        <w:rPr>
+          <w:sz w:val="28"/>
+          <w:szCs w:val="24"/>
+        </w:rPr>
+        <w:br/>
+      </w:r>
+      <w:r>
+        <w:rPr>
+          <w:b/>
+          <w:bCs/>
+          <w:sz w:val="28"/>
+          <w:szCs w:val="24"/>
+        </w:rPr>
+        <w:t>Use Name Locator</w:t>
+      </w:r>
+    </w:p>
+    <w:p>
+      <w:pPr>
+        <w:pStyle w:val="ListParagraph"/>
+        <w:numPr>
+          <w:ilvl w:val="0"/>
+          <w:numId w:val="1"/>
+        </w:numPr>
+        <w:rPr>
+          <w:sz w:val="28"/>
+          <w:szCs w:val="24"/>
+        </w:rPr>
+      </w:pPr>
+      <w:r>
+        <w:rPr>
+          <w:sz w:val="28"/>
+          <w:szCs w:val="24"/>
+        </w:rPr>
+        <w:t xml:space="preserve">Open </w:t>
+      </w:r>
+      <w:hyperlink r:id="rId6" w:history="1">
+        <w:r>
+          <w:rPr>
+            <w:rStyle w:val="Hyperlink"/>
+            <w:sz w:val="28"/>
+            <w:szCs w:val="24"/>
+          </w:rPr>
+          <w:t>https://www.saucedemo.com/</w:t>
+        </w:r>
+      </w:hyperlink>
+    </w:p>
+    <w:p>
+      <w:pPr>
+        <w:pStyle w:val="ListParagraph"/>
+        <w:numPr>
+          <w:ilvl w:val="1"/>
+          <w:numId w:val="1"/>
+        </w:numPr>
+        <w:rPr>
+          <w:sz w:val="28"/>
+          <w:szCs w:val="24"/>
+        </w:rPr>
+      </w:pPr>
+      <w:r>
+        <w:rPr>
+          <w:sz w:val="28"/>
+          <w:szCs w:val="24"/>
+        </w:rPr>
+        <w:t xml:space="preserve">Enter user name as </w:t>
+      </w:r>
+      <w:proofErr w:type="spellStart"/>
+      <w:r>
+        <w:rPr>
+          <w:rFonts w:ascii="Arial" w:hAnsi="Arial" w:cs="Arial"/>
+          <w:color w:val="FFFFFF"/>
+          <w:sz w:val="21"/>
+          <w:szCs w:val="21"/>
+          <w:shd w:val="clear" w:color="auto" w:fill="132322"/>
+        </w:rPr>
+        <w:t>standard_user</w:t>
+      </w:r>
+      <w:proofErr w:type="spellEnd"/>
+    </w:p>
+    <w:p>
+      <w:pPr>
+        <w:pStyle w:val="ListParagraph"/>
+        <w:numPr>
+          <w:ilvl w:val="1"/>
+          <w:numId w:val="1"/>
+        </w:numPr>
+        <w:rPr>
+          <w:sz w:val="28"/>
+          <w:szCs w:val="24"/>
+        </w:rPr>
+      </w:pPr>
+      <w:r>
+        <w:rPr>
+          <w:sz w:val="28"/>
+          <w:szCs w:val="24"/>
+        </w:rPr>
+        <w:t xml:space="preserve">Enter password </w:t>
+      </w:r>
+      <w:r>
+        <w:rPr>
+          <w:sz w:val="28"/>
+          <w:szCs w:val="24"/>
+        </w:rPr>
+        <w:t xml:space="preserve">as </w:t>
+      </w:r>
+      <w:proofErr w:type="spellStart"/>
+      <w:r>
+        <w:rPr>
+          <w:rFonts w:ascii="Arial" w:hAnsi="Arial" w:cs="Arial"/>
+          <w:color w:val="FFFFFF"/>
+          <w:sz w:val="21"/>
+          <w:szCs w:val="21"/>
+          <w:shd w:val="clear" w:color="auto" w:fill="132322"/>
+        </w:rPr>
+        <w:t>secret_sauce</w:t>
+      </w:r>
+      <w:proofErr w:type="spellEnd"/>
+    </w:p>
+    <w:p>
+      <w:pPr>
+        <w:pStyle w:val="ListParagraph"/>
+        <w:numPr>
+          <w:ilvl w:val="1"/>
+          <w:numId w:val="1"/>
+        </w:numPr>
+        <w:rPr>
+          <w:sz w:val="28"/>
+          <w:szCs w:val="24"/>
+        </w:rPr>
+      </w:pPr>
+      <w:r>
+        <w:rPr>
+          <w:sz w:val="28"/>
+          <w:szCs w:val="24"/>
+        </w:rPr>
+        <w:t>Click on Login button</w:t>
+      </w:r>
+    </w:p>
+    <w:p>
+      <w:pPr>
+        <w:pStyle w:val="ListParagraph"/>
+        <w:numPr>
+          <w:ilvl w:val="1"/>
+          <w:numId w:val="1"/>
+        </w:numPr>
+        <w:rPr>
+          <w:sz w:val="28"/>
+          <w:szCs w:val="24"/>
+        </w:rPr>
+      </w:pPr>
+      <w:r>
+        <w:rPr>
+          <w:sz w:val="28"/>
+          <w:szCs w:val="24"/>
+        </w:rPr>
+        <w:t>Check whether the login is successful or not and display the message as test case pass or fail</w:t>
+      </w:r>
+      <w:r>
+        <w:rPr>
+          <w:sz w:val="28"/>
+          <w:szCs w:val="24"/>
+        </w:rPr>
+        <w:br/>
+      </w:r>
+      <w:r>
+        <w:rPr>
+          <w:b/>
+          <w:bCs/>
+          <w:sz w:val="28"/>
+          <w:szCs w:val="24"/>
+        </w:rPr>
+        <w:t>Use Id Locator</w:t>
+      </w:r>
+    </w:p>
+    <w:p>
+      <w:pPr>
+        <w:pStyle w:val="ListParagraph"/>
+        <w:numPr>
+          <w:ilvl w:val="0"/>
+          <w:numId w:val="1"/>
+        </w:numPr>
+        <w:rPr>
+          <w:sz w:val="28"/>
+          <w:szCs w:val="24"/>
+        </w:rPr>
+      </w:pPr>
+      <w:r>
+        <w:rPr>
+          <w:sz w:val="28"/>
+          <w:szCs w:val="24"/>
+        </w:rPr>
+        <w:t xml:space="preserve">Open </w:t>
+      </w:r>
+      <w:hyperlink r:id="rId7" w:history="1">
+        <w:r>
+          <w:rPr>
+            <w:rStyle w:val="Hyperlink"/>
+            <w:sz w:val="28"/>
+            <w:szCs w:val="24"/>
+          </w:rPr>
+          <w:t>https://www.google.com</w:t>
+        </w:r>
+      </w:hyperlink>
+    </w:p>
+    <w:p>
+      <w:pPr>
+        <w:pStyle w:val="ListParagraph"/>
+        <w:numPr>
+          <w:ilvl w:val="1"/>
+          <w:numId w:val="1"/>
+        </w:numPr>
+        <w:rPr>
+          <w:sz w:val="28"/>
+          <w:szCs w:val="24"/>
+        </w:rPr>
+      </w:pPr>
+      <w:r>
+        <w:rPr>
+          <w:sz w:val="28"/>
+          <w:szCs w:val="24"/>
+        </w:rPr>
+        <w:t xml:space="preserve">Search for </w:t>
+      </w:r>
+      <w:r>
+        <w:rPr>
+          <w:b/>
+          <w:bCs/>
+          <w:sz w:val="28"/>
+          <w:szCs w:val="24"/>
+        </w:rPr>
+        <w:t>Pattankodoli Yatra</w:t>
+      </w:r>
+    </w:p>
+    <w:p>
+      <w:pPr>
+        <w:pStyle w:val="ListParagraph"/>
+        <w:numPr>
+          <w:ilvl w:val="1"/>
+          <w:numId w:val="1"/>
+        </w:numPr>
+        <w:rPr>
+          <w:sz w:val="28"/>
+          <w:szCs w:val="24"/>
+        </w:rPr>
+      </w:pPr>
+      <w:r>
+        <w:rPr>
+          <w:sz w:val="28"/>
+          <w:szCs w:val="24"/>
+        </w:rPr>
+        <w:t>Hit Enter</w:t>
+      </w:r>
+      <w:r>
+        <w:rPr>
+          <w:sz w:val="28"/>
+          <w:szCs w:val="24"/>
+        </w:rPr>
+        <w:br/>
+      </w:r>
+      <w:r>
+        <w:rPr>
+          <w:b/>
+          <w:bCs/>
+          <w:sz w:val="28"/>
+          <w:szCs w:val="24"/>
+        </w:rPr>
+        <w:t>Use any locator</w:t>
+      </w:r>
+    </w:p>
+    <w:p>
+      <w:pPr>
+        <w:pStyle w:val="ListParagraph"/>
+        <w:numPr>
+          <w:ilvl w:val="0"/>
+          <w:numId w:val="1"/>
+        </w:numPr>
+        <w:rPr>
+          <w:sz w:val="28"/>
+          <w:szCs w:val="24"/>
+          <w:highlight w:val="yellow"/>
+        </w:rPr>
+      </w:pPr>
+      <w:r>
+        <w:rPr>
+          <w:sz w:val="28"/>
+          <w:szCs w:val="24"/>
+          <w:highlight w:val="yellow"/>
+        </w:rPr>
+        <w:t xml:space="preserve">Open </w:t>
+      </w:r>
+      <w:hyperlink r:id="rId8" w:history="1">
+        <w:r>
+          <w:rPr>
+            <w:rStyle w:val="Hyperlink"/>
+            <w:sz w:val="28"/>
+            <w:szCs w:val="24"/>
+            <w:highlight w:val="yellow"/>
+          </w:rPr>
+          <w:t>https://www.echotrak.com/Login.aspx?ReturnUrl=%2f</w:t>
+        </w:r>
+      </w:hyperlink>
+    </w:p>
+    <w:p>
+      <w:pPr>
+        <w:pStyle w:val="ListParagraph"/>
+        <w:numPr>
+          <w:ilvl w:val="1"/>
+          <w:numId w:val="1"/>
+        </w:numPr>
+        <w:rPr>
+          <w:sz w:val="28"/>
+          <w:szCs w:val="24"/>
+          <w:highlight w:val="yellow"/>
+        </w:rPr>
+      </w:pPr>
+      <w:r>
+        <w:rPr>
+          <w:sz w:val="28"/>
+          <w:szCs w:val="24"/>
+          <w:highlight w:val="yellow"/>
+        </w:rPr>
+        <w:t>Enter admin as user name</w:t>
+      </w:r>
+    </w:p>
+    <w:p>
+      <w:pPr>
+        <w:pStyle w:val="ListParagraph"/>
+        <w:numPr>
+          <w:ilvl w:val="1"/>
+          <w:numId w:val="1"/>
+        </w:numPr>
+        <w:rPr>
+          <w:sz w:val="28"/>
+          <w:szCs w:val="24"/>
+          <w:highlight w:val="yellow"/>
+        </w:rPr>
+      </w:pPr>
+      <w:r>
+        <w:rPr>
+          <w:sz w:val="28"/>
+          <w:szCs w:val="24"/>
+          <w:highlight w:val="yellow"/>
+        </w:rPr>
+        <w:t>Enter admin123 as password</w:t>
+      </w:r>
+    </w:p>
+    <w:p>
+      <w:pPr>
+        <w:pStyle w:val="ListParagraph"/>
+        <w:numPr>
+          <w:ilvl w:val="1"/>
+          <w:numId w:val="1"/>
+        </w:numPr>
+        <w:rPr>
+          <w:sz w:val="28"/>
+          <w:szCs w:val="24"/>
+          <w:highlight w:val="yellow"/>
+        </w:rPr>
+      </w:pPr>
+      <w:r>
+        <w:rPr>
+          <w:sz w:val="28"/>
+          <w:szCs w:val="24"/>
+          <w:highlight w:val="yellow"/>
+        </w:rPr>
+        <w:t>Click on Login button</w:t>
+      </w:r>
+      <w:r>
+        <w:rPr>
+          <w:sz w:val="28"/>
+          <w:szCs w:val="24"/>
+          <w:highlight w:val="yellow"/>
+        </w:rPr>
+        <w:br/>
+      </w:r>
+      <w:r>
+        <w:rPr>
+          <w:b/>
+          <w:bCs/>
+          <w:sz w:val="28"/>
+          <w:szCs w:val="24"/>
+          <w:highlight w:val="yellow"/>
+        </w:rPr>
+        <w:t>Use ClassName locator</w:t>
+      </w:r>
+    </w:p>
+    <w:p>
+      <w:pPr>
+        <w:pStyle w:val="ListParagraph"/>
+        <w:numPr>
+          <w:ilvl w:val="0"/>
+          <w:numId w:val="1"/>
+        </w:numPr>
+        <w:rPr>
+          <w:sz w:val="28"/>
+          <w:szCs w:val="24"/>
+        </w:rPr>
+      </w:pPr>
     </w:p>
     <w:sectPr>
       <w:pgSz w:w="11906" w:h="16838"/>
@@ -102,7 +618,7 @@
         <w:rFonts w:hint="default"/>
       </w:rPr>
     </w:lvl>
-    <w:lvl w:ilvl="1" w:tplc="40090019" w:tentative="1">
+    <w:lvl w:ilvl="1" w:tplc="40090019">
       <w:start w:val="1"/>
       <w:numFmt w:val="lowerLetter"/>
       <w:lvlText w:val="%2."/>
@@ -615,6 +1131,17 @@
       <w:contextualSpacing/>
     </w:pPr>
   </w:style>
+  <w:style w:type="character" w:styleId="Hyperlink">
+    <w:name w:val="Hyperlink"/>
+    <w:basedOn w:val="DefaultParagraphFont"/>
+    <w:uiPriority w:val="99"/>
+    <w:unhideWhenUsed/>
+    <w:rsid w:val="00104706"/>
+    <w:rPr>
+      <w:color w:val="0563C1" w:themeColor="hyperlink"/>
+      <w:u w:val="single"/>
+    </w:rPr>
+  </w:style>
 </w:styles>
 </file>
 

</xml_diff>

<commit_message>
Date: 22 Oct 2026
</commit_message>
<xml_diff>
--- a/Selenium Assignments.docx
+++ b/Selenium Assignments.docx
@@ -53,23 +53,7 @@
           <w:sz w:val="28"/>
           <w:szCs w:val="24"/>
         </w:rPr>
-        <w:t xml:space="preserve">Open any website and call </w:t>
-      </w:r>
-      <w:proofErr w:type="gramStart"/>
-      <w:r>
-        <w:rPr>
-          <w:sz w:val="28"/>
-          <w:szCs w:val="24"/>
-        </w:rPr>
-        <w:t>getPageSource(</w:t>
-      </w:r>
-      <w:proofErr w:type="gramEnd"/>
-      <w:r>
-        <w:rPr>
-          <w:sz w:val="28"/>
-          <w:szCs w:val="24"/>
-        </w:rPr>
-        <w:t>) method (like getTitle) and tell me what is the return type of this method and what is the purpose of this method.</w:t>
+        <w:t>Open any website and call getPageSource() method (like getTitle) and tell me what is the return type of this method and what is the purpose of this method.</w:t>
       </w:r>
     </w:p>
     <w:p>
@@ -81,7 +65,6 @@
           <w:szCs w:val="24"/>
         </w:rPr>
       </w:pPr>
-      <w:bookmarkStart w:id="0" w:name="_GoBack"/>
       <w:r>
         <w:rPr>
           <w:b/>
@@ -100,7 +83,6 @@
         </w:rPr>
         <w:br/>
       </w:r>
-      <w:bookmarkEnd w:id="0"/>
     </w:p>
     <w:p>
       <w:pPr>
@@ -257,7 +239,6 @@
         </w:rPr>
         <w:t xml:space="preserve">Enter user name as </w:t>
       </w:r>
-      <w:proofErr w:type="spellStart"/>
       <w:r>
         <w:rPr>
           <w:rFonts w:ascii="Arial" w:hAnsi="Arial" w:cs="Arial"/>
@@ -268,7 +249,6 @@
         </w:rPr>
         <w:t>standard_user</w:t>
       </w:r>
-      <w:proofErr w:type="spellEnd"/>
     </w:p>
     <w:p>
       <w:pPr>
@@ -296,7 +276,6 @@
         </w:rPr>
         <w:t xml:space="preserve">as </w:t>
       </w:r>
-      <w:proofErr w:type="spellStart"/>
       <w:r>
         <w:rPr>
           <w:rFonts w:ascii="Arial" w:hAnsi="Arial" w:cs="Arial"/>
@@ -307,7 +286,6 @@
         </w:rPr>
         <w:t>secret_sauce</w:t>
       </w:r>
-      <w:proofErr w:type="spellEnd"/>
     </w:p>
     <w:p>
       <w:pPr>
@@ -575,6 +553,450 @@
           <w:highlight w:val="yellow"/>
         </w:rPr>
         <w:t>Use ClassName locator</w:t>
+      </w:r>
+    </w:p>
+    <w:p>
+      <w:pPr>
+        <w:rPr>
+          <w:sz w:val="28"/>
+          <w:szCs w:val="24"/>
+          <w:highlight w:val="yellow"/>
+        </w:rPr>
+      </w:pPr>
+    </w:p>
+    <w:p>
+      <w:pPr>
+        <w:rPr>
+          <w:sz w:val="28"/>
+          <w:szCs w:val="24"/>
+        </w:rPr>
+      </w:pPr>
+      <w:r>
+        <w:rPr>
+          <w:sz w:val="28"/>
+          <w:szCs w:val="24"/>
+        </w:rPr>
+        <w:t>Date: 22 Oct. 26</w:t>
+      </w:r>
+    </w:p>
+    <w:p>
+      <w:pPr>
+        <w:pStyle w:val="ListParagraph"/>
+        <w:numPr>
+          <w:ilvl w:val="0"/>
+          <w:numId w:val="1"/>
+        </w:numPr>
+        <w:rPr>
+          <w:sz w:val="28"/>
+          <w:szCs w:val="24"/>
+        </w:rPr>
+      </w:pPr>
+      <w:r>
+        <w:rPr>
+          <w:sz w:val="28"/>
+          <w:szCs w:val="24"/>
+        </w:rPr>
+        <w:t xml:space="preserve">Open </w:t>
+      </w:r>
+      <w:hyperlink r:id="rId9" w:history="1">
+        <w:r>
+          <w:rPr>
+            <w:rStyle w:val="Hyperlink"/>
+            <w:sz w:val="28"/>
+            <w:szCs w:val="24"/>
+          </w:rPr>
+          <w:t>https://practicetestautomation.com/practice-test-login/</w:t>
+        </w:r>
+      </w:hyperlink>
+    </w:p>
+    <w:p>
+      <w:pPr>
+        <w:pStyle w:val="ListParagraph"/>
+        <w:numPr>
+          <w:ilvl w:val="1"/>
+          <w:numId w:val="1"/>
+        </w:numPr>
+        <w:rPr>
+          <w:sz w:val="28"/>
+          <w:szCs w:val="24"/>
+        </w:rPr>
+      </w:pPr>
+      <w:r>
+        <w:rPr>
+          <w:sz w:val="28"/>
+          <w:szCs w:val="24"/>
+        </w:rPr>
+        <w:t xml:space="preserve">Enter user name as </w:t>
+      </w:r>
+      <w:r>
+        <w:rPr>
+          <w:sz w:val="28"/>
+          <w:szCs w:val="24"/>
+        </w:rPr>
+        <w:t>student</w:t>
+      </w:r>
+    </w:p>
+    <w:p>
+      <w:pPr>
+        <w:pStyle w:val="ListParagraph"/>
+        <w:numPr>
+          <w:ilvl w:val="1"/>
+          <w:numId w:val="1"/>
+        </w:numPr>
+        <w:rPr>
+          <w:sz w:val="28"/>
+          <w:szCs w:val="24"/>
+        </w:rPr>
+      </w:pPr>
+      <w:r>
+        <w:rPr>
+          <w:sz w:val="28"/>
+          <w:szCs w:val="24"/>
+        </w:rPr>
+        <w:t xml:space="preserve">Enter password as </w:t>
+      </w:r>
+      <w:r>
+        <w:rPr>
+          <w:sz w:val="28"/>
+          <w:szCs w:val="24"/>
+        </w:rPr>
+        <w:t>Password123</w:t>
+      </w:r>
+    </w:p>
+    <w:p>
+      <w:pPr>
+        <w:pStyle w:val="ListParagraph"/>
+        <w:numPr>
+          <w:ilvl w:val="1"/>
+          <w:numId w:val="1"/>
+        </w:numPr>
+        <w:rPr>
+          <w:sz w:val="28"/>
+          <w:szCs w:val="24"/>
+        </w:rPr>
+      </w:pPr>
+      <w:r>
+        <w:rPr>
+          <w:sz w:val="28"/>
+          <w:szCs w:val="24"/>
+        </w:rPr>
+        <w:t>Click on Login button</w:t>
+      </w:r>
+    </w:p>
+    <w:p>
+      <w:pPr>
+        <w:pStyle w:val="ListParagraph"/>
+        <w:numPr>
+          <w:ilvl w:val="1"/>
+          <w:numId w:val="1"/>
+        </w:numPr>
+        <w:rPr>
+          <w:sz w:val="28"/>
+          <w:szCs w:val="24"/>
+        </w:rPr>
+      </w:pPr>
+      <w:r>
+        <w:rPr>
+          <w:sz w:val="28"/>
+          <w:szCs w:val="24"/>
+        </w:rPr>
+        <w:lastRenderedPageBreak/>
+        <w:t>If Login is successful then click on Logout link</w:t>
+      </w:r>
+      <w:r>
+        <w:rPr>
+          <w:sz w:val="28"/>
+          <w:szCs w:val="24"/>
+        </w:rPr>
+        <w:br/>
+      </w:r>
+    </w:p>
+    <w:p>
+      <w:pPr>
+        <w:pStyle w:val="ListParagraph"/>
+        <w:numPr>
+          <w:ilvl w:val="0"/>
+          <w:numId w:val="1"/>
+        </w:numPr>
+        <w:rPr>
+          <w:sz w:val="28"/>
+          <w:szCs w:val="24"/>
+        </w:rPr>
+      </w:pPr>
+      <w:r>
+        <w:rPr>
+          <w:sz w:val="28"/>
+          <w:szCs w:val="24"/>
+        </w:rPr>
+        <w:t xml:space="preserve">Open </w:t>
+      </w:r>
+      <w:hyperlink r:id="rId10" w:history="1">
+        <w:r>
+          <w:rPr>
+            <w:rStyle w:val="Hyperlink"/>
+            <w:sz w:val="28"/>
+            <w:szCs w:val="24"/>
+          </w:rPr>
+          <w:t>https://www.saucedemo.com/</w:t>
+        </w:r>
+      </w:hyperlink>
+    </w:p>
+    <w:p>
+      <w:pPr>
+        <w:pStyle w:val="ListParagraph"/>
+        <w:numPr>
+          <w:ilvl w:val="1"/>
+          <w:numId w:val="1"/>
+        </w:numPr>
+        <w:rPr>
+          <w:sz w:val="28"/>
+          <w:szCs w:val="24"/>
+        </w:rPr>
+      </w:pPr>
+      <w:r>
+        <w:rPr>
+          <w:sz w:val="28"/>
+          <w:szCs w:val="24"/>
+        </w:rPr>
+        <w:t xml:space="preserve">Enter user name as </w:t>
+      </w:r>
+      <w:r>
+        <w:rPr>
+          <w:rFonts w:ascii="Arial" w:hAnsi="Arial" w:cs="Arial"/>
+          <w:color w:val="FFFFFF"/>
+          <w:sz w:val="21"/>
+          <w:szCs w:val="21"/>
+          <w:shd w:val="clear" w:color="auto" w:fill="132322"/>
+        </w:rPr>
+        <w:t>standard_user</w:t>
+      </w:r>
+    </w:p>
+    <w:p>
+      <w:pPr>
+        <w:pStyle w:val="ListParagraph"/>
+        <w:numPr>
+          <w:ilvl w:val="1"/>
+          <w:numId w:val="1"/>
+        </w:numPr>
+        <w:rPr>
+          <w:sz w:val="28"/>
+          <w:szCs w:val="24"/>
+        </w:rPr>
+      </w:pPr>
+      <w:r>
+        <w:rPr>
+          <w:sz w:val="28"/>
+          <w:szCs w:val="24"/>
+        </w:rPr>
+        <w:t xml:space="preserve">Enter password </w:t>
+      </w:r>
+      <w:r>
+        <w:rPr>
+          <w:sz w:val="28"/>
+          <w:szCs w:val="24"/>
+        </w:rPr>
+        <w:t xml:space="preserve">as </w:t>
+      </w:r>
+      <w:r>
+        <w:rPr>
+          <w:rFonts w:ascii="Arial" w:hAnsi="Arial" w:cs="Arial"/>
+          <w:color w:val="FFFFFF"/>
+          <w:sz w:val="21"/>
+          <w:szCs w:val="21"/>
+          <w:shd w:val="clear" w:color="auto" w:fill="132322"/>
+        </w:rPr>
+        <w:t>secret_sauce</w:t>
+      </w:r>
+    </w:p>
+    <w:p>
+      <w:pPr>
+        <w:pStyle w:val="ListParagraph"/>
+        <w:numPr>
+          <w:ilvl w:val="1"/>
+          <w:numId w:val="1"/>
+        </w:numPr>
+        <w:rPr>
+          <w:sz w:val="28"/>
+          <w:szCs w:val="24"/>
+        </w:rPr>
+      </w:pPr>
+      <w:r>
+        <w:rPr>
+          <w:sz w:val="28"/>
+          <w:szCs w:val="24"/>
+        </w:rPr>
+        <w:t>Click on Login button</w:t>
+      </w:r>
+    </w:p>
+    <w:p>
+      <w:pPr>
+        <w:pStyle w:val="ListParagraph"/>
+        <w:numPr>
+          <w:ilvl w:val="1"/>
+          <w:numId w:val="1"/>
+        </w:numPr>
+        <w:rPr>
+          <w:sz w:val="28"/>
+          <w:szCs w:val="24"/>
+        </w:rPr>
+      </w:pPr>
+      <w:r>
+        <w:rPr>
+          <w:sz w:val="28"/>
+          <w:szCs w:val="24"/>
+        </w:rPr>
+        <w:t>Check whether the login is successful or not and display the message as test case pass or fail</w:t>
+      </w:r>
+      <w:r>
+        <w:rPr>
+          <w:sz w:val="28"/>
+          <w:szCs w:val="24"/>
+        </w:rPr>
+        <w:br/>
+      </w:r>
+      <w:r>
+        <w:rPr>
+          <w:b/>
+          <w:bCs/>
+          <w:sz w:val="28"/>
+          <w:szCs w:val="24"/>
+        </w:rPr>
+        <w:t xml:space="preserve">Use </w:t>
+      </w:r>
+      <w:r>
+        <w:rPr>
+          <w:b/>
+          <w:bCs/>
+          <w:sz w:val="28"/>
+          <w:szCs w:val="24"/>
+        </w:rPr>
+        <w:t>CssSelector single attribute as well as multiple attributes</w:t>
+      </w:r>
+    </w:p>
+    <w:p>
+      <w:pPr>
+        <w:pStyle w:val="ListParagraph"/>
+        <w:numPr>
+          <w:ilvl w:val="0"/>
+          <w:numId w:val="1"/>
+        </w:numPr>
+        <w:rPr>
+          <w:sz w:val="28"/>
+          <w:szCs w:val="24"/>
+        </w:rPr>
+      </w:pPr>
+      <w:r>
+        <w:rPr>
+          <w:sz w:val="28"/>
+          <w:szCs w:val="24"/>
+        </w:rPr>
+        <w:t xml:space="preserve">Open </w:t>
+      </w:r>
+      <w:hyperlink r:id="rId11" w:history="1">
+        <w:r>
+          <w:rPr>
+            <w:rStyle w:val="Hyperlink"/>
+            <w:sz w:val="28"/>
+            <w:szCs w:val="24"/>
+          </w:rPr>
+          <w:t>https://www.echotrak.com/Login.aspx?ReturnUrl=%2f</w:t>
+        </w:r>
+      </w:hyperlink>
+    </w:p>
+    <w:p>
+      <w:pPr>
+        <w:pStyle w:val="ListParagraph"/>
+        <w:numPr>
+          <w:ilvl w:val="1"/>
+          <w:numId w:val="1"/>
+        </w:numPr>
+        <w:rPr>
+          <w:sz w:val="28"/>
+          <w:szCs w:val="24"/>
+        </w:rPr>
+      </w:pPr>
+      <w:r>
+        <w:rPr>
+          <w:sz w:val="28"/>
+          <w:szCs w:val="24"/>
+        </w:rPr>
+        <w:t>Enter admin as user name</w:t>
+      </w:r>
+    </w:p>
+    <w:p>
+      <w:pPr>
+        <w:pStyle w:val="ListParagraph"/>
+        <w:numPr>
+          <w:ilvl w:val="1"/>
+          <w:numId w:val="1"/>
+        </w:numPr>
+        <w:rPr>
+          <w:sz w:val="28"/>
+          <w:szCs w:val="24"/>
+        </w:rPr>
+      </w:pPr>
+      <w:r>
+        <w:rPr>
+          <w:sz w:val="28"/>
+          <w:szCs w:val="24"/>
+        </w:rPr>
+        <w:t>Enter admin123 as password</w:t>
+      </w:r>
+    </w:p>
+    <w:p>
+      <w:pPr>
+        <w:pStyle w:val="ListParagraph"/>
+        <w:numPr>
+          <w:ilvl w:val="1"/>
+          <w:numId w:val="1"/>
+        </w:numPr>
+        <w:rPr>
+          <w:sz w:val="28"/>
+          <w:szCs w:val="24"/>
+        </w:rPr>
+      </w:pPr>
+      <w:r>
+        <w:rPr>
+          <w:sz w:val="28"/>
+          <w:szCs w:val="24"/>
+        </w:rPr>
+        <w:t>Click on Login button</w:t>
+      </w:r>
+      <w:r>
+        <w:rPr>
+          <w:sz w:val="28"/>
+          <w:szCs w:val="24"/>
+        </w:rPr>
+        <w:br/>
+      </w:r>
+      <w:r>
+        <w:rPr>
+          <w:b/>
+          <w:bCs/>
+          <w:sz w:val="28"/>
+          <w:szCs w:val="24"/>
+        </w:rPr>
+        <w:t xml:space="preserve">Use </w:t>
+      </w:r>
+      <w:r>
+        <w:rPr>
+          <w:b/>
+          <w:bCs/>
+          <w:sz w:val="28"/>
+          <w:szCs w:val="24"/>
+        </w:rPr>
+        <w:t>CssSelector</w:t>
+      </w:r>
+      <w:bookmarkStart w:id="0" w:name="_GoBack"/>
+      <w:bookmarkEnd w:id="0"/>
+      <w:r>
+        <w:rPr>
+          <w:b/>
+          <w:bCs/>
+          <w:sz w:val="28"/>
+          <w:szCs w:val="24"/>
+        </w:rPr>
+        <w:t xml:space="preserve"> locator</w:t>
       </w:r>
     </w:p>
     <w:p>

</xml_diff>

<commit_message>
Date: 23 Oct 2026
</commit_message>
<xml_diff>
--- a/Selenium Assignments.docx
+++ b/Selenium Assignments.docx
@@ -626,41 +626,27 @@
           <w:sz w:val="28"/>
           <w:szCs w:val="24"/>
         </w:rPr>
-        <w:t xml:space="preserve">Enter user name as </w:t>
-      </w:r>
-      <w:r>
-        <w:rPr>
-          <w:sz w:val="28"/>
-          <w:szCs w:val="24"/>
-        </w:rPr>
-        <w:t>student</w:t>
-      </w:r>
-    </w:p>
-    <w:p>
-      <w:pPr>
-        <w:pStyle w:val="ListParagraph"/>
-        <w:numPr>
-          <w:ilvl w:val="1"/>
-          <w:numId w:val="1"/>
-        </w:numPr>
-        <w:rPr>
-          <w:sz w:val="28"/>
-          <w:szCs w:val="24"/>
-        </w:rPr>
-      </w:pPr>
-      <w:r>
-        <w:rPr>
-          <w:sz w:val="28"/>
-          <w:szCs w:val="24"/>
-        </w:rPr>
-        <w:t xml:space="preserve">Enter password as </w:t>
-      </w:r>
-      <w:r>
-        <w:rPr>
-          <w:sz w:val="28"/>
-          <w:szCs w:val="24"/>
-        </w:rPr>
-        <w:t>Password123</w:t>
+        <w:t>Enter user name as student</w:t>
+      </w:r>
+    </w:p>
+    <w:p>
+      <w:pPr>
+        <w:pStyle w:val="ListParagraph"/>
+        <w:numPr>
+          <w:ilvl w:val="1"/>
+          <w:numId w:val="1"/>
+        </w:numPr>
+        <w:rPr>
+          <w:sz w:val="28"/>
+          <w:szCs w:val="24"/>
+        </w:rPr>
+      </w:pPr>
+      <w:r>
+        <w:rPr>
+          <w:sz w:val="28"/>
+          <w:szCs w:val="24"/>
+        </w:rPr>
+        <w:t>Enter password as Password123</w:t>
       </w:r>
     </w:p>
     <w:p>
@@ -861,16 +847,7 @@
           <w:sz w:val="28"/>
           <w:szCs w:val="24"/>
         </w:rPr>
-        <w:t xml:space="preserve">Use </w:t>
-      </w:r>
-      <w:r>
-        <w:rPr>
-          <w:b/>
-          <w:bCs/>
-          <w:sz w:val="28"/>
-          <w:szCs w:val="24"/>
-        </w:rPr>
-        <w:t>CssSelector single attribute as well as multiple attributes</w:t>
+        <w:t>Use CssSelector single attribute as well as multiple attributes</w:t>
       </w:r>
     </w:p>
     <w:p>
@@ -987,6 +964,894 @@
         </w:rPr>
         <w:t>CssSelector</w:t>
       </w:r>
+      <w:r>
+        <w:rPr>
+          <w:b/>
+          <w:bCs/>
+          <w:sz w:val="28"/>
+          <w:szCs w:val="24"/>
+        </w:rPr>
+        <w:t xml:space="preserve"> locator</w:t>
+      </w:r>
+    </w:p>
+    <w:p>
+      <w:pPr>
+        <w:rPr>
+          <w:sz w:val="28"/>
+          <w:szCs w:val="24"/>
+        </w:rPr>
+      </w:pPr>
+      <w:r>
+        <w:rPr>
+          <w:sz w:val="28"/>
+          <w:szCs w:val="24"/>
+        </w:rPr>
+        <w:t>Date: 23 Oct. 26</w:t>
+      </w:r>
+    </w:p>
+    <w:p>
+      <w:pPr>
+        <w:rPr>
+          <w:sz w:val="28"/>
+          <w:szCs w:val="24"/>
+        </w:rPr>
+      </w:pPr>
+    </w:p>
+    <w:p>
+      <w:pPr>
+        <w:pStyle w:val="ListParagraph"/>
+        <w:numPr>
+          <w:ilvl w:val="0"/>
+          <w:numId w:val="1"/>
+        </w:numPr>
+        <w:rPr>
+          <w:sz w:val="28"/>
+          <w:szCs w:val="24"/>
+        </w:rPr>
+      </w:pPr>
+      <w:r>
+        <w:rPr>
+          <w:sz w:val="28"/>
+          <w:szCs w:val="24"/>
+        </w:rPr>
+        <w:t xml:space="preserve">Open </w:t>
+      </w:r>
+      <w:hyperlink r:id="rId12" w:history="1">
+        <w:r>
+          <w:rPr>
+            <w:rStyle w:val="Hyperlink"/>
+            <w:sz w:val="28"/>
+            <w:szCs w:val="24"/>
+          </w:rPr>
+          <w:t>https://practicetestautomation.com/practice-test-login/</w:t>
+        </w:r>
+      </w:hyperlink>
+    </w:p>
+    <w:p>
+      <w:pPr>
+        <w:pStyle w:val="ListParagraph"/>
+        <w:numPr>
+          <w:ilvl w:val="1"/>
+          <w:numId w:val="1"/>
+        </w:numPr>
+        <w:rPr>
+          <w:sz w:val="28"/>
+          <w:szCs w:val="24"/>
+        </w:rPr>
+      </w:pPr>
+      <w:r>
+        <w:rPr>
+          <w:sz w:val="28"/>
+          <w:szCs w:val="24"/>
+        </w:rPr>
+        <w:t>Enter user name as student</w:t>
+      </w:r>
+    </w:p>
+    <w:p>
+      <w:pPr>
+        <w:pStyle w:val="ListParagraph"/>
+        <w:numPr>
+          <w:ilvl w:val="1"/>
+          <w:numId w:val="1"/>
+        </w:numPr>
+        <w:rPr>
+          <w:sz w:val="28"/>
+          <w:szCs w:val="24"/>
+        </w:rPr>
+      </w:pPr>
+      <w:r>
+        <w:rPr>
+          <w:sz w:val="28"/>
+          <w:szCs w:val="24"/>
+        </w:rPr>
+        <w:t>Enter password as Password123</w:t>
+      </w:r>
+    </w:p>
+    <w:p>
+      <w:pPr>
+        <w:pStyle w:val="ListParagraph"/>
+        <w:numPr>
+          <w:ilvl w:val="1"/>
+          <w:numId w:val="1"/>
+        </w:numPr>
+        <w:rPr>
+          <w:sz w:val="28"/>
+          <w:szCs w:val="24"/>
+        </w:rPr>
+      </w:pPr>
+      <w:r>
+        <w:rPr>
+          <w:sz w:val="28"/>
+          <w:szCs w:val="24"/>
+        </w:rPr>
+        <w:t>Click on Login button</w:t>
+      </w:r>
+    </w:p>
+    <w:p>
+      <w:pPr>
+        <w:pStyle w:val="ListParagraph"/>
+        <w:numPr>
+          <w:ilvl w:val="1"/>
+          <w:numId w:val="1"/>
+        </w:numPr>
+        <w:rPr>
+          <w:sz w:val="28"/>
+          <w:szCs w:val="24"/>
+        </w:rPr>
+      </w:pPr>
+      <w:r>
+        <w:rPr>
+          <w:sz w:val="28"/>
+          <w:szCs w:val="24"/>
+        </w:rPr>
+        <w:t>If Login is successful then click on Logout link</w:t>
+      </w:r>
+      <w:r>
+        <w:rPr>
+          <w:sz w:val="28"/>
+          <w:szCs w:val="24"/>
+        </w:rPr>
+        <w:br/>
+      </w:r>
+      <w:r>
+        <w:rPr>
+          <w:b/>
+          <w:bCs/>
+          <w:sz w:val="28"/>
+          <w:szCs w:val="24"/>
+        </w:rPr>
+        <w:t>For step a, b &amp; c use absolute xpath for step d use link text / partial link text</w:t>
+      </w:r>
+    </w:p>
+    <w:p>
+      <w:pPr>
+        <w:pStyle w:val="ListParagraph"/>
+        <w:numPr>
+          <w:ilvl w:val="0"/>
+          <w:numId w:val="1"/>
+        </w:numPr>
+        <w:rPr>
+          <w:sz w:val="28"/>
+          <w:szCs w:val="24"/>
+        </w:rPr>
+      </w:pPr>
+      <w:r>
+        <w:rPr>
+          <w:sz w:val="28"/>
+          <w:szCs w:val="24"/>
+        </w:rPr>
+        <w:t xml:space="preserve">Open </w:t>
+      </w:r>
+      <w:hyperlink r:id="rId13" w:history="1">
+        <w:r>
+          <w:rPr>
+            <w:rStyle w:val="Hyperlink"/>
+            <w:sz w:val="28"/>
+            <w:szCs w:val="24"/>
+          </w:rPr>
+          <w:t>https://www.saucedemo.com/</w:t>
+        </w:r>
+      </w:hyperlink>
+    </w:p>
+    <w:p>
+      <w:pPr>
+        <w:pStyle w:val="ListParagraph"/>
+        <w:numPr>
+          <w:ilvl w:val="1"/>
+          <w:numId w:val="1"/>
+        </w:numPr>
+        <w:rPr>
+          <w:sz w:val="28"/>
+          <w:szCs w:val="24"/>
+        </w:rPr>
+      </w:pPr>
+      <w:r>
+        <w:rPr>
+          <w:sz w:val="28"/>
+          <w:szCs w:val="24"/>
+        </w:rPr>
+        <w:t xml:space="preserve">Enter user name as </w:t>
+      </w:r>
+      <w:r>
+        <w:rPr>
+          <w:rFonts w:ascii="Arial" w:hAnsi="Arial" w:cs="Arial"/>
+          <w:color w:val="FFFFFF"/>
+          <w:sz w:val="21"/>
+          <w:szCs w:val="21"/>
+          <w:shd w:val="clear" w:color="auto" w:fill="132322"/>
+        </w:rPr>
+        <w:t>standard_user</w:t>
+      </w:r>
+    </w:p>
+    <w:p>
+      <w:pPr>
+        <w:pStyle w:val="ListParagraph"/>
+        <w:numPr>
+          <w:ilvl w:val="1"/>
+          <w:numId w:val="1"/>
+        </w:numPr>
+        <w:rPr>
+          <w:sz w:val="28"/>
+          <w:szCs w:val="24"/>
+        </w:rPr>
+      </w:pPr>
+      <w:r>
+        <w:rPr>
+          <w:sz w:val="28"/>
+          <w:szCs w:val="24"/>
+        </w:rPr>
+        <w:t xml:space="preserve">Enter password </w:t>
+      </w:r>
+      <w:r>
+        <w:rPr>
+          <w:sz w:val="28"/>
+          <w:szCs w:val="24"/>
+        </w:rPr>
+        <w:t xml:space="preserve">as </w:t>
+      </w:r>
+      <w:r>
+        <w:rPr>
+          <w:rFonts w:ascii="Arial" w:hAnsi="Arial" w:cs="Arial"/>
+          <w:color w:val="FFFFFF"/>
+          <w:sz w:val="21"/>
+          <w:szCs w:val="21"/>
+          <w:shd w:val="clear" w:color="auto" w:fill="132322"/>
+        </w:rPr>
+        <w:t>secret_sauce</w:t>
+      </w:r>
+    </w:p>
+    <w:p>
+      <w:pPr>
+        <w:pStyle w:val="ListParagraph"/>
+        <w:numPr>
+          <w:ilvl w:val="1"/>
+          <w:numId w:val="1"/>
+        </w:numPr>
+        <w:rPr>
+          <w:sz w:val="28"/>
+          <w:szCs w:val="24"/>
+        </w:rPr>
+      </w:pPr>
+      <w:r>
+        <w:rPr>
+          <w:sz w:val="28"/>
+          <w:szCs w:val="24"/>
+        </w:rPr>
+        <w:t>Click on Login button</w:t>
+      </w:r>
+    </w:p>
+    <w:p>
+      <w:pPr>
+        <w:pStyle w:val="ListParagraph"/>
+        <w:numPr>
+          <w:ilvl w:val="1"/>
+          <w:numId w:val="1"/>
+        </w:numPr>
+        <w:rPr>
+          <w:sz w:val="28"/>
+          <w:szCs w:val="24"/>
+        </w:rPr>
+      </w:pPr>
+      <w:r>
+        <w:rPr>
+          <w:sz w:val="28"/>
+          <w:szCs w:val="24"/>
+        </w:rPr>
+        <w:t>Check whether the login is successful or not and display the message as test case pass or fail</w:t>
+      </w:r>
+      <w:r>
+        <w:rPr>
+          <w:sz w:val="28"/>
+          <w:szCs w:val="24"/>
+        </w:rPr>
+        <w:br/>
+      </w:r>
+      <w:r>
+        <w:rPr>
+          <w:b/>
+          <w:bCs/>
+          <w:sz w:val="28"/>
+          <w:szCs w:val="24"/>
+        </w:rPr>
+        <w:t>Use Absolute XPath</w:t>
+      </w:r>
+    </w:p>
+    <w:p>
+      <w:pPr>
+        <w:pStyle w:val="ListParagraph"/>
+        <w:numPr>
+          <w:ilvl w:val="0"/>
+          <w:numId w:val="1"/>
+        </w:numPr>
+        <w:rPr>
+          <w:sz w:val="28"/>
+          <w:szCs w:val="24"/>
+        </w:rPr>
+      </w:pPr>
+      <w:r>
+        <w:rPr>
+          <w:sz w:val="28"/>
+          <w:szCs w:val="24"/>
+        </w:rPr>
+        <w:t xml:space="preserve">Open </w:t>
+      </w:r>
+      <w:hyperlink r:id="rId14" w:history="1">
+        <w:r>
+          <w:rPr>
+            <w:rStyle w:val="Hyperlink"/>
+            <w:sz w:val="28"/>
+            <w:szCs w:val="24"/>
+          </w:rPr>
+          <w:t>https://register.rediff.com/register/register.php?FormName=user_details</w:t>
+        </w:r>
+      </w:hyperlink>
+    </w:p>
+    <w:p>
+      <w:pPr>
+        <w:pStyle w:val="ListParagraph"/>
+        <w:numPr>
+          <w:ilvl w:val="1"/>
+          <w:numId w:val="1"/>
+        </w:numPr>
+        <w:rPr>
+          <w:sz w:val="28"/>
+          <w:szCs w:val="24"/>
+        </w:rPr>
+      </w:pPr>
+      <w:r>
+        <w:rPr>
+          <w:sz w:val="28"/>
+          <w:szCs w:val="24"/>
+        </w:rPr>
+        <w:t>Enter full Name</w:t>
+      </w:r>
+    </w:p>
+    <w:p>
+      <w:pPr>
+        <w:pStyle w:val="ListParagraph"/>
+        <w:numPr>
+          <w:ilvl w:val="1"/>
+          <w:numId w:val="1"/>
+        </w:numPr>
+        <w:rPr>
+          <w:sz w:val="28"/>
+          <w:szCs w:val="24"/>
+        </w:rPr>
+      </w:pPr>
+      <w:r>
+        <w:rPr>
+          <w:sz w:val="28"/>
+          <w:szCs w:val="24"/>
+        </w:rPr>
+        <w:t>Enter rediff id</w:t>
+      </w:r>
+    </w:p>
+    <w:p>
+      <w:pPr>
+        <w:pStyle w:val="ListParagraph"/>
+        <w:numPr>
+          <w:ilvl w:val="1"/>
+          <w:numId w:val="1"/>
+        </w:numPr>
+        <w:rPr>
+          <w:sz w:val="28"/>
+          <w:szCs w:val="24"/>
+        </w:rPr>
+      </w:pPr>
+      <w:r>
+        <w:rPr>
+          <w:sz w:val="28"/>
+          <w:szCs w:val="24"/>
+        </w:rPr>
+        <w:t>Enter password</w:t>
+      </w:r>
+    </w:p>
+    <w:p>
+      <w:pPr>
+        <w:pStyle w:val="ListParagraph"/>
+        <w:numPr>
+          <w:ilvl w:val="1"/>
+          <w:numId w:val="1"/>
+        </w:numPr>
+        <w:rPr>
+          <w:sz w:val="28"/>
+          <w:szCs w:val="24"/>
+        </w:rPr>
+      </w:pPr>
+      <w:r>
+        <w:rPr>
+          <w:sz w:val="28"/>
+          <w:szCs w:val="24"/>
+        </w:rPr>
+        <w:lastRenderedPageBreak/>
+        <w:t>Enter retype password</w:t>
+      </w:r>
+      <w:r>
+        <w:rPr>
+          <w:sz w:val="28"/>
+          <w:szCs w:val="24"/>
+        </w:rPr>
+        <w:br/>
+      </w:r>
+      <w:r>
+        <w:rPr>
+          <w:b/>
+          <w:bCs/>
+          <w:sz w:val="28"/>
+          <w:szCs w:val="24"/>
+        </w:rPr>
+        <w:t>Use Absolute XPath</w:t>
+      </w:r>
+    </w:p>
+    <w:p>
+      <w:pPr>
+        <w:pStyle w:val="ListParagraph"/>
+        <w:numPr>
+          <w:ilvl w:val="0"/>
+          <w:numId w:val="1"/>
+        </w:numPr>
+        <w:rPr>
+          <w:sz w:val="28"/>
+          <w:szCs w:val="24"/>
+        </w:rPr>
+      </w:pPr>
+      <w:r>
+        <w:rPr>
+          <w:sz w:val="28"/>
+          <w:szCs w:val="24"/>
+        </w:rPr>
+        <w:t xml:space="preserve">Open </w:t>
+      </w:r>
+      <w:hyperlink r:id="rId15" w:history="1">
+        <w:r>
+          <w:rPr>
+            <w:rStyle w:val="Hyperlink"/>
+            <w:sz w:val="28"/>
+            <w:szCs w:val="24"/>
+          </w:rPr>
+          <w:t>https://practicetestautomation.com/practice-test-login/</w:t>
+        </w:r>
+      </w:hyperlink>
+    </w:p>
+    <w:p>
+      <w:pPr>
+        <w:pStyle w:val="ListParagraph"/>
+        <w:numPr>
+          <w:ilvl w:val="1"/>
+          <w:numId w:val="1"/>
+        </w:numPr>
+        <w:rPr>
+          <w:sz w:val="28"/>
+          <w:szCs w:val="24"/>
+        </w:rPr>
+      </w:pPr>
+      <w:r>
+        <w:rPr>
+          <w:sz w:val="28"/>
+          <w:szCs w:val="24"/>
+        </w:rPr>
+        <w:t>Enter user name as student</w:t>
+      </w:r>
+    </w:p>
+    <w:p>
+      <w:pPr>
+        <w:pStyle w:val="ListParagraph"/>
+        <w:numPr>
+          <w:ilvl w:val="1"/>
+          <w:numId w:val="1"/>
+        </w:numPr>
+        <w:rPr>
+          <w:sz w:val="28"/>
+          <w:szCs w:val="24"/>
+        </w:rPr>
+      </w:pPr>
+      <w:r>
+        <w:rPr>
+          <w:sz w:val="28"/>
+          <w:szCs w:val="24"/>
+        </w:rPr>
+        <w:t>Enter password as Password123</w:t>
+      </w:r>
+    </w:p>
+    <w:p>
+      <w:pPr>
+        <w:pStyle w:val="ListParagraph"/>
+        <w:numPr>
+          <w:ilvl w:val="1"/>
+          <w:numId w:val="1"/>
+        </w:numPr>
+        <w:rPr>
+          <w:sz w:val="28"/>
+          <w:szCs w:val="24"/>
+        </w:rPr>
+      </w:pPr>
+      <w:r>
+        <w:rPr>
+          <w:sz w:val="28"/>
+          <w:szCs w:val="24"/>
+        </w:rPr>
+        <w:t>Click on Login button</w:t>
+      </w:r>
+    </w:p>
+    <w:p>
+      <w:pPr>
+        <w:pStyle w:val="ListParagraph"/>
+        <w:numPr>
+          <w:ilvl w:val="1"/>
+          <w:numId w:val="1"/>
+        </w:numPr>
+        <w:rPr>
+          <w:sz w:val="28"/>
+          <w:szCs w:val="24"/>
+        </w:rPr>
+      </w:pPr>
+      <w:r>
+        <w:rPr>
+          <w:sz w:val="28"/>
+          <w:szCs w:val="24"/>
+        </w:rPr>
+        <w:t>If Login is successful then click on Logout link</w:t>
+      </w:r>
+      <w:r>
+        <w:rPr>
+          <w:sz w:val="28"/>
+          <w:szCs w:val="24"/>
+        </w:rPr>
+        <w:br/>
+      </w:r>
+      <w:r>
+        <w:rPr>
+          <w:b/>
+          <w:bCs/>
+          <w:sz w:val="28"/>
+          <w:szCs w:val="24"/>
+        </w:rPr>
+        <w:t xml:space="preserve">For step a, b &amp; c use </w:t>
+      </w:r>
+      <w:r>
+        <w:rPr>
+          <w:b/>
+          <w:bCs/>
+          <w:sz w:val="28"/>
+          <w:szCs w:val="24"/>
+        </w:rPr>
+        <w:t>Relative</w:t>
+      </w:r>
+      <w:r>
+        <w:rPr>
+          <w:b/>
+          <w:bCs/>
+          <w:sz w:val="28"/>
+          <w:szCs w:val="24"/>
+        </w:rPr>
+        <w:t xml:space="preserve"> xpath for step d use link text / partial link text</w:t>
+      </w:r>
+    </w:p>
+    <w:p>
+      <w:pPr>
+        <w:pStyle w:val="ListParagraph"/>
+        <w:numPr>
+          <w:ilvl w:val="0"/>
+          <w:numId w:val="1"/>
+        </w:numPr>
+        <w:rPr>
+          <w:sz w:val="28"/>
+          <w:szCs w:val="24"/>
+        </w:rPr>
+      </w:pPr>
+      <w:r>
+        <w:rPr>
+          <w:sz w:val="28"/>
+          <w:szCs w:val="24"/>
+        </w:rPr>
+        <w:t xml:space="preserve">Open </w:t>
+      </w:r>
+      <w:hyperlink r:id="rId16" w:history="1">
+        <w:r>
+          <w:rPr>
+            <w:rStyle w:val="Hyperlink"/>
+            <w:sz w:val="28"/>
+            <w:szCs w:val="24"/>
+          </w:rPr>
+          <w:t>https://www.saucedemo.com/</w:t>
+        </w:r>
+      </w:hyperlink>
+    </w:p>
+    <w:p>
+      <w:pPr>
+        <w:pStyle w:val="ListParagraph"/>
+        <w:numPr>
+          <w:ilvl w:val="1"/>
+          <w:numId w:val="1"/>
+        </w:numPr>
+        <w:rPr>
+          <w:sz w:val="28"/>
+          <w:szCs w:val="24"/>
+        </w:rPr>
+      </w:pPr>
+      <w:r>
+        <w:rPr>
+          <w:sz w:val="28"/>
+          <w:szCs w:val="24"/>
+        </w:rPr>
+        <w:t xml:space="preserve">Enter user name as </w:t>
+      </w:r>
+      <w:r>
+        <w:rPr>
+          <w:rFonts w:ascii="Arial" w:hAnsi="Arial" w:cs="Arial"/>
+          <w:color w:val="FFFFFF"/>
+          <w:sz w:val="21"/>
+          <w:szCs w:val="21"/>
+          <w:shd w:val="clear" w:color="auto" w:fill="132322"/>
+        </w:rPr>
+        <w:t>standard_user</w:t>
+      </w:r>
+    </w:p>
+    <w:p>
+      <w:pPr>
+        <w:pStyle w:val="ListParagraph"/>
+        <w:numPr>
+          <w:ilvl w:val="1"/>
+          <w:numId w:val="1"/>
+        </w:numPr>
+        <w:rPr>
+          <w:sz w:val="28"/>
+          <w:szCs w:val="24"/>
+        </w:rPr>
+      </w:pPr>
+      <w:r>
+        <w:rPr>
+          <w:sz w:val="28"/>
+          <w:szCs w:val="24"/>
+        </w:rPr>
+        <w:t xml:space="preserve">Enter password </w:t>
+      </w:r>
+      <w:r>
+        <w:rPr>
+          <w:sz w:val="28"/>
+          <w:szCs w:val="24"/>
+        </w:rPr>
+        <w:t xml:space="preserve">as </w:t>
+      </w:r>
+      <w:r>
+        <w:rPr>
+          <w:rFonts w:ascii="Arial" w:hAnsi="Arial" w:cs="Arial"/>
+          <w:color w:val="FFFFFF"/>
+          <w:sz w:val="21"/>
+          <w:szCs w:val="21"/>
+          <w:shd w:val="clear" w:color="auto" w:fill="132322"/>
+        </w:rPr>
+        <w:t>secret_sauce</w:t>
+      </w:r>
+    </w:p>
+    <w:p>
+      <w:pPr>
+        <w:pStyle w:val="ListParagraph"/>
+        <w:numPr>
+          <w:ilvl w:val="1"/>
+          <w:numId w:val="1"/>
+        </w:numPr>
+        <w:rPr>
+          <w:sz w:val="28"/>
+          <w:szCs w:val="24"/>
+        </w:rPr>
+      </w:pPr>
+      <w:r>
+        <w:rPr>
+          <w:sz w:val="28"/>
+          <w:szCs w:val="24"/>
+        </w:rPr>
+        <w:t>Click on Login button</w:t>
+      </w:r>
+    </w:p>
+    <w:p>
+      <w:pPr>
+        <w:pStyle w:val="ListParagraph"/>
+        <w:numPr>
+          <w:ilvl w:val="1"/>
+          <w:numId w:val="1"/>
+        </w:numPr>
+        <w:rPr>
+          <w:sz w:val="28"/>
+          <w:szCs w:val="24"/>
+        </w:rPr>
+      </w:pPr>
+      <w:r>
+        <w:rPr>
+          <w:sz w:val="28"/>
+          <w:szCs w:val="24"/>
+        </w:rPr>
+        <w:t>Check whether the login is successful or not and display the message as test case pass or fail</w:t>
+      </w:r>
+      <w:r>
+        <w:rPr>
+          <w:sz w:val="28"/>
+          <w:szCs w:val="24"/>
+        </w:rPr>
+        <w:br/>
+      </w:r>
+      <w:r>
+        <w:rPr>
+          <w:b/>
+          <w:bCs/>
+          <w:sz w:val="28"/>
+          <w:szCs w:val="24"/>
+        </w:rPr>
+        <w:t xml:space="preserve">Use </w:t>
+      </w:r>
+      <w:r>
+        <w:rPr>
+          <w:b/>
+          <w:bCs/>
+          <w:sz w:val="28"/>
+          <w:szCs w:val="24"/>
+        </w:rPr>
+        <w:t>Relative</w:t>
+      </w:r>
+      <w:r>
+        <w:rPr>
+          <w:b/>
+          <w:bCs/>
+          <w:sz w:val="28"/>
+          <w:szCs w:val="24"/>
+        </w:rPr>
+        <w:t xml:space="preserve"> XPath</w:t>
+      </w:r>
+    </w:p>
+    <w:p>
+      <w:pPr>
+        <w:pStyle w:val="ListParagraph"/>
+        <w:numPr>
+          <w:ilvl w:val="0"/>
+          <w:numId w:val="1"/>
+        </w:numPr>
+        <w:rPr>
+          <w:sz w:val="28"/>
+          <w:szCs w:val="24"/>
+        </w:rPr>
+      </w:pPr>
+      <w:r>
+        <w:rPr>
+          <w:sz w:val="28"/>
+          <w:szCs w:val="24"/>
+        </w:rPr>
+        <w:t xml:space="preserve">Open </w:t>
+      </w:r>
+      <w:hyperlink r:id="rId17" w:history="1">
+        <w:r>
+          <w:rPr>
+            <w:rStyle w:val="Hyperlink"/>
+            <w:sz w:val="28"/>
+            <w:szCs w:val="24"/>
+          </w:rPr>
+          <w:t>https://register.rediff.com/register/register.php?FormName=user_details</w:t>
+        </w:r>
+      </w:hyperlink>
+    </w:p>
+    <w:p>
+      <w:pPr>
+        <w:pStyle w:val="ListParagraph"/>
+        <w:numPr>
+          <w:ilvl w:val="1"/>
+          <w:numId w:val="1"/>
+        </w:numPr>
+        <w:rPr>
+          <w:sz w:val="28"/>
+          <w:szCs w:val="24"/>
+        </w:rPr>
+      </w:pPr>
+      <w:r>
+        <w:rPr>
+          <w:sz w:val="28"/>
+          <w:szCs w:val="24"/>
+        </w:rPr>
+        <w:t>Enter full Name</w:t>
+      </w:r>
+    </w:p>
+    <w:p>
+      <w:pPr>
+        <w:pStyle w:val="ListParagraph"/>
+        <w:numPr>
+          <w:ilvl w:val="1"/>
+          <w:numId w:val="1"/>
+        </w:numPr>
+        <w:rPr>
+          <w:sz w:val="28"/>
+          <w:szCs w:val="24"/>
+        </w:rPr>
+      </w:pPr>
+      <w:r>
+        <w:rPr>
+          <w:sz w:val="28"/>
+          <w:szCs w:val="24"/>
+        </w:rPr>
+        <w:t>Enter rediff id</w:t>
+      </w:r>
+    </w:p>
+    <w:p>
+      <w:pPr>
+        <w:pStyle w:val="ListParagraph"/>
+        <w:numPr>
+          <w:ilvl w:val="1"/>
+          <w:numId w:val="1"/>
+        </w:numPr>
+        <w:rPr>
+          <w:sz w:val="28"/>
+          <w:szCs w:val="24"/>
+        </w:rPr>
+      </w:pPr>
+      <w:r>
+        <w:rPr>
+          <w:sz w:val="28"/>
+          <w:szCs w:val="24"/>
+        </w:rPr>
+        <w:t>Enter password</w:t>
+      </w:r>
+    </w:p>
+    <w:p>
+      <w:pPr>
+        <w:pStyle w:val="ListParagraph"/>
+        <w:numPr>
+          <w:ilvl w:val="1"/>
+          <w:numId w:val="1"/>
+        </w:numPr>
+        <w:rPr>
+          <w:sz w:val="28"/>
+          <w:szCs w:val="24"/>
+        </w:rPr>
+      </w:pPr>
+      <w:r>
+        <w:rPr>
+          <w:sz w:val="28"/>
+          <w:szCs w:val="24"/>
+        </w:rPr>
+        <w:t>Enter retype password</w:t>
+      </w:r>
+      <w:r>
+        <w:rPr>
+          <w:sz w:val="28"/>
+          <w:szCs w:val="24"/>
+        </w:rPr>
+        <w:br/>
+      </w:r>
+      <w:r>
+        <w:rPr>
+          <w:b/>
+          <w:bCs/>
+          <w:sz w:val="28"/>
+          <w:szCs w:val="24"/>
+        </w:rPr>
+        <w:t xml:space="preserve">Use </w:t>
+      </w:r>
+      <w:r>
+        <w:rPr>
+          <w:b/>
+          <w:bCs/>
+          <w:sz w:val="28"/>
+          <w:szCs w:val="24"/>
+        </w:rPr>
+        <w:t>Relate</w:t>
+      </w:r>
       <w:bookmarkStart w:id="0" w:name="_GoBack"/>
       <w:bookmarkEnd w:id="0"/>
       <w:r>
@@ -996,7 +1861,7 @@
           <w:sz w:val="28"/>
           <w:szCs w:val="24"/>
         </w:rPr>
-        <w:t xml:space="preserve"> locator</w:t>
+        <w:t xml:space="preserve"> XPath</w:t>
       </w:r>
     </w:p>
     <w:p>

</xml_diff>

<commit_message>
Date: 27 Oct 2026
</commit_message>
<xml_diff>
--- a/Selenium Assignments.docx
+++ b/Selenium Assignments.docx
@@ -53,7 +53,23 @@
           <w:sz w:val="28"/>
           <w:szCs w:val="24"/>
         </w:rPr>
-        <w:t>Open any website and call getPageSource() method (like getTitle) and tell me what is the return type of this method and what is the purpose of this method.</w:t>
+        <w:t xml:space="preserve">Open any website and call </w:t>
+      </w:r>
+      <w:proofErr w:type="gramStart"/>
+      <w:r>
+        <w:rPr>
+          <w:sz w:val="28"/>
+          <w:szCs w:val="24"/>
+        </w:rPr>
+        <w:t>getPageSource(</w:t>
+      </w:r>
+      <w:proofErr w:type="gramEnd"/>
+      <w:r>
+        <w:rPr>
+          <w:sz w:val="28"/>
+          <w:szCs w:val="24"/>
+        </w:rPr>
+        <w:t>) method (like getTitle) and tell me what is the return type of this method and what is the purpose of this method.</w:t>
       </w:r>
     </w:p>
     <w:p>
@@ -239,6 +255,7 @@
         </w:rPr>
         <w:t xml:space="preserve">Enter user name as </w:t>
       </w:r>
+      <w:proofErr w:type="spellStart"/>
       <w:r>
         <w:rPr>
           <w:rFonts w:ascii="Arial" w:hAnsi="Arial" w:cs="Arial"/>
@@ -249,6 +266,7 @@
         </w:rPr>
         <w:t>standard_user</w:t>
       </w:r>
+      <w:proofErr w:type="spellEnd"/>
     </w:p>
     <w:p>
       <w:pPr>
@@ -276,6 +294,7 @@
         </w:rPr>
         <w:t xml:space="preserve">as </w:t>
       </w:r>
+      <w:proofErr w:type="spellStart"/>
       <w:r>
         <w:rPr>
           <w:rFonts w:ascii="Arial" w:hAnsi="Arial" w:cs="Arial"/>
@@ -286,6 +305,7 @@
         </w:rPr>
         <w:t>secret_sauce</w:t>
       </w:r>
+      <w:proofErr w:type="spellEnd"/>
     </w:p>
     <w:p>
       <w:pPr>
@@ -746,6 +766,7 @@
         </w:rPr>
         <w:t xml:space="preserve">Enter user name as </w:t>
       </w:r>
+      <w:proofErr w:type="spellStart"/>
       <w:r>
         <w:rPr>
           <w:rFonts w:ascii="Arial" w:hAnsi="Arial" w:cs="Arial"/>
@@ -756,6 +777,7 @@
         </w:rPr>
         <w:t>standard_user</w:t>
       </w:r>
+      <w:proofErr w:type="spellEnd"/>
     </w:p>
     <w:p>
       <w:pPr>
@@ -783,6 +805,7 @@
         </w:rPr>
         <w:t xml:space="preserve">as </w:t>
       </w:r>
+      <w:proofErr w:type="spellStart"/>
       <w:r>
         <w:rPr>
           <w:rFonts w:ascii="Arial" w:hAnsi="Arial" w:cs="Arial"/>
@@ -793,6 +816,7 @@
         </w:rPr>
         <w:t>secret_sauce</w:t>
       </w:r>
+      <w:proofErr w:type="spellEnd"/>
     </w:p>
     <w:p>
       <w:pPr>
@@ -1172,6 +1196,7 @@
         </w:rPr>
         <w:t xml:space="preserve">Enter user name as </w:t>
       </w:r>
+      <w:proofErr w:type="spellStart"/>
       <w:r>
         <w:rPr>
           <w:rFonts w:ascii="Arial" w:hAnsi="Arial" w:cs="Arial"/>
@@ -1182,6 +1207,7 @@
         </w:rPr>
         <w:t>standard_user</w:t>
       </w:r>
+      <w:proofErr w:type="spellEnd"/>
     </w:p>
     <w:p>
       <w:pPr>
@@ -1209,6 +1235,7 @@
         </w:rPr>
         <w:t xml:space="preserve">as </w:t>
       </w:r>
+      <w:proofErr w:type="spellStart"/>
       <w:r>
         <w:rPr>
           <w:rFonts w:ascii="Arial" w:hAnsi="Arial" w:cs="Arial"/>
@@ -1219,6 +1246,7 @@
         </w:rPr>
         <w:t>secret_sauce</w:t>
       </w:r>
+      <w:proofErr w:type="spellEnd"/>
     </w:p>
     <w:p>
       <w:pPr>
@@ -1343,7 +1371,23 @@
           <w:sz w:val="28"/>
           <w:szCs w:val="24"/>
         </w:rPr>
-        <w:t>Enter rediff id</w:t>
+        <w:t xml:space="preserve">Enter </w:t>
+      </w:r>
+      <w:proofErr w:type="spellStart"/>
+      <w:r>
+        <w:rPr>
+          <w:sz w:val="28"/>
+          <w:szCs w:val="24"/>
+        </w:rPr>
+        <w:t>rediff</w:t>
+      </w:r>
+      <w:proofErr w:type="spellEnd"/>
+      <w:r>
+        <w:rPr>
+          <w:sz w:val="28"/>
+          <w:szCs w:val="24"/>
+        </w:rPr>
+        <w:t xml:space="preserve"> id</w:t>
       </w:r>
     </w:p>
     <w:p>
@@ -1526,25 +1570,7 @@
           <w:sz w:val="28"/>
           <w:szCs w:val="24"/>
         </w:rPr>
-        <w:t xml:space="preserve">For step a, b &amp; c use </w:t>
-      </w:r>
-      <w:r>
-        <w:rPr>
-          <w:b/>
-          <w:bCs/>
-          <w:sz w:val="28"/>
-          <w:szCs w:val="24"/>
-        </w:rPr>
-        <w:t>Relative</w:t>
-      </w:r>
-      <w:r>
-        <w:rPr>
-          <w:b/>
-          <w:bCs/>
-          <w:sz w:val="28"/>
-          <w:szCs w:val="24"/>
-        </w:rPr>
-        <w:t xml:space="preserve"> xpath for step d use link text / partial link text</w:t>
+        <w:t>For step a, b &amp; c use Relative xpath for step d use link text / partial link text</w:t>
       </w:r>
     </w:p>
     <w:p>
@@ -1596,6 +1622,7 @@
         </w:rPr>
         <w:t xml:space="preserve">Enter user name as </w:t>
       </w:r>
+      <w:proofErr w:type="spellStart"/>
       <w:r>
         <w:rPr>
           <w:rFonts w:ascii="Arial" w:hAnsi="Arial" w:cs="Arial"/>
@@ -1606,6 +1633,7 @@
         </w:rPr>
         <w:t>standard_user</w:t>
       </w:r>
+      <w:proofErr w:type="spellEnd"/>
     </w:p>
     <w:p>
       <w:pPr>
@@ -1633,6 +1661,7 @@
         </w:rPr>
         <w:t xml:space="preserve">as </w:t>
       </w:r>
+      <w:proofErr w:type="spellStart"/>
       <w:r>
         <w:rPr>
           <w:rFonts w:ascii="Arial" w:hAnsi="Arial" w:cs="Arial"/>
@@ -1643,6 +1672,7 @@
         </w:rPr>
         <w:t>secret_sauce</w:t>
       </w:r>
+      <w:proofErr w:type="spellEnd"/>
     </w:p>
     <w:p>
       <w:pPr>
@@ -1697,25 +1727,7 @@
           <w:sz w:val="28"/>
           <w:szCs w:val="24"/>
         </w:rPr>
-        <w:t xml:space="preserve">Use </w:t>
-      </w:r>
-      <w:r>
-        <w:rPr>
-          <w:b/>
-          <w:bCs/>
-          <w:sz w:val="28"/>
-          <w:szCs w:val="24"/>
-        </w:rPr>
-        <w:t>Relative</w:t>
-      </w:r>
-      <w:r>
-        <w:rPr>
-          <w:b/>
-          <w:bCs/>
-          <w:sz w:val="28"/>
-          <w:szCs w:val="24"/>
-        </w:rPr>
-        <w:t xml:space="preserve"> XPath</w:t>
+        <w:t>Use Relative XPath</w:t>
       </w:r>
     </w:p>
     <w:p>
@@ -1785,7 +1797,23 @@
           <w:sz w:val="28"/>
           <w:szCs w:val="24"/>
         </w:rPr>
-        <w:t>Enter rediff id</w:t>
+        <w:t xml:space="preserve">Enter </w:t>
+      </w:r>
+      <w:proofErr w:type="spellStart"/>
+      <w:r>
+        <w:rPr>
+          <w:sz w:val="28"/>
+          <w:szCs w:val="24"/>
+        </w:rPr>
+        <w:t>rediff</w:t>
+      </w:r>
+      <w:proofErr w:type="spellEnd"/>
+      <w:r>
+        <w:rPr>
+          <w:sz w:val="28"/>
+          <w:szCs w:val="24"/>
+        </w:rPr>
+        <w:t xml:space="preserve"> id</w:t>
       </w:r>
     </w:p>
     <w:p>
@@ -1841,7 +1869,7 @@
           <w:sz w:val="28"/>
           <w:szCs w:val="24"/>
         </w:rPr>
-        <w:t xml:space="preserve">Use </w:t>
+        <w:t>Use Relate XPath</w:t>
       </w:r>
       <w:r>
         <w:rPr>
@@ -1850,32 +1878,275 @@
           <w:sz w:val="28"/>
           <w:szCs w:val="24"/>
         </w:rPr>
-        <w:t>Relate</w:t>
+        <w:t xml:space="preserve"> </w:t>
+      </w:r>
+    </w:p>
+    <w:p>
+      <w:pPr>
+        <w:rPr>
+          <w:sz w:val="28"/>
+          <w:szCs w:val="24"/>
+        </w:rPr>
+      </w:pPr>
+    </w:p>
+    <w:p>
+      <w:pPr>
+        <w:rPr>
+          <w:sz w:val="28"/>
+          <w:szCs w:val="24"/>
+        </w:rPr>
+      </w:pPr>
+      <w:r>
+        <w:rPr>
+          <w:sz w:val="28"/>
+          <w:szCs w:val="24"/>
+        </w:rPr>
+        <w:t>Date: 27 Oct. 26</w:t>
+      </w:r>
+    </w:p>
+    <w:p>
+      <w:pPr>
+        <w:rPr>
+          <w:sz w:val="28"/>
+          <w:szCs w:val="24"/>
+        </w:rPr>
+      </w:pPr>
+    </w:p>
+    <w:p>
+      <w:pPr>
+        <w:pStyle w:val="ListParagraph"/>
+        <w:numPr>
+          <w:ilvl w:val="0"/>
+          <w:numId w:val="1"/>
+        </w:numPr>
+        <w:rPr>
+          <w:sz w:val="28"/>
+          <w:szCs w:val="24"/>
+        </w:rPr>
+      </w:pPr>
+      <w:r>
+        <w:rPr>
+          <w:sz w:val="28"/>
+          <w:szCs w:val="24"/>
+        </w:rPr>
+        <w:t xml:space="preserve">Open </w:t>
+      </w:r>
+      <w:hyperlink r:id="rId18" w:history="1">
+        <w:r>
+          <w:rPr>
+            <w:rStyle w:val="Hyperlink"/>
+            <w:sz w:val="28"/>
+            <w:szCs w:val="24"/>
+          </w:rPr>
+          <w:t>https://echoecho.com/htmlforms09.htm</w:t>
+        </w:r>
+      </w:hyperlink>
+    </w:p>
+    <w:p>
+      <w:pPr>
+        <w:pStyle w:val="ListParagraph"/>
+        <w:numPr>
+          <w:ilvl w:val="1"/>
+          <w:numId w:val="1"/>
+        </w:numPr>
+        <w:rPr>
+          <w:sz w:val="28"/>
+          <w:szCs w:val="24"/>
+        </w:rPr>
+      </w:pPr>
+      <w:r>
+        <w:rPr>
+          <w:sz w:val="28"/>
+          <w:szCs w:val="24"/>
+        </w:rPr>
+        <w:t>Display the status of all 3 check boxes (Visible, Enable, Selected)</w:t>
+      </w:r>
+    </w:p>
+    <w:p>
+      <w:pPr>
+        <w:pStyle w:val="ListParagraph"/>
+        <w:numPr>
+          <w:ilvl w:val="1"/>
+          <w:numId w:val="1"/>
+        </w:numPr>
+        <w:rPr>
+          <w:sz w:val="28"/>
+          <w:szCs w:val="24"/>
+        </w:rPr>
+      </w:pPr>
+      <w:r>
+        <w:rPr>
+          <w:sz w:val="28"/>
+          <w:szCs w:val="24"/>
+        </w:rPr>
+        <w:t>Select only unselected checkboxes</w:t>
+      </w:r>
+    </w:p>
+    <w:p>
+      <w:pPr>
+        <w:pStyle w:val="ListParagraph"/>
+        <w:numPr>
+          <w:ilvl w:val="1"/>
+          <w:numId w:val="1"/>
+        </w:numPr>
+        <w:rPr>
+          <w:sz w:val="28"/>
+          <w:szCs w:val="24"/>
+        </w:rPr>
+      </w:pPr>
+      <w:r>
+        <w:rPr>
+          <w:sz w:val="28"/>
+          <w:szCs w:val="24"/>
+        </w:rPr>
+        <w:t xml:space="preserve">Display the status </w:t>
+      </w:r>
+    </w:p>
+    <w:p>
+      <w:pPr>
+        <w:pStyle w:val="ListParagraph"/>
+        <w:numPr>
+          <w:ilvl w:val="0"/>
+          <w:numId w:val="1"/>
+        </w:numPr>
+        <w:rPr>
+          <w:sz w:val="28"/>
+          <w:szCs w:val="24"/>
+          <w:highlight w:val="yellow"/>
+        </w:rPr>
+      </w:pPr>
+      <w:r>
+        <w:rPr>
+          <w:sz w:val="28"/>
+          <w:szCs w:val="24"/>
+          <w:highlight w:val="yellow"/>
+        </w:rPr>
+        <w:t xml:space="preserve">Open </w:t>
+      </w:r>
+      <w:hyperlink r:id="rId19" w:history="1">
+        <w:r>
+          <w:rPr>
+            <w:rStyle w:val="Hyperlink"/>
+            <w:sz w:val="28"/>
+            <w:szCs w:val="24"/>
+            <w:highlight w:val="yellow"/>
+          </w:rPr>
+          <w:t>https://opensource-demo.orangehrmlive.com/web/index.php/auth/login</w:t>
+        </w:r>
+      </w:hyperlink>
+    </w:p>
+    <w:p>
+      <w:pPr>
+        <w:pStyle w:val="ListParagraph"/>
+        <w:numPr>
+          <w:ilvl w:val="1"/>
+          <w:numId w:val="1"/>
+        </w:numPr>
+        <w:rPr>
+          <w:sz w:val="28"/>
+          <w:szCs w:val="24"/>
+          <w:highlight w:val="yellow"/>
+        </w:rPr>
+      </w:pPr>
+      <w:r>
+        <w:rPr>
+          <w:sz w:val="28"/>
+          <w:szCs w:val="24"/>
+          <w:highlight w:val="yellow"/>
+        </w:rPr>
+        <w:t>Enter user name as admin</w:t>
+      </w:r>
+    </w:p>
+    <w:p>
+      <w:pPr>
+        <w:pStyle w:val="ListParagraph"/>
+        <w:numPr>
+          <w:ilvl w:val="1"/>
+          <w:numId w:val="1"/>
+        </w:numPr>
+        <w:rPr>
+          <w:sz w:val="28"/>
+          <w:szCs w:val="24"/>
+          <w:highlight w:val="yellow"/>
+        </w:rPr>
+      </w:pPr>
+      <w:r>
+        <w:rPr>
+          <w:sz w:val="28"/>
+          <w:szCs w:val="24"/>
+          <w:highlight w:val="yellow"/>
+        </w:rPr>
+        <w:t>Enter password as admin123</w:t>
+      </w:r>
+    </w:p>
+    <w:p>
+      <w:pPr>
+        <w:pStyle w:val="ListParagraph"/>
+        <w:numPr>
+          <w:ilvl w:val="1"/>
+          <w:numId w:val="1"/>
+        </w:numPr>
+        <w:rPr>
+          <w:sz w:val="28"/>
+          <w:szCs w:val="24"/>
+          <w:highlight w:val="yellow"/>
+        </w:rPr>
+      </w:pPr>
+      <w:r>
+        <w:rPr>
+          <w:sz w:val="28"/>
+          <w:szCs w:val="24"/>
+          <w:highlight w:val="yellow"/>
+        </w:rPr>
+        <w:t>Click on Login button</w:t>
+      </w:r>
+    </w:p>
+    <w:p>
+      <w:pPr>
+        <w:pStyle w:val="ListParagraph"/>
+        <w:numPr>
+          <w:ilvl w:val="1"/>
+          <w:numId w:val="1"/>
+        </w:numPr>
+        <w:rPr>
+          <w:sz w:val="28"/>
+          <w:szCs w:val="24"/>
+          <w:highlight w:val="yellow"/>
+        </w:rPr>
+      </w:pPr>
+      <w:r>
+        <w:rPr>
+          <w:sz w:val="28"/>
+          <w:szCs w:val="24"/>
+          <w:highlight w:val="yellow"/>
+        </w:rPr>
+        <w:lastRenderedPageBreak/>
+        <w:t>(For Logout) Click on Arrow after user name</w:t>
+      </w:r>
+    </w:p>
+    <w:p>
+      <w:pPr>
+        <w:pStyle w:val="ListParagraph"/>
+        <w:numPr>
+          <w:ilvl w:val="1"/>
+          <w:numId w:val="1"/>
+        </w:numPr>
+        <w:rPr>
+          <w:sz w:val="28"/>
+          <w:szCs w:val="24"/>
+          <w:highlight w:val="yellow"/>
+        </w:rPr>
+      </w:pPr>
+      <w:r>
+        <w:rPr>
+          <w:sz w:val="28"/>
+          <w:szCs w:val="24"/>
+          <w:highlight w:val="yellow"/>
+        </w:rPr>
+        <w:t>Click on Logout link</w:t>
       </w:r>
       <w:bookmarkStart w:id="0" w:name="_GoBack"/>
       <w:bookmarkEnd w:id="0"/>
-      <w:r>
-        <w:rPr>
-          <w:b/>
-          <w:bCs/>
-          <w:sz w:val="28"/>
-          <w:szCs w:val="24"/>
-        </w:rPr>
-        <w:t xml:space="preserve"> XPath</w:t>
-      </w:r>
-    </w:p>
-    <w:p>
-      <w:pPr>
-        <w:pStyle w:val="ListParagraph"/>
-        <w:numPr>
-          <w:ilvl w:val="0"/>
-          <w:numId w:val="1"/>
-        </w:numPr>
-        <w:rPr>
-          <w:sz w:val="28"/>
-          <w:szCs w:val="24"/>
-        </w:rPr>
-      </w:pPr>
     </w:p>
     <w:sectPr>
       <w:pgSz w:w="11906" w:h="16838"/>

</xml_diff>

<commit_message>
Date: 28 Oct 2026
</commit_message>
<xml_diff>
--- a/Selenium Assignments.docx
+++ b/Selenium Assignments.docx
@@ -2145,6 +2145,263 @@
         </w:rPr>
         <w:t>Click on Logout link</w:t>
       </w:r>
+    </w:p>
+    <w:p>
+      <w:pPr>
+        <w:rPr>
+          <w:sz w:val="28"/>
+          <w:szCs w:val="24"/>
+          <w:highlight w:val="yellow"/>
+        </w:rPr>
+      </w:pPr>
+    </w:p>
+    <w:p>
+      <w:pPr>
+        <w:rPr>
+          <w:sz w:val="28"/>
+          <w:szCs w:val="24"/>
+        </w:rPr>
+      </w:pPr>
+      <w:r>
+        <w:rPr>
+          <w:sz w:val="28"/>
+          <w:szCs w:val="24"/>
+        </w:rPr>
+        <w:t>Date: 28 Oct. 26</w:t>
+      </w:r>
+    </w:p>
+    <w:p>
+      <w:pPr>
+        <w:rPr>
+          <w:sz w:val="28"/>
+          <w:szCs w:val="24"/>
+          <w:highlight w:val="yellow"/>
+        </w:rPr>
+      </w:pPr>
+    </w:p>
+    <w:p>
+      <w:pPr>
+        <w:pStyle w:val="ListParagraph"/>
+        <w:numPr>
+          <w:ilvl w:val="0"/>
+          <w:numId w:val="1"/>
+        </w:numPr>
+        <w:rPr>
+          <w:sz w:val="28"/>
+          <w:szCs w:val="24"/>
+        </w:rPr>
+      </w:pPr>
+      <w:r>
+        <w:rPr>
+          <w:sz w:val="28"/>
+          <w:szCs w:val="24"/>
+        </w:rPr>
+        <w:t xml:space="preserve">Open </w:t>
+      </w:r>
+      <w:hyperlink r:id="rId20" w:history="1">
+        <w:r>
+          <w:rPr>
+            <w:rStyle w:val="Hyperlink"/>
+            <w:sz w:val="28"/>
+            <w:szCs w:val="24"/>
+          </w:rPr>
+          <w:t>https://register.rediff.com/register/register.php?FormName=user_details</w:t>
+        </w:r>
+      </w:hyperlink>
+    </w:p>
+    <w:p>
+      <w:pPr>
+        <w:pStyle w:val="ListParagraph"/>
+        <w:numPr>
+          <w:ilvl w:val="1"/>
+          <w:numId w:val="1"/>
+        </w:numPr>
+        <w:rPr>
+          <w:sz w:val="28"/>
+          <w:szCs w:val="24"/>
+        </w:rPr>
+      </w:pPr>
+      <w:r>
+        <w:rPr>
+          <w:sz w:val="28"/>
+          <w:szCs w:val="24"/>
+        </w:rPr>
+        <w:t>Select your birthdate</w:t>
+      </w:r>
+    </w:p>
+    <w:p>
+      <w:pPr>
+        <w:pStyle w:val="ListParagraph"/>
+        <w:numPr>
+          <w:ilvl w:val="1"/>
+          <w:numId w:val="1"/>
+        </w:numPr>
+        <w:rPr>
+          <w:sz w:val="28"/>
+          <w:szCs w:val="24"/>
+        </w:rPr>
+      </w:pPr>
+      <w:r>
+        <w:rPr>
+          <w:sz w:val="28"/>
+          <w:szCs w:val="24"/>
+        </w:rPr>
+        <w:t xml:space="preserve">Display you birthdate in following format </w:t>
+      </w:r>
+      <w:r>
+        <w:rPr>
+          <w:b/>
+          <w:bCs/>
+          <w:sz w:val="28"/>
+          <w:szCs w:val="24"/>
+        </w:rPr>
+        <w:t>only</w:t>
+      </w:r>
+      <w:r>
+        <w:rPr>
+          <w:sz w:val="28"/>
+          <w:szCs w:val="24"/>
+        </w:rPr>
+        <w:br/>
+        <w:t>My birthdate is 29 JAN 1979</w:t>
+      </w:r>
+    </w:p>
+    <w:p>
+      <w:pPr>
+        <w:pStyle w:val="ListParagraph"/>
+        <w:numPr>
+          <w:ilvl w:val="0"/>
+          <w:numId w:val="1"/>
+        </w:numPr>
+        <w:rPr>
+          <w:sz w:val="28"/>
+          <w:szCs w:val="24"/>
+        </w:rPr>
+      </w:pPr>
+      <w:r>
+        <w:rPr>
+          <w:sz w:val="28"/>
+          <w:szCs w:val="24"/>
+        </w:rPr>
+        <w:t>What is difference between findElement() &amp; findElements()</w:t>
+      </w:r>
+    </w:p>
+    <w:p>
+      <w:pPr>
+        <w:pStyle w:val="ListParagraph"/>
+        <w:numPr>
+          <w:ilvl w:val="0"/>
+          <w:numId w:val="1"/>
+        </w:numPr>
+        <w:rPr>
+          <w:sz w:val="28"/>
+          <w:szCs w:val="24"/>
+        </w:rPr>
+      </w:pPr>
+      <w:r>
+        <w:rPr>
+          <w:sz w:val="28"/>
+          <w:szCs w:val="24"/>
+        </w:rPr>
+        <w:t xml:space="preserve">Open </w:t>
+      </w:r>
+      <w:hyperlink r:id="rId21" w:history="1">
+        <w:r>
+          <w:rPr>
+            <w:rStyle w:val="Hyperlink"/>
+            <w:sz w:val="28"/>
+            <w:szCs w:val="24"/>
+          </w:rPr>
+          <w:t>https://www.google.com</w:t>
+        </w:r>
+      </w:hyperlink>
+    </w:p>
+    <w:p>
+      <w:pPr>
+        <w:pStyle w:val="ListParagraph"/>
+        <w:numPr>
+          <w:ilvl w:val="1"/>
+          <w:numId w:val="1"/>
+        </w:numPr>
+        <w:rPr>
+          <w:sz w:val="28"/>
+          <w:szCs w:val="24"/>
+        </w:rPr>
+      </w:pPr>
+      <w:r>
+        <w:rPr>
+          <w:sz w:val="28"/>
+          <w:szCs w:val="24"/>
+        </w:rPr>
+        <w:t xml:space="preserve">Display list of all the links on the page </w:t>
+      </w:r>
+    </w:p>
+    <w:p>
+      <w:pPr>
+        <w:pStyle w:val="ListParagraph"/>
+        <w:numPr>
+          <w:ilvl w:val="1"/>
+          <w:numId w:val="1"/>
+        </w:numPr>
+        <w:rPr>
+          <w:sz w:val="28"/>
+          <w:szCs w:val="24"/>
+        </w:rPr>
+      </w:pPr>
+      <w:r>
+        <w:rPr>
+          <w:sz w:val="28"/>
+          <w:szCs w:val="24"/>
+        </w:rPr>
+        <w:t xml:space="preserve">Display the </w:t>
+      </w:r>
+      <w:proofErr w:type="spellStart"/>
+      <w:r>
+        <w:rPr>
+          <w:sz w:val="28"/>
+          <w:szCs w:val="24"/>
+        </w:rPr>
+        <w:t>href</w:t>
+      </w:r>
+      <w:proofErr w:type="spellEnd"/>
+      <w:r>
+        <w:rPr>
+          <w:sz w:val="28"/>
+          <w:szCs w:val="24"/>
+        </w:rPr>
+        <w:t xml:space="preserve"> attribute as well in following format (getAttribute()) </w:t>
+      </w:r>
+      <w:r>
+        <w:rPr>
+          <w:sz w:val="28"/>
+          <w:szCs w:val="24"/>
+        </w:rPr>
+        <w:br/>
+        <w:t xml:space="preserve">About = </w:t>
+      </w:r>
+      <w:hyperlink r:id="rId22" w:history="1">
+        <w:r>
+          <w:rPr>
+            <w:rStyle w:val="Hyperlink"/>
+            <w:sz w:val="28"/>
+            <w:szCs w:val="24"/>
+          </w:rPr>
+          <w:t>https://about.google/</w:t>
+        </w:r>
+      </w:hyperlink>
+    </w:p>
+    <w:p>
+      <w:pPr>
+        <w:pStyle w:val="ListParagraph"/>
+        <w:numPr>
+          <w:ilvl w:val="0"/>
+          <w:numId w:val="1"/>
+        </w:numPr>
+        <w:rPr>
+          <w:sz w:val="28"/>
+          <w:szCs w:val="24"/>
+        </w:rPr>
+      </w:pPr>
       <w:bookmarkStart w:id="0" w:name="_GoBack"/>
       <w:bookmarkEnd w:id="0"/>
     </w:p>

</xml_diff>

<commit_message>
Date: 29 Oct 2026
</commit_message>
<xml_diff>
--- a/Selenium Assignments.docx
+++ b/Selenium Assignments.docx
@@ -2389,6 +2389,255 @@
           <w:t>https://about.google/</w:t>
         </w:r>
       </w:hyperlink>
+    </w:p>
+    <w:p>
+      <w:pPr>
+        <w:pStyle w:val="ListParagraph"/>
+        <w:numPr>
+          <w:ilvl w:val="0"/>
+          <w:numId w:val="1"/>
+        </w:numPr>
+        <w:rPr>
+          <w:sz w:val="28"/>
+          <w:szCs w:val="24"/>
+        </w:rPr>
+      </w:pPr>
+      <w:r>
+        <w:rPr>
+          <w:sz w:val="28"/>
+          <w:szCs w:val="24"/>
+        </w:rPr>
+        <w:t>Complete assignment no 16 using ExplicitWait</w:t>
+      </w:r>
+      <w:r>
+        <w:rPr>
+          <w:sz w:val="28"/>
+          <w:szCs w:val="24"/>
+        </w:rPr>
+        <w:t xml:space="preserve"> (use visibliltyOfElementLocated method)</w:t>
+      </w:r>
+    </w:p>
+    <w:p>
+      <w:pPr>
+        <w:pStyle w:val="ListParagraph"/>
+        <w:numPr>
+          <w:ilvl w:val="0"/>
+          <w:numId w:val="1"/>
+        </w:numPr>
+        <w:rPr>
+          <w:sz w:val="28"/>
+          <w:szCs w:val="24"/>
+        </w:rPr>
+      </w:pPr>
+      <w:r>
+        <w:rPr>
+          <w:sz w:val="28"/>
+          <w:szCs w:val="24"/>
+        </w:rPr>
+        <w:t>Complete assignment no 16 using FluentWait (use visibliltyOfElementLocated method)</w:t>
+      </w:r>
+    </w:p>
+    <w:p>
+      <w:pPr>
+        <w:pStyle w:val="ListParagraph"/>
+        <w:numPr>
+          <w:ilvl w:val="0"/>
+          <w:numId w:val="1"/>
+        </w:numPr>
+        <w:rPr>
+          <w:sz w:val="28"/>
+          <w:szCs w:val="24"/>
+        </w:rPr>
+      </w:pPr>
+      <w:r>
+        <w:rPr>
+          <w:sz w:val="28"/>
+          <w:szCs w:val="24"/>
+        </w:rPr>
+        <w:t xml:space="preserve">Open </w:t>
+      </w:r>
+      <w:hyperlink r:id="rId23" w:history="1">
+        <w:r>
+          <w:rPr>
+            <w:rStyle w:val="Hyperlink"/>
+            <w:sz w:val="28"/>
+            <w:szCs w:val="24"/>
+          </w:rPr>
+          <w:t>https://testautomationpractice.blogspot.com/?m=1</w:t>
+        </w:r>
+      </w:hyperlink>
+    </w:p>
+    <w:p>
+      <w:pPr>
+        <w:pStyle w:val="ListParagraph"/>
+        <w:numPr>
+          <w:ilvl w:val="1"/>
+          <w:numId w:val="1"/>
+        </w:numPr>
+        <w:rPr>
+          <w:sz w:val="28"/>
+          <w:szCs w:val="24"/>
+        </w:rPr>
+      </w:pPr>
+      <w:r>
+        <w:rPr>
+          <w:sz w:val="28"/>
+          <w:szCs w:val="24"/>
+        </w:rPr>
+        <w:t>From the 1</w:t>
+      </w:r>
+      <w:r>
+        <w:rPr>
+          <w:sz w:val="28"/>
+          <w:szCs w:val="24"/>
+          <w:vertAlign w:val="superscript"/>
+        </w:rPr>
+        <w:t>st</w:t>
+      </w:r>
+      <w:r>
+        <w:rPr>
+          <w:sz w:val="28"/>
+          <w:szCs w:val="24"/>
+        </w:rPr>
+        <w:t xml:space="preserve"> table calculate addition of all the prices </w:t>
+      </w:r>
+    </w:p>
+    <w:p>
+      <w:pPr>
+        <w:pStyle w:val="ListParagraph"/>
+        <w:numPr>
+          <w:ilvl w:val="0"/>
+          <w:numId w:val="1"/>
+        </w:numPr>
+        <w:spacing w:line="256" w:lineRule="auto"/>
+        <w:rPr>
+          <w:sz w:val="28"/>
+          <w:szCs w:val="28"/>
+          <w:highlight w:val="yellow"/>
+          <w:lang w:val="en-US"/>
+        </w:rPr>
+      </w:pPr>
+      <w:r>
+        <w:rPr>
+          <w:sz w:val="28"/>
+          <w:szCs w:val="28"/>
+          <w:highlight w:val="yellow"/>
+          <w:lang w:val="en-US"/>
+        </w:rPr>
+        <w:t xml:space="preserve">Open </w:t>
+      </w:r>
+      <w:hyperlink r:id="rId24" w:history="1">
+        <w:r>
+          <w:rPr>
+            <w:rStyle w:val="Hyperlink"/>
+            <w:sz w:val="28"/>
+            <w:szCs w:val="28"/>
+            <w:highlight w:val="yellow"/>
+            <w:lang w:val="en-US"/>
+          </w:rPr>
+          <w:t>https://dash.bling-center.com/platform/signIn.html</w:t>
+        </w:r>
+      </w:hyperlink>
+    </w:p>
+    <w:p>
+      <w:pPr>
+        <w:pStyle w:val="ListParagraph"/>
+        <w:numPr>
+          <w:ilvl w:val="1"/>
+          <w:numId w:val="1"/>
+        </w:numPr>
+        <w:spacing w:line="256" w:lineRule="auto"/>
+        <w:rPr>
+          <w:sz w:val="28"/>
+          <w:szCs w:val="28"/>
+          <w:highlight w:val="yellow"/>
+          <w:lang w:val="en-US"/>
+        </w:rPr>
+      </w:pPr>
+      <w:r>
+        <w:rPr>
+          <w:sz w:val="28"/>
+          <w:szCs w:val="28"/>
+          <w:highlight w:val="yellow"/>
+          <w:lang w:val="en-US"/>
+        </w:rPr>
+        <w:t>Click on forgot password</w:t>
+      </w:r>
+    </w:p>
+    <w:p>
+      <w:pPr>
+        <w:pStyle w:val="ListParagraph"/>
+        <w:numPr>
+          <w:ilvl w:val="1"/>
+          <w:numId w:val="1"/>
+        </w:numPr>
+        <w:spacing w:line="256" w:lineRule="auto"/>
+        <w:rPr>
+          <w:sz w:val="28"/>
+          <w:szCs w:val="28"/>
+          <w:highlight w:val="yellow"/>
+          <w:lang w:val="en-US"/>
+        </w:rPr>
+      </w:pPr>
+      <w:r>
+        <w:rPr>
+          <w:sz w:val="28"/>
+          <w:szCs w:val="28"/>
+          <w:highlight w:val="yellow"/>
+          <w:lang w:val="en-US"/>
+        </w:rPr>
+        <w:t>Enter your email id</w:t>
+      </w:r>
+    </w:p>
+    <w:p>
+      <w:pPr>
+        <w:pStyle w:val="ListParagraph"/>
+        <w:numPr>
+          <w:ilvl w:val="1"/>
+          <w:numId w:val="1"/>
+        </w:numPr>
+        <w:spacing w:line="256" w:lineRule="auto"/>
+        <w:rPr>
+          <w:sz w:val="28"/>
+          <w:szCs w:val="28"/>
+          <w:highlight w:val="yellow"/>
+          <w:lang w:val="en-US"/>
+        </w:rPr>
+      </w:pPr>
+      <w:r>
+        <w:rPr>
+          <w:sz w:val="28"/>
+          <w:szCs w:val="28"/>
+          <w:highlight w:val="yellow"/>
+          <w:lang w:val="en-US"/>
+        </w:rPr>
+        <w:t>Click on reset password button</w:t>
+      </w:r>
+    </w:p>
+    <w:p>
+      <w:pPr>
+        <w:pStyle w:val="ListParagraph"/>
+        <w:numPr>
+          <w:ilvl w:val="1"/>
+          <w:numId w:val="1"/>
+        </w:numPr>
+        <w:spacing w:line="256" w:lineRule="auto"/>
+        <w:rPr>
+          <w:sz w:val="28"/>
+          <w:szCs w:val="28"/>
+          <w:highlight w:val="yellow"/>
+          <w:lang w:val="en-US"/>
+        </w:rPr>
+      </w:pPr>
+      <w:r>
+        <w:rPr>
+          <w:sz w:val="28"/>
+          <w:szCs w:val="28"/>
+          <w:highlight w:val="yellow"/>
+          <w:lang w:val="en-US"/>
+        </w:rPr>
+        <w:t>Display the text (message) in green color.</w:t>
+      </w:r>
     </w:p>
     <w:p>
       <w:pPr>
@@ -2418,6 +2667,92 @@
 <file path=word/numbering.xml><?xml version="1.0" encoding="utf-8"?>
 <w:numbering xmlns:wpc="http://schemas.microsoft.com/office/word/2010/wordprocessingCanvas" xmlns:mc="http://schemas.openxmlformats.org/markup-compatibility/2006" xmlns:o="urn:schemas-microsoft-com:office:office" xmlns:r="http://schemas.openxmlformats.org/officeDocument/2006/relationships" xmlns:m="http://schemas.openxmlformats.org/officeDocument/2006/math" xmlns:v="urn:schemas-microsoft-com:vml" xmlns:wp14="http://schemas.microsoft.com/office/word/2010/wordprocessingDrawing" xmlns:wp="http://schemas.openxmlformats.org/drawingml/2006/wordprocessingDrawing" xmlns:w10="urn:schemas-microsoft-com:office:word" xmlns:w="http://schemas.openxmlformats.org/wordprocessingml/2006/main" xmlns:w14="http://schemas.microsoft.com/office/word/2010/wordml" xmlns:w15="http://schemas.microsoft.com/office/word/2012/wordml" xmlns:wpg="http://schemas.microsoft.com/office/word/2010/wordprocessingGroup" xmlns:wpi="http://schemas.microsoft.com/office/word/2010/wordprocessingInk" xmlns:wne="http://schemas.microsoft.com/office/word/2006/wordml" xmlns:wps="http://schemas.microsoft.com/office/word/2010/wordprocessingShape" mc:Ignorable="w14 w15 wp14">
   <w:abstractNum w:abstractNumId="0">
+    <w:nsid w:val="2FA51533"/>
+    <w:multiLevelType w:val="hybridMultilevel"/>
+    <w:tmpl w:val="0DD64944"/>
+    <w:lvl w:ilvl="0" w:tplc="4009000F">
+      <w:start w:val="1"/>
+      <w:numFmt w:val="decimal"/>
+      <w:lvlText w:val="%1."/>
+      <w:lvlJc w:val="left"/>
+      <w:pPr>
+        <w:ind w:left="720" w:hanging="360"/>
+      </w:pPr>
+    </w:lvl>
+    <w:lvl w:ilvl="1" w:tplc="40090019">
+      <w:start w:val="1"/>
+      <w:numFmt w:val="lowerLetter"/>
+      <w:lvlText w:val="%2."/>
+      <w:lvlJc w:val="left"/>
+      <w:pPr>
+        <w:ind w:left="1440" w:hanging="360"/>
+      </w:pPr>
+    </w:lvl>
+    <w:lvl w:ilvl="2" w:tplc="4009001B">
+      <w:start w:val="1"/>
+      <w:numFmt w:val="lowerRoman"/>
+      <w:lvlText w:val="%3."/>
+      <w:lvlJc w:val="right"/>
+      <w:pPr>
+        <w:ind w:left="2160" w:hanging="180"/>
+      </w:pPr>
+    </w:lvl>
+    <w:lvl w:ilvl="3" w:tplc="4009000F">
+      <w:start w:val="1"/>
+      <w:numFmt w:val="decimal"/>
+      <w:lvlText w:val="%4."/>
+      <w:lvlJc w:val="left"/>
+      <w:pPr>
+        <w:ind w:left="2880" w:hanging="360"/>
+      </w:pPr>
+    </w:lvl>
+    <w:lvl w:ilvl="4" w:tplc="40090019">
+      <w:start w:val="1"/>
+      <w:numFmt w:val="lowerLetter"/>
+      <w:lvlText w:val="%5."/>
+      <w:lvlJc w:val="left"/>
+      <w:pPr>
+        <w:ind w:left="3600" w:hanging="360"/>
+      </w:pPr>
+    </w:lvl>
+    <w:lvl w:ilvl="5" w:tplc="4009001B">
+      <w:start w:val="1"/>
+      <w:numFmt w:val="lowerRoman"/>
+      <w:lvlText w:val="%6."/>
+      <w:lvlJc w:val="right"/>
+      <w:pPr>
+        <w:ind w:left="4320" w:hanging="180"/>
+      </w:pPr>
+    </w:lvl>
+    <w:lvl w:ilvl="6" w:tplc="4009000F">
+      <w:start w:val="1"/>
+      <w:numFmt w:val="decimal"/>
+      <w:lvlText w:val="%7."/>
+      <w:lvlJc w:val="left"/>
+      <w:pPr>
+        <w:ind w:left="5040" w:hanging="360"/>
+      </w:pPr>
+    </w:lvl>
+    <w:lvl w:ilvl="7" w:tplc="40090019">
+      <w:start w:val="1"/>
+      <w:numFmt w:val="lowerLetter"/>
+      <w:lvlText w:val="%8."/>
+      <w:lvlJc w:val="left"/>
+      <w:pPr>
+        <w:ind w:left="5760" w:hanging="360"/>
+      </w:pPr>
+    </w:lvl>
+    <w:lvl w:ilvl="8" w:tplc="4009001B">
+      <w:start w:val="1"/>
+      <w:numFmt w:val="lowerRoman"/>
+      <w:lvlText w:val="%9."/>
+      <w:lvlJc w:val="right"/>
+      <w:pPr>
+        <w:ind w:left="6480" w:hanging="180"/>
+      </w:pPr>
+    </w:lvl>
+  </w:abstractNum>
+  <w:abstractNum w:abstractNumId="1">
     <w:nsid w:val="4E6D7BC3"/>
     <w:multiLevelType w:val="hybridMultilevel"/>
     <w:tmpl w:val="BFF81450"/>
@@ -2507,7 +2842,37 @@
     </w:lvl>
   </w:abstractNum>
   <w:num w:numId="1">
+    <w:abstractNumId w:val="1"/>
+  </w:num>
+  <w:num w:numId="2">
     <w:abstractNumId w:val="0"/>
+    <w:lvlOverride w:ilvl="0">
+      <w:startOverride w:val="1"/>
+    </w:lvlOverride>
+    <w:lvlOverride w:ilvl="1">
+      <w:startOverride w:val="1"/>
+    </w:lvlOverride>
+    <w:lvlOverride w:ilvl="2">
+      <w:startOverride w:val="1"/>
+    </w:lvlOverride>
+    <w:lvlOverride w:ilvl="3">
+      <w:startOverride w:val="1"/>
+    </w:lvlOverride>
+    <w:lvlOverride w:ilvl="4">
+      <w:startOverride w:val="1"/>
+    </w:lvlOverride>
+    <w:lvlOverride w:ilvl="5">
+      <w:startOverride w:val="1"/>
+    </w:lvlOverride>
+    <w:lvlOverride w:ilvl="6">
+      <w:startOverride w:val="1"/>
+    </w:lvlOverride>
+    <w:lvlOverride w:ilvl="7">
+      <w:startOverride w:val="1"/>
+    </w:lvlOverride>
+    <w:lvlOverride w:ilvl="8">
+      <w:startOverride w:val="1"/>
+    </w:lvlOverride>
   </w:num>
 </w:numbering>
 </file>

</xml_diff>

<commit_message>
Date: 30 Oct 2026
</commit_message>
<xml_diff>
--- a/Selenium Assignments.docx
+++ b/Selenium Assignments.docx
@@ -6,13 +6,13 @@
       <w:pPr>
         <w:rPr>
           <w:sz w:val="28"/>
-          <w:szCs w:val="24"/>
-        </w:rPr>
-      </w:pPr>
-      <w:r>
-        <w:rPr>
-          <w:sz w:val="28"/>
-          <w:szCs w:val="24"/>
+          <w:szCs w:val="28"/>
+        </w:rPr>
+      </w:pPr>
+      <w:r>
+        <w:rPr>
+          <w:sz w:val="28"/>
+          <w:szCs w:val="28"/>
         </w:rPr>
         <w:t>Selenium Assignments</w:t>
       </w:r>
@@ -23,7 +23,7 @@
           <w:b/>
           <w:bCs/>
           <w:sz w:val="28"/>
-          <w:szCs w:val="24"/>
+          <w:szCs w:val="28"/>
         </w:rPr>
       </w:pPr>
       <w:r>
@@ -31,7 +31,7 @@
           <w:b/>
           <w:bCs/>
           <w:sz w:val="28"/>
-          <w:szCs w:val="24"/>
+          <w:szCs w:val="28"/>
         </w:rPr>
         <w:t>Please Note: You are not supposed to upload these assignments anywhere.</w:t>
       </w:r>
@@ -45,31 +45,15 @@
         </w:numPr>
         <w:rPr>
           <w:sz w:val="28"/>
-          <w:szCs w:val="24"/>
-        </w:rPr>
-      </w:pPr>
-      <w:r>
-        <w:rPr>
-          <w:sz w:val="28"/>
-          <w:szCs w:val="24"/>
-        </w:rPr>
-        <w:t xml:space="preserve">Open any website and call </w:t>
-      </w:r>
-      <w:proofErr w:type="gramStart"/>
-      <w:r>
-        <w:rPr>
-          <w:sz w:val="28"/>
-          <w:szCs w:val="24"/>
-        </w:rPr>
-        <w:t>getPageSource(</w:t>
-      </w:r>
-      <w:proofErr w:type="gramEnd"/>
-      <w:r>
-        <w:rPr>
-          <w:sz w:val="28"/>
-          <w:szCs w:val="24"/>
-        </w:rPr>
-        <w:t>) method (like getTitle) and tell me what is the return type of this method and what is the purpose of this method.</w:t>
+          <w:szCs w:val="28"/>
+        </w:rPr>
+      </w:pPr>
+      <w:r>
+        <w:rPr>
+          <w:sz w:val="28"/>
+          <w:szCs w:val="28"/>
+        </w:rPr>
+        <w:t>Open any website and call getPageSource() method (like getTitle) and tell me what is the return type of this method and what is the purpose of this method.</w:t>
       </w:r>
     </w:p>
     <w:p>
@@ -78,7 +62,7 @@
           <w:b/>
           <w:bCs/>
           <w:sz w:val="28"/>
-          <w:szCs w:val="24"/>
+          <w:szCs w:val="28"/>
         </w:rPr>
       </w:pPr>
       <w:r>
@@ -86,7 +70,7 @@
           <w:b/>
           <w:bCs/>
           <w:sz w:val="28"/>
-          <w:szCs w:val="24"/>
+          <w:szCs w:val="28"/>
         </w:rPr>
         <w:t>Date: 21 Oct. 26</w:t>
       </w:r>
@@ -95,7 +79,7 @@
           <w:b/>
           <w:bCs/>
           <w:sz w:val="28"/>
-          <w:szCs w:val="24"/>
+          <w:szCs w:val="28"/>
         </w:rPr>
         <w:br/>
       </w:r>
@@ -109,13 +93,13 @@
         </w:numPr>
         <w:rPr>
           <w:sz w:val="28"/>
-          <w:szCs w:val="24"/>
-        </w:rPr>
-      </w:pPr>
-      <w:r>
-        <w:rPr>
-          <w:sz w:val="28"/>
-          <w:szCs w:val="24"/>
+          <w:szCs w:val="28"/>
+        </w:rPr>
+      </w:pPr>
+      <w:r>
+        <w:rPr>
+          <w:sz w:val="28"/>
+          <w:szCs w:val="28"/>
         </w:rPr>
         <w:t xml:space="preserve">Open </w:t>
       </w:r>
@@ -124,7 +108,7 @@
           <w:rPr>
             <w:rStyle w:val="Hyperlink"/>
             <w:sz w:val="28"/>
-            <w:szCs w:val="24"/>
+            <w:szCs w:val="28"/>
           </w:rPr>
           <w:t>https://practicetestautomation.com/practice-test-login/</w:t>
         </w:r>
@@ -139,13 +123,13 @@
         </w:numPr>
         <w:rPr>
           <w:sz w:val="28"/>
-          <w:szCs w:val="24"/>
-        </w:rPr>
-      </w:pPr>
-      <w:r>
-        <w:rPr>
-          <w:sz w:val="28"/>
-          <w:szCs w:val="24"/>
+          <w:szCs w:val="28"/>
+        </w:rPr>
+      </w:pPr>
+      <w:r>
+        <w:rPr>
+          <w:sz w:val="28"/>
+          <w:szCs w:val="28"/>
         </w:rPr>
         <w:t>Enter user name as your name</w:t>
       </w:r>
@@ -159,13 +143,13 @@
         </w:numPr>
         <w:rPr>
           <w:sz w:val="28"/>
-          <w:szCs w:val="24"/>
-        </w:rPr>
-      </w:pPr>
-      <w:r>
-        <w:rPr>
-          <w:sz w:val="28"/>
-          <w:szCs w:val="24"/>
+          <w:szCs w:val="28"/>
+        </w:rPr>
+      </w:pPr>
+      <w:r>
+        <w:rPr>
+          <w:sz w:val="28"/>
+          <w:szCs w:val="28"/>
         </w:rPr>
         <w:t>Enter password as yourname@123</w:t>
       </w:r>
@@ -179,20 +163,20 @@
         </w:numPr>
         <w:rPr>
           <w:sz w:val="28"/>
-          <w:szCs w:val="24"/>
-        </w:rPr>
-      </w:pPr>
-      <w:r>
-        <w:rPr>
-          <w:sz w:val="28"/>
-          <w:szCs w:val="24"/>
+          <w:szCs w:val="28"/>
+        </w:rPr>
+      </w:pPr>
+      <w:r>
+        <w:rPr>
+          <w:sz w:val="28"/>
+          <w:szCs w:val="28"/>
         </w:rPr>
         <w:t>Click on Login button</w:t>
       </w:r>
       <w:r>
         <w:rPr>
           <w:sz w:val="28"/>
-          <w:szCs w:val="24"/>
+          <w:szCs w:val="28"/>
         </w:rPr>
         <w:br/>
       </w:r>
@@ -201,7 +185,7 @@
           <w:b/>
           <w:bCs/>
           <w:sz w:val="28"/>
-          <w:szCs w:val="24"/>
+          <w:szCs w:val="28"/>
         </w:rPr>
         <w:t>Use Name Locator</w:t>
       </w:r>
@@ -215,13 +199,13 @@
         </w:numPr>
         <w:rPr>
           <w:sz w:val="28"/>
-          <w:szCs w:val="24"/>
-        </w:rPr>
-      </w:pPr>
-      <w:r>
-        <w:rPr>
-          <w:sz w:val="28"/>
-          <w:szCs w:val="24"/>
+          <w:szCs w:val="28"/>
+        </w:rPr>
+      </w:pPr>
+      <w:r>
+        <w:rPr>
+          <w:sz w:val="28"/>
+          <w:szCs w:val="28"/>
         </w:rPr>
         <w:t xml:space="preserve">Open </w:t>
       </w:r>
@@ -230,7 +214,7 @@
           <w:rPr>
             <w:rStyle w:val="Hyperlink"/>
             <w:sz w:val="28"/>
-            <w:szCs w:val="24"/>
+            <w:szCs w:val="28"/>
           </w:rPr>
           <w:t>https://www.saucedemo.com/</w:t>
         </w:r>
@@ -245,84 +229,80 @@
         </w:numPr>
         <w:rPr>
           <w:sz w:val="28"/>
-          <w:szCs w:val="24"/>
-        </w:rPr>
-      </w:pPr>
-      <w:r>
-        <w:rPr>
-          <w:sz w:val="28"/>
-          <w:szCs w:val="24"/>
+          <w:szCs w:val="28"/>
+        </w:rPr>
+      </w:pPr>
+      <w:r>
+        <w:rPr>
+          <w:sz w:val="28"/>
+          <w:szCs w:val="28"/>
         </w:rPr>
         <w:t xml:space="preserve">Enter user name as </w:t>
       </w:r>
-      <w:proofErr w:type="spellStart"/>
       <w:r>
         <w:rPr>
           <w:rFonts w:ascii="Arial" w:hAnsi="Arial" w:cs="Arial"/>
           <w:color w:val="FFFFFF"/>
-          <w:sz w:val="21"/>
-          <w:szCs w:val="21"/>
+          <w:sz w:val="28"/>
+          <w:szCs w:val="28"/>
           <w:shd w:val="clear" w:color="auto" w:fill="132322"/>
         </w:rPr>
         <w:t>standard_user</w:t>
       </w:r>
-      <w:proofErr w:type="spellEnd"/>
-    </w:p>
-    <w:p>
-      <w:pPr>
-        <w:pStyle w:val="ListParagraph"/>
-        <w:numPr>
-          <w:ilvl w:val="1"/>
-          <w:numId w:val="1"/>
-        </w:numPr>
-        <w:rPr>
-          <w:sz w:val="28"/>
-          <w:szCs w:val="24"/>
-        </w:rPr>
-      </w:pPr>
-      <w:r>
-        <w:rPr>
-          <w:sz w:val="28"/>
-          <w:szCs w:val="24"/>
+    </w:p>
+    <w:p>
+      <w:pPr>
+        <w:pStyle w:val="ListParagraph"/>
+        <w:numPr>
+          <w:ilvl w:val="1"/>
+          <w:numId w:val="1"/>
+        </w:numPr>
+        <w:rPr>
+          <w:sz w:val="28"/>
+          <w:szCs w:val="28"/>
+        </w:rPr>
+      </w:pPr>
+      <w:r>
+        <w:rPr>
+          <w:sz w:val="28"/>
+          <w:szCs w:val="28"/>
         </w:rPr>
         <w:t xml:space="preserve">Enter password </w:t>
       </w:r>
       <w:r>
         <w:rPr>
           <w:sz w:val="28"/>
-          <w:szCs w:val="24"/>
+          <w:szCs w:val="28"/>
         </w:rPr>
         <w:t xml:space="preserve">as </w:t>
       </w:r>
-      <w:proofErr w:type="spellStart"/>
       <w:r>
         <w:rPr>
           <w:rFonts w:ascii="Arial" w:hAnsi="Arial" w:cs="Arial"/>
           <w:color w:val="FFFFFF"/>
-          <w:sz w:val="21"/>
-          <w:szCs w:val="21"/>
+          <w:sz w:val="28"/>
+          <w:szCs w:val="28"/>
           <w:shd w:val="clear" w:color="auto" w:fill="132322"/>
         </w:rPr>
         <w:t>secret_sauce</w:t>
       </w:r>
-      <w:proofErr w:type="spellEnd"/>
-    </w:p>
-    <w:p>
-      <w:pPr>
-        <w:pStyle w:val="ListParagraph"/>
-        <w:numPr>
-          <w:ilvl w:val="1"/>
-          <w:numId w:val="1"/>
-        </w:numPr>
-        <w:rPr>
-          <w:sz w:val="28"/>
-          <w:szCs w:val="24"/>
-        </w:rPr>
-      </w:pPr>
-      <w:r>
-        <w:rPr>
-          <w:sz w:val="28"/>
-          <w:szCs w:val="24"/>
+    </w:p>
+    <w:p>
+      <w:pPr>
+        <w:pStyle w:val="ListParagraph"/>
+        <w:numPr>
+          <w:ilvl w:val="1"/>
+          <w:numId w:val="1"/>
+        </w:numPr>
+        <w:rPr>
+          <w:sz w:val="28"/>
+          <w:szCs w:val="28"/>
+        </w:rPr>
+      </w:pPr>
+      <w:r>
+        <w:rPr>
+          <w:sz w:val="28"/>
+          <w:szCs w:val="28"/>
         </w:rPr>
         <w:t>Click on Login button</w:t>
       </w:r>
@@ -336,20 +316,20 @@
         </w:numPr>
         <w:rPr>
           <w:sz w:val="28"/>
-          <w:szCs w:val="24"/>
-        </w:rPr>
-      </w:pPr>
-      <w:r>
-        <w:rPr>
-          <w:sz w:val="28"/>
-          <w:szCs w:val="24"/>
+          <w:szCs w:val="28"/>
+        </w:rPr>
+      </w:pPr>
+      <w:r>
+        <w:rPr>
+          <w:sz w:val="28"/>
+          <w:szCs w:val="28"/>
         </w:rPr>
         <w:t>Check whether the login is successful or not and display the message as test case pass or fail</w:t>
       </w:r>
       <w:r>
         <w:rPr>
           <w:sz w:val="28"/>
-          <w:szCs w:val="24"/>
+          <w:szCs w:val="28"/>
         </w:rPr>
         <w:br/>
       </w:r>
@@ -358,7 +338,7 @@
           <w:b/>
           <w:bCs/>
           <w:sz w:val="28"/>
-          <w:szCs w:val="24"/>
+          <w:szCs w:val="28"/>
         </w:rPr>
         <w:t>Use Id Locator</w:t>
       </w:r>
@@ -372,13 +352,13 @@
         </w:numPr>
         <w:rPr>
           <w:sz w:val="28"/>
-          <w:szCs w:val="24"/>
-        </w:rPr>
-      </w:pPr>
-      <w:r>
-        <w:rPr>
-          <w:sz w:val="28"/>
-          <w:szCs w:val="24"/>
+          <w:szCs w:val="28"/>
+        </w:rPr>
+      </w:pPr>
+      <w:r>
+        <w:rPr>
+          <w:sz w:val="28"/>
+          <w:szCs w:val="28"/>
         </w:rPr>
         <w:t xml:space="preserve">Open </w:t>
       </w:r>
@@ -387,7 +367,7 @@
           <w:rPr>
             <w:rStyle w:val="Hyperlink"/>
             <w:sz w:val="28"/>
-            <w:szCs w:val="24"/>
+            <w:szCs w:val="28"/>
           </w:rPr>
           <w:t>https://www.google.com</w:t>
         </w:r>
@@ -402,13 +382,13 @@
         </w:numPr>
         <w:rPr>
           <w:sz w:val="28"/>
-          <w:szCs w:val="24"/>
-        </w:rPr>
-      </w:pPr>
-      <w:r>
-        <w:rPr>
-          <w:sz w:val="28"/>
-          <w:szCs w:val="24"/>
+          <w:szCs w:val="28"/>
+        </w:rPr>
+      </w:pPr>
+      <w:r>
+        <w:rPr>
+          <w:sz w:val="28"/>
+          <w:szCs w:val="28"/>
         </w:rPr>
         <w:t xml:space="preserve">Search for </w:t>
       </w:r>
@@ -417,7 +397,7 @@
           <w:b/>
           <w:bCs/>
           <w:sz w:val="28"/>
-          <w:szCs w:val="24"/>
+          <w:szCs w:val="28"/>
         </w:rPr>
         <w:t>Pattankodoli Yatra</w:t>
       </w:r>
@@ -431,20 +411,20 @@
         </w:numPr>
         <w:rPr>
           <w:sz w:val="28"/>
-          <w:szCs w:val="24"/>
-        </w:rPr>
-      </w:pPr>
-      <w:r>
-        <w:rPr>
-          <w:sz w:val="28"/>
-          <w:szCs w:val="24"/>
+          <w:szCs w:val="28"/>
+        </w:rPr>
+      </w:pPr>
+      <w:r>
+        <w:rPr>
+          <w:sz w:val="28"/>
+          <w:szCs w:val="28"/>
         </w:rPr>
         <w:t>Hit Enter</w:t>
       </w:r>
       <w:r>
         <w:rPr>
           <w:sz w:val="28"/>
-          <w:szCs w:val="24"/>
+          <w:szCs w:val="28"/>
         </w:rPr>
         <w:br/>
       </w:r>
@@ -453,7 +433,7 @@
           <w:b/>
           <w:bCs/>
           <w:sz w:val="28"/>
-          <w:szCs w:val="24"/>
+          <w:szCs w:val="28"/>
         </w:rPr>
         <w:t>Use any locator</w:t>
       </w:r>
@@ -467,14 +447,14 @@
         </w:numPr>
         <w:rPr>
           <w:sz w:val="28"/>
-          <w:szCs w:val="24"/>
-          <w:highlight w:val="yellow"/>
-        </w:rPr>
-      </w:pPr>
-      <w:r>
-        <w:rPr>
-          <w:sz w:val="28"/>
-          <w:szCs w:val="24"/>
+          <w:szCs w:val="28"/>
+          <w:highlight w:val="yellow"/>
+        </w:rPr>
+      </w:pPr>
+      <w:r>
+        <w:rPr>
+          <w:sz w:val="28"/>
+          <w:szCs w:val="28"/>
           <w:highlight w:val="yellow"/>
         </w:rPr>
         <w:t xml:space="preserve">Open </w:t>
@@ -484,7 +464,7 @@
           <w:rPr>
             <w:rStyle w:val="Hyperlink"/>
             <w:sz w:val="28"/>
-            <w:szCs w:val="24"/>
+            <w:szCs w:val="28"/>
             <w:highlight w:val="yellow"/>
           </w:rPr>
           <w:t>https://www.echotrak.com/Login.aspx?ReturnUrl=%2f</w:t>
@@ -500,14 +480,14 @@
         </w:numPr>
         <w:rPr>
           <w:sz w:val="28"/>
-          <w:szCs w:val="24"/>
-          <w:highlight w:val="yellow"/>
-        </w:rPr>
-      </w:pPr>
-      <w:r>
-        <w:rPr>
-          <w:sz w:val="28"/>
-          <w:szCs w:val="24"/>
+          <w:szCs w:val="28"/>
+          <w:highlight w:val="yellow"/>
+        </w:rPr>
+      </w:pPr>
+      <w:r>
+        <w:rPr>
+          <w:sz w:val="28"/>
+          <w:szCs w:val="28"/>
           <w:highlight w:val="yellow"/>
         </w:rPr>
         <w:t>Enter admin as user name</w:t>
@@ -522,14 +502,14 @@
         </w:numPr>
         <w:rPr>
           <w:sz w:val="28"/>
-          <w:szCs w:val="24"/>
-          <w:highlight w:val="yellow"/>
-        </w:rPr>
-      </w:pPr>
-      <w:r>
-        <w:rPr>
-          <w:sz w:val="28"/>
-          <w:szCs w:val="24"/>
+          <w:szCs w:val="28"/>
+          <w:highlight w:val="yellow"/>
+        </w:rPr>
+      </w:pPr>
+      <w:r>
+        <w:rPr>
+          <w:sz w:val="28"/>
+          <w:szCs w:val="28"/>
           <w:highlight w:val="yellow"/>
         </w:rPr>
         <w:t>Enter admin123 as password</w:t>
@@ -544,14 +524,14 @@
         </w:numPr>
         <w:rPr>
           <w:sz w:val="28"/>
-          <w:szCs w:val="24"/>
-          <w:highlight w:val="yellow"/>
-        </w:rPr>
-      </w:pPr>
-      <w:r>
-        <w:rPr>
-          <w:sz w:val="28"/>
-          <w:szCs w:val="24"/>
+          <w:szCs w:val="28"/>
+          <w:highlight w:val="yellow"/>
+        </w:rPr>
+      </w:pPr>
+      <w:r>
+        <w:rPr>
+          <w:sz w:val="28"/>
+          <w:szCs w:val="28"/>
           <w:highlight w:val="yellow"/>
         </w:rPr>
         <w:t>Click on Login button</w:t>
@@ -559,7 +539,7 @@
       <w:r>
         <w:rPr>
           <w:sz w:val="28"/>
-          <w:szCs w:val="24"/>
+          <w:szCs w:val="28"/>
           <w:highlight w:val="yellow"/>
         </w:rPr>
         <w:br/>
@@ -569,7 +549,7 @@
           <w:b/>
           <w:bCs/>
           <w:sz w:val="28"/>
-          <w:szCs w:val="24"/>
+          <w:szCs w:val="28"/>
           <w:highlight w:val="yellow"/>
         </w:rPr>
         <w:t>Use ClassName locator</w:t>
@@ -579,22 +559,22 @@
       <w:pPr>
         <w:rPr>
           <w:sz w:val="28"/>
-          <w:szCs w:val="24"/>
-          <w:highlight w:val="yellow"/>
-        </w:rPr>
-      </w:pPr>
-    </w:p>
-    <w:p>
-      <w:pPr>
-        <w:rPr>
-          <w:sz w:val="28"/>
-          <w:szCs w:val="24"/>
-        </w:rPr>
-      </w:pPr>
-      <w:r>
-        <w:rPr>
-          <w:sz w:val="28"/>
-          <w:szCs w:val="24"/>
+          <w:szCs w:val="28"/>
+          <w:highlight w:val="yellow"/>
+        </w:rPr>
+      </w:pPr>
+    </w:p>
+    <w:p>
+      <w:pPr>
+        <w:rPr>
+          <w:sz w:val="28"/>
+          <w:szCs w:val="28"/>
+        </w:rPr>
+      </w:pPr>
+      <w:r>
+        <w:rPr>
+          <w:sz w:val="28"/>
+          <w:szCs w:val="28"/>
         </w:rPr>
         <w:t>Date: 22 Oct. 26</w:t>
       </w:r>
@@ -608,13 +588,13 @@
         </w:numPr>
         <w:rPr>
           <w:sz w:val="28"/>
-          <w:szCs w:val="24"/>
-        </w:rPr>
-      </w:pPr>
-      <w:r>
-        <w:rPr>
-          <w:sz w:val="28"/>
-          <w:szCs w:val="24"/>
+          <w:szCs w:val="28"/>
+        </w:rPr>
+      </w:pPr>
+      <w:r>
+        <w:rPr>
+          <w:sz w:val="28"/>
+          <w:szCs w:val="28"/>
         </w:rPr>
         <w:t xml:space="preserve">Open </w:t>
       </w:r>
@@ -623,7 +603,7 @@
           <w:rPr>
             <w:rStyle w:val="Hyperlink"/>
             <w:sz w:val="28"/>
-            <w:szCs w:val="24"/>
+            <w:szCs w:val="28"/>
           </w:rPr>
           <w:t>https://practicetestautomation.com/practice-test-login/</w:t>
         </w:r>
@@ -638,13 +618,13 @@
         </w:numPr>
         <w:rPr>
           <w:sz w:val="28"/>
-          <w:szCs w:val="24"/>
-        </w:rPr>
-      </w:pPr>
-      <w:r>
-        <w:rPr>
-          <w:sz w:val="28"/>
-          <w:szCs w:val="24"/>
+          <w:szCs w:val="28"/>
+        </w:rPr>
+      </w:pPr>
+      <w:r>
+        <w:rPr>
+          <w:sz w:val="28"/>
+          <w:szCs w:val="28"/>
         </w:rPr>
         <w:t>Enter user name as student</w:t>
       </w:r>
@@ -658,13 +638,13 @@
         </w:numPr>
         <w:rPr>
           <w:sz w:val="28"/>
-          <w:szCs w:val="24"/>
-        </w:rPr>
-      </w:pPr>
-      <w:r>
-        <w:rPr>
-          <w:sz w:val="28"/>
-          <w:szCs w:val="24"/>
+          <w:szCs w:val="28"/>
+        </w:rPr>
+      </w:pPr>
+      <w:r>
+        <w:rPr>
+          <w:sz w:val="28"/>
+          <w:szCs w:val="28"/>
         </w:rPr>
         <w:t>Enter password as Password123</w:t>
       </w:r>
@@ -678,13 +658,13 @@
         </w:numPr>
         <w:rPr>
           <w:sz w:val="28"/>
-          <w:szCs w:val="24"/>
-        </w:rPr>
-      </w:pPr>
-      <w:r>
-        <w:rPr>
-          <w:sz w:val="28"/>
-          <w:szCs w:val="24"/>
+          <w:szCs w:val="28"/>
+        </w:rPr>
+      </w:pPr>
+      <w:r>
+        <w:rPr>
+          <w:sz w:val="28"/>
+          <w:szCs w:val="28"/>
         </w:rPr>
         <w:t>Click on Login button</w:t>
       </w:r>
@@ -698,13 +678,13 @@
         </w:numPr>
         <w:rPr>
           <w:sz w:val="28"/>
-          <w:szCs w:val="24"/>
-        </w:rPr>
-      </w:pPr>
-      <w:r>
-        <w:rPr>
-          <w:sz w:val="28"/>
-          <w:szCs w:val="24"/>
+          <w:szCs w:val="28"/>
+        </w:rPr>
+      </w:pPr>
+      <w:r>
+        <w:rPr>
+          <w:sz w:val="28"/>
+          <w:szCs w:val="28"/>
         </w:rPr>
         <w:lastRenderedPageBreak/>
         <w:t>If Login is successful then click on Logout link</w:t>
@@ -712,7 +692,7 @@
       <w:r>
         <w:rPr>
           <w:sz w:val="28"/>
-          <w:szCs w:val="24"/>
+          <w:szCs w:val="28"/>
         </w:rPr>
         <w:br/>
       </w:r>
@@ -726,13 +706,13 @@
         </w:numPr>
         <w:rPr>
           <w:sz w:val="28"/>
-          <w:szCs w:val="24"/>
-        </w:rPr>
-      </w:pPr>
-      <w:r>
-        <w:rPr>
-          <w:sz w:val="28"/>
-          <w:szCs w:val="24"/>
+          <w:szCs w:val="28"/>
+        </w:rPr>
+      </w:pPr>
+      <w:r>
+        <w:rPr>
+          <w:sz w:val="28"/>
+          <w:szCs w:val="28"/>
         </w:rPr>
         <w:t xml:space="preserve">Open </w:t>
       </w:r>
@@ -741,7 +721,7 @@
           <w:rPr>
             <w:rStyle w:val="Hyperlink"/>
             <w:sz w:val="28"/>
-            <w:szCs w:val="24"/>
+            <w:szCs w:val="28"/>
           </w:rPr>
           <w:t>https://www.saucedemo.com/</w:t>
         </w:r>
@@ -756,84 +736,73 @@
         </w:numPr>
         <w:rPr>
           <w:sz w:val="28"/>
-          <w:szCs w:val="24"/>
-        </w:rPr>
-      </w:pPr>
-      <w:r>
-        <w:rPr>
-          <w:sz w:val="28"/>
-          <w:szCs w:val="24"/>
+          <w:szCs w:val="28"/>
+        </w:rPr>
+      </w:pPr>
+      <w:r>
+        <w:rPr>
+          <w:sz w:val="28"/>
+          <w:szCs w:val="28"/>
         </w:rPr>
         <w:t xml:space="preserve">Enter user name as </w:t>
       </w:r>
-      <w:proofErr w:type="spellStart"/>
       <w:r>
         <w:rPr>
           <w:rFonts w:ascii="Arial" w:hAnsi="Arial" w:cs="Arial"/>
           <w:color w:val="FFFFFF"/>
-          <w:sz w:val="21"/>
-          <w:szCs w:val="21"/>
+          <w:sz w:val="28"/>
+          <w:szCs w:val="28"/>
           <w:shd w:val="clear" w:color="auto" w:fill="132322"/>
         </w:rPr>
         <w:t>standard_user</w:t>
       </w:r>
-      <w:proofErr w:type="spellEnd"/>
-    </w:p>
-    <w:p>
-      <w:pPr>
-        <w:pStyle w:val="ListParagraph"/>
-        <w:numPr>
-          <w:ilvl w:val="1"/>
-          <w:numId w:val="1"/>
-        </w:numPr>
-        <w:rPr>
-          <w:sz w:val="28"/>
-          <w:szCs w:val="24"/>
-        </w:rPr>
-      </w:pPr>
-      <w:r>
-        <w:rPr>
-          <w:sz w:val="28"/>
-          <w:szCs w:val="24"/>
-        </w:rPr>
-        <w:t xml:space="preserve">Enter password </w:t>
-      </w:r>
-      <w:r>
-        <w:rPr>
-          <w:sz w:val="28"/>
-          <w:szCs w:val="24"/>
-        </w:rPr>
-        <w:t xml:space="preserve">as </w:t>
-      </w:r>
-      <w:proofErr w:type="spellStart"/>
+    </w:p>
+    <w:p>
+      <w:pPr>
+        <w:pStyle w:val="ListParagraph"/>
+        <w:numPr>
+          <w:ilvl w:val="1"/>
+          <w:numId w:val="1"/>
+        </w:numPr>
+        <w:rPr>
+          <w:sz w:val="28"/>
+          <w:szCs w:val="28"/>
+        </w:rPr>
+      </w:pPr>
+      <w:r>
+        <w:rPr>
+          <w:sz w:val="28"/>
+          <w:szCs w:val="28"/>
+        </w:rPr>
+        <w:t xml:space="preserve">Enter password as </w:t>
+      </w:r>
       <w:r>
         <w:rPr>
           <w:rFonts w:ascii="Arial" w:hAnsi="Arial" w:cs="Arial"/>
           <w:color w:val="FFFFFF"/>
-          <w:sz w:val="21"/>
-          <w:szCs w:val="21"/>
+          <w:sz w:val="28"/>
+          <w:szCs w:val="28"/>
           <w:shd w:val="clear" w:color="auto" w:fill="132322"/>
         </w:rPr>
         <w:t>secret_sauce</w:t>
       </w:r>
-      <w:proofErr w:type="spellEnd"/>
-    </w:p>
-    <w:p>
-      <w:pPr>
-        <w:pStyle w:val="ListParagraph"/>
-        <w:numPr>
-          <w:ilvl w:val="1"/>
-          <w:numId w:val="1"/>
-        </w:numPr>
-        <w:rPr>
-          <w:sz w:val="28"/>
-          <w:szCs w:val="24"/>
-        </w:rPr>
-      </w:pPr>
-      <w:r>
-        <w:rPr>
-          <w:sz w:val="28"/>
-          <w:szCs w:val="24"/>
+    </w:p>
+    <w:p>
+      <w:pPr>
+        <w:pStyle w:val="ListParagraph"/>
+        <w:numPr>
+          <w:ilvl w:val="1"/>
+          <w:numId w:val="1"/>
+        </w:numPr>
+        <w:rPr>
+          <w:sz w:val="28"/>
+          <w:szCs w:val="28"/>
+        </w:rPr>
+      </w:pPr>
+      <w:r>
+        <w:rPr>
+          <w:sz w:val="28"/>
+          <w:szCs w:val="28"/>
         </w:rPr>
         <w:t>Click on Login button</w:t>
       </w:r>
@@ -847,20 +816,20 @@
         </w:numPr>
         <w:rPr>
           <w:sz w:val="28"/>
-          <w:szCs w:val="24"/>
-        </w:rPr>
-      </w:pPr>
-      <w:r>
-        <w:rPr>
-          <w:sz w:val="28"/>
-          <w:szCs w:val="24"/>
+          <w:szCs w:val="28"/>
+        </w:rPr>
+      </w:pPr>
+      <w:r>
+        <w:rPr>
+          <w:sz w:val="28"/>
+          <w:szCs w:val="28"/>
         </w:rPr>
         <w:t>Check whether the login is successful or not and display the message as test case pass or fail</w:t>
       </w:r>
       <w:r>
         <w:rPr>
           <w:sz w:val="28"/>
-          <w:szCs w:val="24"/>
+          <w:szCs w:val="28"/>
         </w:rPr>
         <w:br/>
       </w:r>
@@ -869,7 +838,7 @@
           <w:b/>
           <w:bCs/>
           <w:sz w:val="28"/>
-          <w:szCs w:val="24"/>
+          <w:szCs w:val="28"/>
         </w:rPr>
         <w:t>Use CssSelector single attribute as well as multiple attributes</w:t>
       </w:r>
@@ -883,13 +852,13 @@
         </w:numPr>
         <w:rPr>
           <w:sz w:val="28"/>
-          <w:szCs w:val="24"/>
-        </w:rPr>
-      </w:pPr>
-      <w:r>
-        <w:rPr>
-          <w:sz w:val="28"/>
-          <w:szCs w:val="24"/>
+          <w:szCs w:val="28"/>
+        </w:rPr>
+      </w:pPr>
+      <w:r>
+        <w:rPr>
+          <w:sz w:val="28"/>
+          <w:szCs w:val="28"/>
         </w:rPr>
         <w:t xml:space="preserve">Open </w:t>
       </w:r>
@@ -898,7 +867,7 @@
           <w:rPr>
             <w:rStyle w:val="Hyperlink"/>
             <w:sz w:val="28"/>
-            <w:szCs w:val="24"/>
+            <w:szCs w:val="28"/>
           </w:rPr>
           <w:t>https://www.echotrak.com/Login.aspx?ReturnUrl=%2f</w:t>
         </w:r>
@@ -913,13 +882,13 @@
         </w:numPr>
         <w:rPr>
           <w:sz w:val="28"/>
-          <w:szCs w:val="24"/>
-        </w:rPr>
-      </w:pPr>
-      <w:r>
-        <w:rPr>
-          <w:sz w:val="28"/>
-          <w:szCs w:val="24"/>
+          <w:szCs w:val="28"/>
+        </w:rPr>
+      </w:pPr>
+      <w:r>
+        <w:rPr>
+          <w:sz w:val="28"/>
+          <w:szCs w:val="28"/>
         </w:rPr>
         <w:t>Enter admin as user name</w:t>
       </w:r>
@@ -933,13 +902,13 @@
         </w:numPr>
         <w:rPr>
           <w:sz w:val="28"/>
-          <w:szCs w:val="24"/>
-        </w:rPr>
-      </w:pPr>
-      <w:r>
-        <w:rPr>
-          <w:sz w:val="28"/>
-          <w:szCs w:val="24"/>
+          <w:szCs w:val="28"/>
+        </w:rPr>
+      </w:pPr>
+      <w:r>
+        <w:rPr>
+          <w:sz w:val="28"/>
+          <w:szCs w:val="28"/>
         </w:rPr>
         <w:t>Enter admin123 as password</w:t>
       </w:r>
@@ -953,20 +922,20 @@
         </w:numPr>
         <w:rPr>
           <w:sz w:val="28"/>
-          <w:szCs w:val="24"/>
-        </w:rPr>
-      </w:pPr>
-      <w:r>
-        <w:rPr>
-          <w:sz w:val="28"/>
-          <w:szCs w:val="24"/>
+          <w:szCs w:val="28"/>
+        </w:rPr>
+      </w:pPr>
+      <w:r>
+        <w:rPr>
+          <w:sz w:val="28"/>
+          <w:szCs w:val="28"/>
         </w:rPr>
         <w:t>Click on Login button</w:t>
       </w:r>
       <w:r>
         <w:rPr>
           <w:sz w:val="28"/>
-          <w:szCs w:val="24"/>
+          <w:szCs w:val="28"/>
         </w:rPr>
         <w:br/>
       </w:r>
@@ -975,40 +944,22 @@
           <w:b/>
           <w:bCs/>
           <w:sz w:val="28"/>
-          <w:szCs w:val="24"/>
-        </w:rPr>
-        <w:t xml:space="preserve">Use </w:t>
-      </w:r>
-      <w:r>
-        <w:rPr>
-          <w:b/>
-          <w:bCs/>
-          <w:sz w:val="28"/>
-          <w:szCs w:val="24"/>
-        </w:rPr>
-        <w:t>CssSelector</w:t>
-      </w:r>
-      <w:r>
-        <w:rPr>
-          <w:b/>
-          <w:bCs/>
-          <w:sz w:val="28"/>
-          <w:szCs w:val="24"/>
-        </w:rPr>
-        <w:t xml:space="preserve"> locator</w:t>
-      </w:r>
-    </w:p>
-    <w:p>
-      <w:pPr>
-        <w:rPr>
-          <w:sz w:val="28"/>
-          <w:szCs w:val="24"/>
-        </w:rPr>
-      </w:pPr>
-      <w:r>
-        <w:rPr>
-          <w:sz w:val="28"/>
-          <w:szCs w:val="24"/>
+          <w:szCs w:val="28"/>
+        </w:rPr>
+        <w:t>Use CssSelector locator</w:t>
+      </w:r>
+    </w:p>
+    <w:p>
+      <w:pPr>
+        <w:rPr>
+          <w:sz w:val="28"/>
+          <w:szCs w:val="28"/>
+        </w:rPr>
+      </w:pPr>
+      <w:r>
+        <w:rPr>
+          <w:sz w:val="28"/>
+          <w:szCs w:val="28"/>
         </w:rPr>
         <w:t>Date: 23 Oct. 26</w:t>
       </w:r>
@@ -1017,7 +968,7 @@
       <w:pPr>
         <w:rPr>
           <w:sz w:val="28"/>
-          <w:szCs w:val="24"/>
+          <w:szCs w:val="28"/>
         </w:rPr>
       </w:pPr>
     </w:p>
@@ -1030,13 +981,13 @@
         </w:numPr>
         <w:rPr>
           <w:sz w:val="28"/>
-          <w:szCs w:val="24"/>
-        </w:rPr>
-      </w:pPr>
-      <w:r>
-        <w:rPr>
-          <w:sz w:val="28"/>
-          <w:szCs w:val="24"/>
+          <w:szCs w:val="28"/>
+        </w:rPr>
+      </w:pPr>
+      <w:r>
+        <w:rPr>
+          <w:sz w:val="28"/>
+          <w:szCs w:val="28"/>
         </w:rPr>
         <w:t xml:space="preserve">Open </w:t>
       </w:r>
@@ -1045,7 +996,7 @@
           <w:rPr>
             <w:rStyle w:val="Hyperlink"/>
             <w:sz w:val="28"/>
-            <w:szCs w:val="24"/>
+            <w:szCs w:val="28"/>
           </w:rPr>
           <w:t>https://practicetestautomation.com/practice-test-login/</w:t>
         </w:r>
@@ -1060,13 +1011,13 @@
         </w:numPr>
         <w:rPr>
           <w:sz w:val="28"/>
-          <w:szCs w:val="24"/>
-        </w:rPr>
-      </w:pPr>
-      <w:r>
-        <w:rPr>
-          <w:sz w:val="28"/>
-          <w:szCs w:val="24"/>
+          <w:szCs w:val="28"/>
+        </w:rPr>
+      </w:pPr>
+      <w:r>
+        <w:rPr>
+          <w:sz w:val="28"/>
+          <w:szCs w:val="28"/>
         </w:rPr>
         <w:t>Enter user name as student</w:t>
       </w:r>
@@ -1080,13 +1031,13 @@
         </w:numPr>
         <w:rPr>
           <w:sz w:val="28"/>
-          <w:szCs w:val="24"/>
-        </w:rPr>
-      </w:pPr>
-      <w:r>
-        <w:rPr>
-          <w:sz w:val="28"/>
-          <w:szCs w:val="24"/>
+          <w:szCs w:val="28"/>
+        </w:rPr>
+      </w:pPr>
+      <w:r>
+        <w:rPr>
+          <w:sz w:val="28"/>
+          <w:szCs w:val="28"/>
         </w:rPr>
         <w:t>Enter password as Password123</w:t>
       </w:r>
@@ -1100,13 +1051,13 @@
         </w:numPr>
         <w:rPr>
           <w:sz w:val="28"/>
-          <w:szCs w:val="24"/>
-        </w:rPr>
-      </w:pPr>
-      <w:r>
-        <w:rPr>
-          <w:sz w:val="28"/>
-          <w:szCs w:val="24"/>
+          <w:szCs w:val="28"/>
+        </w:rPr>
+      </w:pPr>
+      <w:r>
+        <w:rPr>
+          <w:sz w:val="28"/>
+          <w:szCs w:val="28"/>
         </w:rPr>
         <w:t>Click on Login button</w:t>
       </w:r>
@@ -1120,20 +1071,20 @@
         </w:numPr>
         <w:rPr>
           <w:sz w:val="28"/>
-          <w:szCs w:val="24"/>
-        </w:rPr>
-      </w:pPr>
-      <w:r>
-        <w:rPr>
-          <w:sz w:val="28"/>
-          <w:szCs w:val="24"/>
+          <w:szCs w:val="28"/>
+        </w:rPr>
+      </w:pPr>
+      <w:r>
+        <w:rPr>
+          <w:sz w:val="28"/>
+          <w:szCs w:val="28"/>
         </w:rPr>
         <w:t>If Login is successful then click on Logout link</w:t>
       </w:r>
       <w:r>
         <w:rPr>
           <w:sz w:val="28"/>
-          <w:szCs w:val="24"/>
+          <w:szCs w:val="28"/>
         </w:rPr>
         <w:br/>
       </w:r>
@@ -1142,7 +1093,7 @@
           <w:b/>
           <w:bCs/>
           <w:sz w:val="28"/>
-          <w:szCs w:val="24"/>
+          <w:szCs w:val="28"/>
         </w:rPr>
         <w:t>For step a, b &amp; c use absolute xpath for step d use link text / partial link text</w:t>
       </w:r>
@@ -1156,13 +1107,13 @@
         </w:numPr>
         <w:rPr>
           <w:sz w:val="28"/>
-          <w:szCs w:val="24"/>
-        </w:rPr>
-      </w:pPr>
-      <w:r>
-        <w:rPr>
-          <w:sz w:val="28"/>
-          <w:szCs w:val="24"/>
+          <w:szCs w:val="28"/>
+        </w:rPr>
+      </w:pPr>
+      <w:r>
+        <w:rPr>
+          <w:sz w:val="28"/>
+          <w:szCs w:val="28"/>
         </w:rPr>
         <w:t xml:space="preserve">Open </w:t>
       </w:r>
@@ -1171,7 +1122,7 @@
           <w:rPr>
             <w:rStyle w:val="Hyperlink"/>
             <w:sz w:val="28"/>
-            <w:szCs w:val="24"/>
+            <w:szCs w:val="28"/>
           </w:rPr>
           <w:t>https://www.saucedemo.com/</w:t>
         </w:r>
@@ -1186,84 +1137,73 @@
         </w:numPr>
         <w:rPr>
           <w:sz w:val="28"/>
-          <w:szCs w:val="24"/>
-        </w:rPr>
-      </w:pPr>
-      <w:r>
-        <w:rPr>
-          <w:sz w:val="28"/>
-          <w:szCs w:val="24"/>
+          <w:szCs w:val="28"/>
+        </w:rPr>
+      </w:pPr>
+      <w:r>
+        <w:rPr>
+          <w:sz w:val="28"/>
+          <w:szCs w:val="28"/>
         </w:rPr>
         <w:t xml:space="preserve">Enter user name as </w:t>
       </w:r>
-      <w:proofErr w:type="spellStart"/>
       <w:r>
         <w:rPr>
           <w:rFonts w:ascii="Arial" w:hAnsi="Arial" w:cs="Arial"/>
           <w:color w:val="FFFFFF"/>
-          <w:sz w:val="21"/>
-          <w:szCs w:val="21"/>
+          <w:sz w:val="28"/>
+          <w:szCs w:val="28"/>
           <w:shd w:val="clear" w:color="auto" w:fill="132322"/>
         </w:rPr>
         <w:t>standard_user</w:t>
       </w:r>
-      <w:proofErr w:type="spellEnd"/>
-    </w:p>
-    <w:p>
-      <w:pPr>
-        <w:pStyle w:val="ListParagraph"/>
-        <w:numPr>
-          <w:ilvl w:val="1"/>
-          <w:numId w:val="1"/>
-        </w:numPr>
-        <w:rPr>
-          <w:sz w:val="28"/>
-          <w:szCs w:val="24"/>
-        </w:rPr>
-      </w:pPr>
-      <w:r>
-        <w:rPr>
-          <w:sz w:val="28"/>
-          <w:szCs w:val="24"/>
-        </w:rPr>
-        <w:t xml:space="preserve">Enter password </w:t>
-      </w:r>
-      <w:r>
-        <w:rPr>
-          <w:sz w:val="28"/>
-          <w:szCs w:val="24"/>
-        </w:rPr>
-        <w:t xml:space="preserve">as </w:t>
-      </w:r>
-      <w:proofErr w:type="spellStart"/>
+    </w:p>
+    <w:p>
+      <w:pPr>
+        <w:pStyle w:val="ListParagraph"/>
+        <w:numPr>
+          <w:ilvl w:val="1"/>
+          <w:numId w:val="1"/>
+        </w:numPr>
+        <w:rPr>
+          <w:sz w:val="28"/>
+          <w:szCs w:val="28"/>
+        </w:rPr>
+      </w:pPr>
+      <w:r>
+        <w:rPr>
+          <w:sz w:val="28"/>
+          <w:szCs w:val="28"/>
+        </w:rPr>
+        <w:t xml:space="preserve">Enter password as </w:t>
+      </w:r>
       <w:r>
         <w:rPr>
           <w:rFonts w:ascii="Arial" w:hAnsi="Arial" w:cs="Arial"/>
           <w:color w:val="FFFFFF"/>
-          <w:sz w:val="21"/>
-          <w:szCs w:val="21"/>
+          <w:sz w:val="28"/>
+          <w:szCs w:val="28"/>
           <w:shd w:val="clear" w:color="auto" w:fill="132322"/>
         </w:rPr>
         <w:t>secret_sauce</w:t>
       </w:r>
-      <w:proofErr w:type="spellEnd"/>
-    </w:p>
-    <w:p>
-      <w:pPr>
-        <w:pStyle w:val="ListParagraph"/>
-        <w:numPr>
-          <w:ilvl w:val="1"/>
-          <w:numId w:val="1"/>
-        </w:numPr>
-        <w:rPr>
-          <w:sz w:val="28"/>
-          <w:szCs w:val="24"/>
-        </w:rPr>
-      </w:pPr>
-      <w:r>
-        <w:rPr>
-          <w:sz w:val="28"/>
-          <w:szCs w:val="24"/>
+    </w:p>
+    <w:p>
+      <w:pPr>
+        <w:pStyle w:val="ListParagraph"/>
+        <w:numPr>
+          <w:ilvl w:val="1"/>
+          <w:numId w:val="1"/>
+        </w:numPr>
+        <w:rPr>
+          <w:sz w:val="28"/>
+          <w:szCs w:val="28"/>
+        </w:rPr>
+      </w:pPr>
+      <w:r>
+        <w:rPr>
+          <w:sz w:val="28"/>
+          <w:szCs w:val="28"/>
         </w:rPr>
         <w:t>Click on Login button</w:t>
       </w:r>
@@ -1277,20 +1217,20 @@
         </w:numPr>
         <w:rPr>
           <w:sz w:val="28"/>
-          <w:szCs w:val="24"/>
-        </w:rPr>
-      </w:pPr>
-      <w:r>
-        <w:rPr>
-          <w:sz w:val="28"/>
-          <w:szCs w:val="24"/>
+          <w:szCs w:val="28"/>
+        </w:rPr>
+      </w:pPr>
+      <w:r>
+        <w:rPr>
+          <w:sz w:val="28"/>
+          <w:szCs w:val="28"/>
         </w:rPr>
         <w:t>Check whether the login is successful or not and display the message as test case pass or fail</w:t>
       </w:r>
       <w:r>
         <w:rPr>
           <w:sz w:val="28"/>
-          <w:szCs w:val="24"/>
+          <w:szCs w:val="28"/>
         </w:rPr>
         <w:br/>
       </w:r>
@@ -1299,7 +1239,7 @@
           <w:b/>
           <w:bCs/>
           <w:sz w:val="28"/>
-          <w:szCs w:val="24"/>
+          <w:szCs w:val="28"/>
         </w:rPr>
         <w:t>Use Absolute XPath</w:t>
       </w:r>
@@ -1313,13 +1253,13 @@
         </w:numPr>
         <w:rPr>
           <w:sz w:val="28"/>
-          <w:szCs w:val="24"/>
-        </w:rPr>
-      </w:pPr>
-      <w:r>
-        <w:rPr>
-          <w:sz w:val="28"/>
-          <w:szCs w:val="24"/>
+          <w:szCs w:val="28"/>
+        </w:rPr>
+      </w:pPr>
+      <w:r>
+        <w:rPr>
+          <w:sz w:val="28"/>
+          <w:szCs w:val="28"/>
         </w:rPr>
         <w:t xml:space="preserve">Open </w:t>
       </w:r>
@@ -1328,7 +1268,7 @@
           <w:rPr>
             <w:rStyle w:val="Hyperlink"/>
             <w:sz w:val="28"/>
-            <w:szCs w:val="24"/>
+            <w:szCs w:val="28"/>
           </w:rPr>
           <w:t>https://register.rediff.com/register/register.php?FormName=user_details</w:t>
         </w:r>
@@ -1343,13 +1283,13 @@
         </w:numPr>
         <w:rPr>
           <w:sz w:val="28"/>
-          <w:szCs w:val="24"/>
-        </w:rPr>
-      </w:pPr>
-      <w:r>
-        <w:rPr>
-          <w:sz w:val="28"/>
-          <w:szCs w:val="24"/>
+          <w:szCs w:val="28"/>
+        </w:rPr>
+      </w:pPr>
+      <w:r>
+        <w:rPr>
+          <w:sz w:val="28"/>
+          <w:szCs w:val="28"/>
         </w:rPr>
         <w:t>Enter full Name</w:t>
       </w:r>
@@ -1363,49 +1303,33 @@
         </w:numPr>
         <w:rPr>
           <w:sz w:val="28"/>
-          <w:szCs w:val="24"/>
-        </w:rPr>
-      </w:pPr>
-      <w:r>
-        <w:rPr>
-          <w:sz w:val="28"/>
-          <w:szCs w:val="24"/>
-        </w:rPr>
-        <w:t xml:space="preserve">Enter </w:t>
-      </w:r>
-      <w:proofErr w:type="spellStart"/>
-      <w:r>
-        <w:rPr>
-          <w:sz w:val="28"/>
-          <w:szCs w:val="24"/>
-        </w:rPr>
-        <w:t>rediff</w:t>
-      </w:r>
-      <w:proofErr w:type="spellEnd"/>
-      <w:r>
-        <w:rPr>
-          <w:sz w:val="28"/>
-          <w:szCs w:val="24"/>
-        </w:rPr>
-        <w:t xml:space="preserve"> id</w:t>
-      </w:r>
-    </w:p>
-    <w:p>
-      <w:pPr>
-        <w:pStyle w:val="ListParagraph"/>
-        <w:numPr>
-          <w:ilvl w:val="1"/>
-          <w:numId w:val="1"/>
-        </w:numPr>
-        <w:rPr>
-          <w:sz w:val="28"/>
-          <w:szCs w:val="24"/>
-        </w:rPr>
-      </w:pPr>
-      <w:r>
-        <w:rPr>
-          <w:sz w:val="28"/>
-          <w:szCs w:val="24"/>
+          <w:szCs w:val="28"/>
+        </w:rPr>
+      </w:pPr>
+      <w:r>
+        <w:rPr>
+          <w:sz w:val="28"/>
+          <w:szCs w:val="28"/>
+        </w:rPr>
+        <w:t>Enter rediff id</w:t>
+      </w:r>
+    </w:p>
+    <w:p>
+      <w:pPr>
+        <w:pStyle w:val="ListParagraph"/>
+        <w:numPr>
+          <w:ilvl w:val="1"/>
+          <w:numId w:val="1"/>
+        </w:numPr>
+        <w:rPr>
+          <w:sz w:val="28"/>
+          <w:szCs w:val="28"/>
+        </w:rPr>
+      </w:pPr>
+      <w:r>
+        <w:rPr>
+          <w:sz w:val="28"/>
+          <w:szCs w:val="28"/>
         </w:rPr>
         <w:t>Enter password</w:t>
       </w:r>
@@ -1419,13 +1343,13 @@
         </w:numPr>
         <w:rPr>
           <w:sz w:val="28"/>
-          <w:szCs w:val="24"/>
-        </w:rPr>
-      </w:pPr>
-      <w:r>
-        <w:rPr>
-          <w:sz w:val="28"/>
-          <w:szCs w:val="24"/>
+          <w:szCs w:val="28"/>
+        </w:rPr>
+      </w:pPr>
+      <w:r>
+        <w:rPr>
+          <w:sz w:val="28"/>
+          <w:szCs w:val="28"/>
         </w:rPr>
         <w:lastRenderedPageBreak/>
         <w:t>Enter retype password</w:t>
@@ -1433,7 +1357,7 @@
       <w:r>
         <w:rPr>
           <w:sz w:val="28"/>
-          <w:szCs w:val="24"/>
+          <w:szCs w:val="28"/>
         </w:rPr>
         <w:br/>
       </w:r>
@@ -1442,7 +1366,7 @@
           <w:b/>
           <w:bCs/>
           <w:sz w:val="28"/>
-          <w:szCs w:val="24"/>
+          <w:szCs w:val="28"/>
         </w:rPr>
         <w:t>Use Absolute XPath</w:t>
       </w:r>
@@ -1456,13 +1380,13 @@
         </w:numPr>
         <w:rPr>
           <w:sz w:val="28"/>
-          <w:szCs w:val="24"/>
-        </w:rPr>
-      </w:pPr>
-      <w:r>
-        <w:rPr>
-          <w:sz w:val="28"/>
-          <w:szCs w:val="24"/>
+          <w:szCs w:val="28"/>
+        </w:rPr>
+      </w:pPr>
+      <w:r>
+        <w:rPr>
+          <w:sz w:val="28"/>
+          <w:szCs w:val="28"/>
         </w:rPr>
         <w:t xml:space="preserve">Open </w:t>
       </w:r>
@@ -1471,7 +1395,7 @@
           <w:rPr>
             <w:rStyle w:val="Hyperlink"/>
             <w:sz w:val="28"/>
-            <w:szCs w:val="24"/>
+            <w:szCs w:val="28"/>
           </w:rPr>
           <w:t>https://practicetestautomation.com/practice-test-login/</w:t>
         </w:r>
@@ -1486,13 +1410,13 @@
         </w:numPr>
         <w:rPr>
           <w:sz w:val="28"/>
-          <w:szCs w:val="24"/>
-        </w:rPr>
-      </w:pPr>
-      <w:r>
-        <w:rPr>
-          <w:sz w:val="28"/>
-          <w:szCs w:val="24"/>
+          <w:szCs w:val="28"/>
+        </w:rPr>
+      </w:pPr>
+      <w:r>
+        <w:rPr>
+          <w:sz w:val="28"/>
+          <w:szCs w:val="28"/>
         </w:rPr>
         <w:t>Enter user name as student</w:t>
       </w:r>
@@ -1506,13 +1430,13 @@
         </w:numPr>
         <w:rPr>
           <w:sz w:val="28"/>
-          <w:szCs w:val="24"/>
-        </w:rPr>
-      </w:pPr>
-      <w:r>
-        <w:rPr>
-          <w:sz w:val="28"/>
-          <w:szCs w:val="24"/>
+          <w:szCs w:val="28"/>
+        </w:rPr>
+      </w:pPr>
+      <w:r>
+        <w:rPr>
+          <w:sz w:val="28"/>
+          <w:szCs w:val="28"/>
         </w:rPr>
         <w:t>Enter password as Password123</w:t>
       </w:r>
@@ -1526,13 +1450,13 @@
         </w:numPr>
         <w:rPr>
           <w:sz w:val="28"/>
-          <w:szCs w:val="24"/>
-        </w:rPr>
-      </w:pPr>
-      <w:r>
-        <w:rPr>
-          <w:sz w:val="28"/>
-          <w:szCs w:val="24"/>
+          <w:szCs w:val="28"/>
+        </w:rPr>
+      </w:pPr>
+      <w:r>
+        <w:rPr>
+          <w:sz w:val="28"/>
+          <w:szCs w:val="28"/>
         </w:rPr>
         <w:t>Click on Login button</w:t>
       </w:r>
@@ -1546,20 +1470,20 @@
         </w:numPr>
         <w:rPr>
           <w:sz w:val="28"/>
-          <w:szCs w:val="24"/>
-        </w:rPr>
-      </w:pPr>
-      <w:r>
-        <w:rPr>
-          <w:sz w:val="28"/>
-          <w:szCs w:val="24"/>
+          <w:szCs w:val="28"/>
+        </w:rPr>
+      </w:pPr>
+      <w:r>
+        <w:rPr>
+          <w:sz w:val="28"/>
+          <w:szCs w:val="28"/>
         </w:rPr>
         <w:t>If Login is successful then click on Logout link</w:t>
       </w:r>
       <w:r>
         <w:rPr>
           <w:sz w:val="28"/>
-          <w:szCs w:val="24"/>
+          <w:szCs w:val="28"/>
         </w:rPr>
         <w:br/>
       </w:r>
@@ -1568,7 +1492,7 @@
           <w:b/>
           <w:bCs/>
           <w:sz w:val="28"/>
-          <w:szCs w:val="24"/>
+          <w:szCs w:val="28"/>
         </w:rPr>
         <w:t>For step a, b &amp; c use Relative xpath for step d use link text / partial link text</w:t>
       </w:r>
@@ -1582,13 +1506,13 @@
         </w:numPr>
         <w:rPr>
           <w:sz w:val="28"/>
-          <w:szCs w:val="24"/>
-        </w:rPr>
-      </w:pPr>
-      <w:r>
-        <w:rPr>
-          <w:sz w:val="28"/>
-          <w:szCs w:val="24"/>
+          <w:szCs w:val="28"/>
+        </w:rPr>
+      </w:pPr>
+      <w:r>
+        <w:rPr>
+          <w:sz w:val="28"/>
+          <w:szCs w:val="28"/>
         </w:rPr>
         <w:t xml:space="preserve">Open </w:t>
       </w:r>
@@ -1597,7 +1521,7 @@
           <w:rPr>
             <w:rStyle w:val="Hyperlink"/>
             <w:sz w:val="28"/>
-            <w:szCs w:val="24"/>
+            <w:szCs w:val="28"/>
           </w:rPr>
           <w:t>https://www.saucedemo.com/</w:t>
         </w:r>
@@ -1612,84 +1536,73 @@
         </w:numPr>
         <w:rPr>
           <w:sz w:val="28"/>
-          <w:szCs w:val="24"/>
-        </w:rPr>
-      </w:pPr>
-      <w:r>
-        <w:rPr>
-          <w:sz w:val="28"/>
-          <w:szCs w:val="24"/>
+          <w:szCs w:val="28"/>
+        </w:rPr>
+      </w:pPr>
+      <w:r>
+        <w:rPr>
+          <w:sz w:val="28"/>
+          <w:szCs w:val="28"/>
         </w:rPr>
         <w:t xml:space="preserve">Enter user name as </w:t>
       </w:r>
-      <w:proofErr w:type="spellStart"/>
       <w:r>
         <w:rPr>
           <w:rFonts w:ascii="Arial" w:hAnsi="Arial" w:cs="Arial"/>
           <w:color w:val="FFFFFF"/>
-          <w:sz w:val="21"/>
-          <w:szCs w:val="21"/>
+          <w:sz w:val="28"/>
+          <w:szCs w:val="28"/>
           <w:shd w:val="clear" w:color="auto" w:fill="132322"/>
         </w:rPr>
         <w:t>standard_user</w:t>
       </w:r>
-      <w:proofErr w:type="spellEnd"/>
-    </w:p>
-    <w:p>
-      <w:pPr>
-        <w:pStyle w:val="ListParagraph"/>
-        <w:numPr>
-          <w:ilvl w:val="1"/>
-          <w:numId w:val="1"/>
-        </w:numPr>
-        <w:rPr>
-          <w:sz w:val="28"/>
-          <w:szCs w:val="24"/>
-        </w:rPr>
-      </w:pPr>
-      <w:r>
-        <w:rPr>
-          <w:sz w:val="28"/>
-          <w:szCs w:val="24"/>
-        </w:rPr>
-        <w:t xml:space="preserve">Enter password </w:t>
-      </w:r>
-      <w:r>
-        <w:rPr>
-          <w:sz w:val="28"/>
-          <w:szCs w:val="24"/>
-        </w:rPr>
-        <w:t xml:space="preserve">as </w:t>
-      </w:r>
-      <w:proofErr w:type="spellStart"/>
+    </w:p>
+    <w:p>
+      <w:pPr>
+        <w:pStyle w:val="ListParagraph"/>
+        <w:numPr>
+          <w:ilvl w:val="1"/>
+          <w:numId w:val="1"/>
+        </w:numPr>
+        <w:rPr>
+          <w:sz w:val="28"/>
+          <w:szCs w:val="28"/>
+        </w:rPr>
+      </w:pPr>
+      <w:r>
+        <w:rPr>
+          <w:sz w:val="28"/>
+          <w:szCs w:val="28"/>
+        </w:rPr>
+        <w:t xml:space="preserve">Enter password as </w:t>
+      </w:r>
       <w:r>
         <w:rPr>
           <w:rFonts w:ascii="Arial" w:hAnsi="Arial" w:cs="Arial"/>
           <w:color w:val="FFFFFF"/>
-          <w:sz w:val="21"/>
-          <w:szCs w:val="21"/>
+          <w:sz w:val="28"/>
+          <w:szCs w:val="28"/>
           <w:shd w:val="clear" w:color="auto" w:fill="132322"/>
         </w:rPr>
         <w:t>secret_sauce</w:t>
       </w:r>
-      <w:proofErr w:type="spellEnd"/>
-    </w:p>
-    <w:p>
-      <w:pPr>
-        <w:pStyle w:val="ListParagraph"/>
-        <w:numPr>
-          <w:ilvl w:val="1"/>
-          <w:numId w:val="1"/>
-        </w:numPr>
-        <w:rPr>
-          <w:sz w:val="28"/>
-          <w:szCs w:val="24"/>
-        </w:rPr>
-      </w:pPr>
-      <w:r>
-        <w:rPr>
-          <w:sz w:val="28"/>
-          <w:szCs w:val="24"/>
+    </w:p>
+    <w:p>
+      <w:pPr>
+        <w:pStyle w:val="ListParagraph"/>
+        <w:numPr>
+          <w:ilvl w:val="1"/>
+          <w:numId w:val="1"/>
+        </w:numPr>
+        <w:rPr>
+          <w:sz w:val="28"/>
+          <w:szCs w:val="28"/>
+        </w:rPr>
+      </w:pPr>
+      <w:r>
+        <w:rPr>
+          <w:sz w:val="28"/>
+          <w:szCs w:val="28"/>
         </w:rPr>
         <w:t>Click on Login button</w:t>
       </w:r>
@@ -1703,20 +1616,20 @@
         </w:numPr>
         <w:rPr>
           <w:sz w:val="28"/>
-          <w:szCs w:val="24"/>
-        </w:rPr>
-      </w:pPr>
-      <w:r>
-        <w:rPr>
-          <w:sz w:val="28"/>
-          <w:szCs w:val="24"/>
+          <w:szCs w:val="28"/>
+        </w:rPr>
+      </w:pPr>
+      <w:r>
+        <w:rPr>
+          <w:sz w:val="28"/>
+          <w:szCs w:val="28"/>
         </w:rPr>
         <w:t>Check whether the login is successful or not and display the message as test case pass or fail</w:t>
       </w:r>
       <w:r>
         <w:rPr>
           <w:sz w:val="28"/>
-          <w:szCs w:val="24"/>
+          <w:szCs w:val="28"/>
         </w:rPr>
         <w:br/>
       </w:r>
@@ -1725,7 +1638,7 @@
           <w:b/>
           <w:bCs/>
           <w:sz w:val="28"/>
-          <w:szCs w:val="24"/>
+          <w:szCs w:val="28"/>
         </w:rPr>
         <w:t>Use Relative XPath</w:t>
       </w:r>
@@ -1739,13 +1652,13 @@
         </w:numPr>
         <w:rPr>
           <w:sz w:val="28"/>
-          <w:szCs w:val="24"/>
-        </w:rPr>
-      </w:pPr>
-      <w:r>
-        <w:rPr>
-          <w:sz w:val="28"/>
-          <w:szCs w:val="24"/>
+          <w:szCs w:val="28"/>
+        </w:rPr>
+      </w:pPr>
+      <w:r>
+        <w:rPr>
+          <w:sz w:val="28"/>
+          <w:szCs w:val="28"/>
         </w:rPr>
         <w:t xml:space="preserve">Open </w:t>
       </w:r>
@@ -1754,7 +1667,7 @@
           <w:rPr>
             <w:rStyle w:val="Hyperlink"/>
             <w:sz w:val="28"/>
-            <w:szCs w:val="24"/>
+            <w:szCs w:val="28"/>
           </w:rPr>
           <w:t>https://register.rediff.com/register/register.php?FormName=user_details</w:t>
         </w:r>
@@ -1769,13 +1682,13 @@
         </w:numPr>
         <w:rPr>
           <w:sz w:val="28"/>
-          <w:szCs w:val="24"/>
-        </w:rPr>
-      </w:pPr>
-      <w:r>
-        <w:rPr>
-          <w:sz w:val="28"/>
-          <w:szCs w:val="24"/>
+          <w:szCs w:val="28"/>
+        </w:rPr>
+      </w:pPr>
+      <w:r>
+        <w:rPr>
+          <w:sz w:val="28"/>
+          <w:szCs w:val="28"/>
         </w:rPr>
         <w:t>Enter full Name</w:t>
       </w:r>
@@ -1789,49 +1702,33 @@
         </w:numPr>
         <w:rPr>
           <w:sz w:val="28"/>
-          <w:szCs w:val="24"/>
-        </w:rPr>
-      </w:pPr>
-      <w:r>
-        <w:rPr>
-          <w:sz w:val="28"/>
-          <w:szCs w:val="24"/>
-        </w:rPr>
-        <w:t xml:space="preserve">Enter </w:t>
-      </w:r>
-      <w:proofErr w:type="spellStart"/>
-      <w:r>
-        <w:rPr>
-          <w:sz w:val="28"/>
-          <w:szCs w:val="24"/>
-        </w:rPr>
-        <w:t>rediff</w:t>
-      </w:r>
-      <w:proofErr w:type="spellEnd"/>
-      <w:r>
-        <w:rPr>
-          <w:sz w:val="28"/>
-          <w:szCs w:val="24"/>
-        </w:rPr>
-        <w:t xml:space="preserve"> id</w:t>
-      </w:r>
-    </w:p>
-    <w:p>
-      <w:pPr>
-        <w:pStyle w:val="ListParagraph"/>
-        <w:numPr>
-          <w:ilvl w:val="1"/>
-          <w:numId w:val="1"/>
-        </w:numPr>
-        <w:rPr>
-          <w:sz w:val="28"/>
-          <w:szCs w:val="24"/>
-        </w:rPr>
-      </w:pPr>
-      <w:r>
-        <w:rPr>
-          <w:sz w:val="28"/>
-          <w:szCs w:val="24"/>
+          <w:szCs w:val="28"/>
+        </w:rPr>
+      </w:pPr>
+      <w:r>
+        <w:rPr>
+          <w:sz w:val="28"/>
+          <w:szCs w:val="28"/>
+        </w:rPr>
+        <w:t>Enter rediff id</w:t>
+      </w:r>
+    </w:p>
+    <w:p>
+      <w:pPr>
+        <w:pStyle w:val="ListParagraph"/>
+        <w:numPr>
+          <w:ilvl w:val="1"/>
+          <w:numId w:val="1"/>
+        </w:numPr>
+        <w:rPr>
+          <w:sz w:val="28"/>
+          <w:szCs w:val="28"/>
+        </w:rPr>
+      </w:pPr>
+      <w:r>
+        <w:rPr>
+          <w:sz w:val="28"/>
+          <w:szCs w:val="28"/>
         </w:rPr>
         <w:t>Enter password</w:t>
       </w:r>
@@ -1845,20 +1742,20 @@
         </w:numPr>
         <w:rPr>
           <w:sz w:val="28"/>
-          <w:szCs w:val="24"/>
-        </w:rPr>
-      </w:pPr>
-      <w:r>
-        <w:rPr>
-          <w:sz w:val="28"/>
-          <w:szCs w:val="24"/>
+          <w:szCs w:val="28"/>
+        </w:rPr>
+      </w:pPr>
+      <w:r>
+        <w:rPr>
+          <w:sz w:val="28"/>
+          <w:szCs w:val="28"/>
         </w:rPr>
         <w:t>Enter retype password</w:t>
       </w:r>
       <w:r>
         <w:rPr>
           <w:sz w:val="28"/>
-          <w:szCs w:val="24"/>
+          <w:szCs w:val="28"/>
         </w:rPr>
         <w:br/>
       </w:r>
@@ -1867,7 +1764,7 @@
           <w:b/>
           <w:bCs/>
           <w:sz w:val="28"/>
-          <w:szCs w:val="24"/>
+          <w:szCs w:val="28"/>
         </w:rPr>
         <w:t>Use Relate XPath</w:t>
       </w:r>
@@ -1876,7 +1773,7 @@
           <w:b/>
           <w:bCs/>
           <w:sz w:val="28"/>
-          <w:szCs w:val="24"/>
+          <w:szCs w:val="28"/>
         </w:rPr>
         <w:t xml:space="preserve"> </w:t>
       </w:r>
@@ -1885,21 +1782,21 @@
       <w:pPr>
         <w:rPr>
           <w:sz w:val="28"/>
-          <w:szCs w:val="24"/>
-        </w:rPr>
-      </w:pPr>
-    </w:p>
-    <w:p>
-      <w:pPr>
-        <w:rPr>
-          <w:sz w:val="28"/>
-          <w:szCs w:val="24"/>
-        </w:rPr>
-      </w:pPr>
-      <w:r>
-        <w:rPr>
-          <w:sz w:val="28"/>
-          <w:szCs w:val="24"/>
+          <w:szCs w:val="28"/>
+        </w:rPr>
+      </w:pPr>
+    </w:p>
+    <w:p>
+      <w:pPr>
+        <w:rPr>
+          <w:sz w:val="28"/>
+          <w:szCs w:val="28"/>
+        </w:rPr>
+      </w:pPr>
+      <w:r>
+        <w:rPr>
+          <w:sz w:val="28"/>
+          <w:szCs w:val="28"/>
         </w:rPr>
         <w:t>Date: 27 Oct. 26</w:t>
       </w:r>
@@ -1908,7 +1805,7 @@
       <w:pPr>
         <w:rPr>
           <w:sz w:val="28"/>
-          <w:szCs w:val="24"/>
+          <w:szCs w:val="28"/>
         </w:rPr>
       </w:pPr>
     </w:p>
@@ -1921,13 +1818,13 @@
         </w:numPr>
         <w:rPr>
           <w:sz w:val="28"/>
-          <w:szCs w:val="24"/>
-        </w:rPr>
-      </w:pPr>
-      <w:r>
-        <w:rPr>
-          <w:sz w:val="28"/>
-          <w:szCs w:val="24"/>
+          <w:szCs w:val="28"/>
+        </w:rPr>
+      </w:pPr>
+      <w:r>
+        <w:rPr>
+          <w:sz w:val="28"/>
+          <w:szCs w:val="28"/>
         </w:rPr>
         <w:t xml:space="preserve">Open </w:t>
       </w:r>
@@ -1936,7 +1833,7 @@
           <w:rPr>
             <w:rStyle w:val="Hyperlink"/>
             <w:sz w:val="28"/>
-            <w:szCs w:val="24"/>
+            <w:szCs w:val="28"/>
           </w:rPr>
           <w:t>https://echoecho.com/htmlforms09.htm</w:t>
         </w:r>
@@ -1951,13 +1848,13 @@
         </w:numPr>
         <w:rPr>
           <w:sz w:val="28"/>
-          <w:szCs w:val="24"/>
-        </w:rPr>
-      </w:pPr>
-      <w:r>
-        <w:rPr>
-          <w:sz w:val="28"/>
-          <w:szCs w:val="24"/>
+          <w:szCs w:val="28"/>
+        </w:rPr>
+      </w:pPr>
+      <w:r>
+        <w:rPr>
+          <w:sz w:val="28"/>
+          <w:szCs w:val="28"/>
         </w:rPr>
         <w:t>Display the status of all 3 check boxes (Visible, Enable, Selected)</w:t>
       </w:r>
@@ -1971,13 +1868,13 @@
         </w:numPr>
         <w:rPr>
           <w:sz w:val="28"/>
-          <w:szCs w:val="24"/>
-        </w:rPr>
-      </w:pPr>
-      <w:r>
-        <w:rPr>
-          <w:sz w:val="28"/>
-          <w:szCs w:val="24"/>
+          <w:szCs w:val="28"/>
+        </w:rPr>
+      </w:pPr>
+      <w:r>
+        <w:rPr>
+          <w:sz w:val="28"/>
+          <w:szCs w:val="28"/>
         </w:rPr>
         <w:t>Select only unselected checkboxes</w:t>
       </w:r>
@@ -1991,13 +1888,13 @@
         </w:numPr>
         <w:rPr>
           <w:sz w:val="28"/>
-          <w:szCs w:val="24"/>
-        </w:rPr>
-      </w:pPr>
-      <w:r>
-        <w:rPr>
-          <w:sz w:val="28"/>
-          <w:szCs w:val="24"/>
+          <w:szCs w:val="28"/>
+        </w:rPr>
+      </w:pPr>
+      <w:r>
+        <w:rPr>
+          <w:sz w:val="28"/>
+          <w:szCs w:val="28"/>
         </w:rPr>
         <w:t xml:space="preserve">Display the status </w:t>
       </w:r>
@@ -2011,14 +1908,14 @@
         </w:numPr>
         <w:rPr>
           <w:sz w:val="28"/>
-          <w:szCs w:val="24"/>
-          <w:highlight w:val="yellow"/>
-        </w:rPr>
-      </w:pPr>
-      <w:r>
-        <w:rPr>
-          <w:sz w:val="28"/>
-          <w:szCs w:val="24"/>
+          <w:szCs w:val="28"/>
+          <w:highlight w:val="yellow"/>
+        </w:rPr>
+      </w:pPr>
+      <w:r>
+        <w:rPr>
+          <w:sz w:val="28"/>
+          <w:szCs w:val="28"/>
           <w:highlight w:val="yellow"/>
         </w:rPr>
         <w:t xml:space="preserve">Open </w:t>
@@ -2028,7 +1925,7 @@
           <w:rPr>
             <w:rStyle w:val="Hyperlink"/>
             <w:sz w:val="28"/>
-            <w:szCs w:val="24"/>
+            <w:szCs w:val="28"/>
             <w:highlight w:val="yellow"/>
           </w:rPr>
           <w:t>https://opensource-demo.orangehrmlive.com/web/index.php/auth/login</w:t>
@@ -2044,14 +1941,14 @@
         </w:numPr>
         <w:rPr>
           <w:sz w:val="28"/>
-          <w:szCs w:val="24"/>
-          <w:highlight w:val="yellow"/>
-        </w:rPr>
-      </w:pPr>
-      <w:r>
-        <w:rPr>
-          <w:sz w:val="28"/>
-          <w:szCs w:val="24"/>
+          <w:szCs w:val="28"/>
+          <w:highlight w:val="yellow"/>
+        </w:rPr>
+      </w:pPr>
+      <w:r>
+        <w:rPr>
+          <w:sz w:val="28"/>
+          <w:szCs w:val="28"/>
           <w:highlight w:val="yellow"/>
         </w:rPr>
         <w:t>Enter user name as admin</w:t>
@@ -2066,14 +1963,14 @@
         </w:numPr>
         <w:rPr>
           <w:sz w:val="28"/>
-          <w:szCs w:val="24"/>
-          <w:highlight w:val="yellow"/>
-        </w:rPr>
-      </w:pPr>
-      <w:r>
-        <w:rPr>
-          <w:sz w:val="28"/>
-          <w:szCs w:val="24"/>
+          <w:szCs w:val="28"/>
+          <w:highlight w:val="yellow"/>
+        </w:rPr>
+      </w:pPr>
+      <w:r>
+        <w:rPr>
+          <w:sz w:val="28"/>
+          <w:szCs w:val="28"/>
           <w:highlight w:val="yellow"/>
         </w:rPr>
         <w:t>Enter password as admin123</w:t>
@@ -2088,14 +1985,14 @@
         </w:numPr>
         <w:rPr>
           <w:sz w:val="28"/>
-          <w:szCs w:val="24"/>
-          <w:highlight w:val="yellow"/>
-        </w:rPr>
-      </w:pPr>
-      <w:r>
-        <w:rPr>
-          <w:sz w:val="28"/>
-          <w:szCs w:val="24"/>
+          <w:szCs w:val="28"/>
+          <w:highlight w:val="yellow"/>
+        </w:rPr>
+      </w:pPr>
+      <w:r>
+        <w:rPr>
+          <w:sz w:val="28"/>
+          <w:szCs w:val="28"/>
           <w:highlight w:val="yellow"/>
         </w:rPr>
         <w:t>Click on Login button</w:t>
@@ -2110,14 +2007,14 @@
         </w:numPr>
         <w:rPr>
           <w:sz w:val="28"/>
-          <w:szCs w:val="24"/>
-          <w:highlight w:val="yellow"/>
-        </w:rPr>
-      </w:pPr>
-      <w:r>
-        <w:rPr>
-          <w:sz w:val="28"/>
-          <w:szCs w:val="24"/>
+          <w:szCs w:val="28"/>
+          <w:highlight w:val="yellow"/>
+        </w:rPr>
+      </w:pPr>
+      <w:r>
+        <w:rPr>
+          <w:sz w:val="28"/>
+          <w:szCs w:val="28"/>
           <w:highlight w:val="yellow"/>
         </w:rPr>
         <w:lastRenderedPageBreak/>
@@ -2133,14 +2030,14 @@
         </w:numPr>
         <w:rPr>
           <w:sz w:val="28"/>
-          <w:szCs w:val="24"/>
-          <w:highlight w:val="yellow"/>
-        </w:rPr>
-      </w:pPr>
-      <w:r>
-        <w:rPr>
-          <w:sz w:val="28"/>
-          <w:szCs w:val="24"/>
+          <w:szCs w:val="28"/>
+          <w:highlight w:val="yellow"/>
+        </w:rPr>
+      </w:pPr>
+      <w:r>
+        <w:rPr>
+          <w:sz w:val="28"/>
+          <w:szCs w:val="28"/>
           <w:highlight w:val="yellow"/>
         </w:rPr>
         <w:t>Click on Logout link</w:t>
@@ -2150,22 +2047,22 @@
       <w:pPr>
         <w:rPr>
           <w:sz w:val="28"/>
-          <w:szCs w:val="24"/>
-          <w:highlight w:val="yellow"/>
-        </w:rPr>
-      </w:pPr>
-    </w:p>
-    <w:p>
-      <w:pPr>
-        <w:rPr>
-          <w:sz w:val="28"/>
-          <w:szCs w:val="24"/>
-        </w:rPr>
-      </w:pPr>
-      <w:r>
-        <w:rPr>
-          <w:sz w:val="28"/>
-          <w:szCs w:val="24"/>
+          <w:szCs w:val="28"/>
+          <w:highlight w:val="yellow"/>
+        </w:rPr>
+      </w:pPr>
+    </w:p>
+    <w:p>
+      <w:pPr>
+        <w:rPr>
+          <w:sz w:val="28"/>
+          <w:szCs w:val="28"/>
+        </w:rPr>
+      </w:pPr>
+      <w:r>
+        <w:rPr>
+          <w:sz w:val="28"/>
+          <w:szCs w:val="28"/>
         </w:rPr>
         <w:t>Date: 28 Oct. 26</w:t>
       </w:r>
@@ -2174,7 +2071,7 @@
       <w:pPr>
         <w:rPr>
           <w:sz w:val="28"/>
-          <w:szCs w:val="24"/>
+          <w:szCs w:val="28"/>
           <w:highlight w:val="yellow"/>
         </w:rPr>
       </w:pPr>
@@ -2188,13 +2085,13 @@
         </w:numPr>
         <w:rPr>
           <w:sz w:val="28"/>
-          <w:szCs w:val="24"/>
-        </w:rPr>
-      </w:pPr>
-      <w:r>
-        <w:rPr>
-          <w:sz w:val="28"/>
-          <w:szCs w:val="24"/>
+          <w:szCs w:val="28"/>
+        </w:rPr>
+      </w:pPr>
+      <w:r>
+        <w:rPr>
+          <w:sz w:val="28"/>
+          <w:szCs w:val="28"/>
         </w:rPr>
         <w:t xml:space="preserve">Open </w:t>
       </w:r>
@@ -2203,7 +2100,7 @@
           <w:rPr>
             <w:rStyle w:val="Hyperlink"/>
             <w:sz w:val="28"/>
-            <w:szCs w:val="24"/>
+            <w:szCs w:val="28"/>
           </w:rPr>
           <w:t>https://register.rediff.com/register/register.php?FormName=user_details</w:t>
         </w:r>
@@ -2218,13 +2115,13 @@
         </w:numPr>
         <w:rPr>
           <w:sz w:val="28"/>
-          <w:szCs w:val="24"/>
-        </w:rPr>
-      </w:pPr>
-      <w:r>
-        <w:rPr>
-          <w:sz w:val="28"/>
-          <w:szCs w:val="24"/>
+          <w:szCs w:val="28"/>
+        </w:rPr>
+      </w:pPr>
+      <w:r>
+        <w:rPr>
+          <w:sz w:val="28"/>
+          <w:szCs w:val="28"/>
         </w:rPr>
         <w:t>Select your birthdate</w:t>
       </w:r>
@@ -2238,13 +2135,13 @@
         </w:numPr>
         <w:rPr>
           <w:sz w:val="28"/>
-          <w:szCs w:val="24"/>
-        </w:rPr>
-      </w:pPr>
-      <w:r>
-        <w:rPr>
-          <w:sz w:val="28"/>
-          <w:szCs w:val="24"/>
+          <w:szCs w:val="28"/>
+        </w:rPr>
+      </w:pPr>
+      <w:r>
+        <w:rPr>
+          <w:sz w:val="28"/>
+          <w:szCs w:val="28"/>
         </w:rPr>
         <w:t xml:space="preserve">Display you birthdate in following format </w:t>
       </w:r>
@@ -2253,14 +2150,14 @@
           <w:b/>
           <w:bCs/>
           <w:sz w:val="28"/>
-          <w:szCs w:val="24"/>
+          <w:szCs w:val="28"/>
         </w:rPr>
         <w:t>only</w:t>
       </w:r>
       <w:r>
         <w:rPr>
           <w:sz w:val="28"/>
-          <w:szCs w:val="24"/>
+          <w:szCs w:val="28"/>
         </w:rPr>
         <w:br/>
         <w:t>My birthdate is 29 JAN 1979</w:t>
@@ -2275,13 +2172,13 @@
         </w:numPr>
         <w:rPr>
           <w:sz w:val="28"/>
-          <w:szCs w:val="24"/>
-        </w:rPr>
-      </w:pPr>
-      <w:r>
-        <w:rPr>
-          <w:sz w:val="28"/>
-          <w:szCs w:val="24"/>
+          <w:szCs w:val="28"/>
+        </w:rPr>
+      </w:pPr>
+      <w:r>
+        <w:rPr>
+          <w:sz w:val="28"/>
+          <w:szCs w:val="28"/>
         </w:rPr>
         <w:t>What is difference between findElement() &amp; findElements()</w:t>
       </w:r>
@@ -2295,13 +2192,13 @@
         </w:numPr>
         <w:rPr>
           <w:sz w:val="28"/>
-          <w:szCs w:val="24"/>
-        </w:rPr>
-      </w:pPr>
-      <w:r>
-        <w:rPr>
-          <w:sz w:val="28"/>
-          <w:szCs w:val="24"/>
+          <w:szCs w:val="28"/>
+        </w:rPr>
+      </w:pPr>
+      <w:r>
+        <w:rPr>
+          <w:sz w:val="28"/>
+          <w:szCs w:val="28"/>
         </w:rPr>
         <w:t xml:space="preserve">Open </w:t>
       </w:r>
@@ -2310,7 +2207,7 @@
           <w:rPr>
             <w:rStyle w:val="Hyperlink"/>
             <w:sz w:val="28"/>
-            <w:szCs w:val="24"/>
+            <w:szCs w:val="28"/>
           </w:rPr>
           <w:t>https://www.google.com</w:t>
         </w:r>
@@ -2325,13 +2222,13 @@
         </w:numPr>
         <w:rPr>
           <w:sz w:val="28"/>
-          <w:szCs w:val="24"/>
-        </w:rPr>
-      </w:pPr>
-      <w:r>
-        <w:rPr>
-          <w:sz w:val="28"/>
-          <w:szCs w:val="24"/>
+          <w:szCs w:val="28"/>
+        </w:rPr>
+      </w:pPr>
+      <w:r>
+        <w:rPr>
+          <w:sz w:val="28"/>
+          <w:szCs w:val="28"/>
         </w:rPr>
         <w:t xml:space="preserve">Display list of all the links on the page </w:t>
       </w:r>
@@ -2345,36 +2242,20 @@
         </w:numPr>
         <w:rPr>
           <w:sz w:val="28"/>
-          <w:szCs w:val="24"/>
-        </w:rPr>
-      </w:pPr>
-      <w:r>
-        <w:rPr>
-          <w:sz w:val="28"/>
-          <w:szCs w:val="24"/>
-        </w:rPr>
-        <w:t xml:space="preserve">Display the </w:t>
-      </w:r>
-      <w:proofErr w:type="spellStart"/>
-      <w:r>
-        <w:rPr>
-          <w:sz w:val="28"/>
-          <w:szCs w:val="24"/>
-        </w:rPr>
-        <w:t>href</w:t>
-      </w:r>
-      <w:proofErr w:type="spellEnd"/>
-      <w:r>
-        <w:rPr>
-          <w:sz w:val="28"/>
-          <w:szCs w:val="24"/>
-        </w:rPr>
-        <w:t xml:space="preserve"> attribute as well in following format (getAttribute()) </w:t>
-      </w:r>
-      <w:r>
-        <w:rPr>
-          <w:sz w:val="28"/>
-          <w:szCs w:val="24"/>
+          <w:szCs w:val="28"/>
+        </w:rPr>
+      </w:pPr>
+      <w:r>
+        <w:rPr>
+          <w:sz w:val="28"/>
+          <w:szCs w:val="28"/>
+        </w:rPr>
+        <w:t xml:space="preserve">Display the href attribute as well in following format (getAttribute()) </w:t>
+      </w:r>
+      <w:r>
+        <w:rPr>
+          <w:sz w:val="28"/>
+          <w:szCs w:val="28"/>
         </w:rPr>
         <w:br/>
         <w:t xml:space="preserve">About = </w:t>
@@ -2384,7 +2265,7 @@
           <w:rPr>
             <w:rStyle w:val="Hyperlink"/>
             <w:sz w:val="28"/>
-            <w:szCs w:val="24"/>
+            <w:szCs w:val="28"/>
           </w:rPr>
           <w:t>https://about.google/</w:t>
         </w:r>
@@ -2399,20 +2280,20 @@
         </w:numPr>
         <w:rPr>
           <w:sz w:val="28"/>
-          <w:szCs w:val="24"/>
-        </w:rPr>
-      </w:pPr>
-      <w:r>
-        <w:rPr>
-          <w:sz w:val="28"/>
-          <w:szCs w:val="24"/>
+          <w:szCs w:val="28"/>
+        </w:rPr>
+      </w:pPr>
+      <w:r>
+        <w:rPr>
+          <w:sz w:val="28"/>
+          <w:szCs w:val="28"/>
         </w:rPr>
         <w:t>Complete assignment no 16 using ExplicitWait</w:t>
       </w:r>
       <w:r>
         <w:rPr>
           <w:sz w:val="28"/>
-          <w:szCs w:val="24"/>
+          <w:szCs w:val="28"/>
         </w:rPr>
         <w:t xml:space="preserve"> (use visibliltyOfElementLocated method)</w:t>
       </w:r>
@@ -2426,13 +2307,13 @@
         </w:numPr>
         <w:rPr>
           <w:sz w:val="28"/>
-          <w:szCs w:val="24"/>
-        </w:rPr>
-      </w:pPr>
-      <w:r>
-        <w:rPr>
-          <w:sz w:val="28"/>
-          <w:szCs w:val="24"/>
+          <w:szCs w:val="28"/>
+        </w:rPr>
+      </w:pPr>
+      <w:r>
+        <w:rPr>
+          <w:sz w:val="28"/>
+          <w:szCs w:val="28"/>
         </w:rPr>
         <w:t>Complete assignment no 16 using FluentWait (use visibliltyOfElementLocated method)</w:t>
       </w:r>
@@ -2446,13 +2327,13 @@
         </w:numPr>
         <w:rPr>
           <w:sz w:val="28"/>
-          <w:szCs w:val="24"/>
-        </w:rPr>
-      </w:pPr>
-      <w:r>
-        <w:rPr>
-          <w:sz w:val="28"/>
-          <w:szCs w:val="24"/>
+          <w:szCs w:val="28"/>
+        </w:rPr>
+      </w:pPr>
+      <w:r>
+        <w:rPr>
+          <w:sz w:val="28"/>
+          <w:szCs w:val="28"/>
         </w:rPr>
         <w:t xml:space="preserve">Open </w:t>
       </w:r>
@@ -2461,7 +2342,7 @@
           <w:rPr>
             <w:rStyle w:val="Hyperlink"/>
             <w:sz w:val="28"/>
-            <w:szCs w:val="24"/>
+            <w:szCs w:val="28"/>
           </w:rPr>
           <w:t>https://testautomationpractice.blogspot.com/?m=1</w:t>
         </w:r>
@@ -2476,20 +2357,20 @@
         </w:numPr>
         <w:rPr>
           <w:sz w:val="28"/>
-          <w:szCs w:val="24"/>
-        </w:rPr>
-      </w:pPr>
-      <w:r>
-        <w:rPr>
-          <w:sz w:val="28"/>
-          <w:szCs w:val="24"/>
+          <w:szCs w:val="28"/>
+        </w:rPr>
+      </w:pPr>
+      <w:r>
+        <w:rPr>
+          <w:sz w:val="28"/>
+          <w:szCs w:val="28"/>
         </w:rPr>
         <w:t>From the 1</w:t>
       </w:r>
       <w:r>
         <w:rPr>
           <w:sz w:val="28"/>
-          <w:szCs w:val="24"/>
+          <w:szCs w:val="28"/>
           <w:vertAlign w:val="superscript"/>
         </w:rPr>
         <w:t>st</w:t>
@@ -2497,7 +2378,7 @@
       <w:r>
         <w:rPr>
           <w:sz w:val="28"/>
-          <w:szCs w:val="24"/>
+          <w:szCs w:val="28"/>
         </w:rPr>
         <w:t xml:space="preserve"> table calculate addition of all the prices </w:t>
       </w:r>
@@ -2641,18 +2522,961 @@
     </w:p>
     <w:p>
       <w:pPr>
+        <w:spacing w:line="252" w:lineRule="auto"/>
+        <w:rPr>
+          <w:sz w:val="28"/>
+          <w:szCs w:val="28"/>
+          <w:lang w:val="en-US"/>
+        </w:rPr>
+      </w:pPr>
+    </w:p>
+    <w:p>
+      <w:pPr>
+        <w:spacing w:line="252" w:lineRule="auto"/>
+        <w:rPr>
+          <w:sz w:val="28"/>
+          <w:szCs w:val="28"/>
+          <w:lang w:val="en-US"/>
+        </w:rPr>
+      </w:pPr>
+      <w:r>
+        <w:rPr>
+          <w:sz w:val="28"/>
+          <w:szCs w:val="28"/>
+          <w:lang w:val="en-US"/>
+        </w:rPr>
+        <w:t>Date: 30 October 2026</w:t>
+      </w:r>
+    </w:p>
+    <w:p>
+      <w:pPr>
+        <w:spacing w:line="252" w:lineRule="auto"/>
+        <w:rPr>
+          <w:sz w:val="28"/>
+          <w:szCs w:val="28"/>
+          <w:lang w:val="en-US"/>
+        </w:rPr>
+      </w:pPr>
+    </w:p>
+    <w:p>
+      <w:pPr>
         <w:pStyle w:val="ListParagraph"/>
         <w:numPr>
           <w:ilvl w:val="0"/>
           <w:numId w:val="1"/>
         </w:numPr>
-        <w:rPr>
-          <w:sz w:val="28"/>
-          <w:szCs w:val="24"/>
-        </w:rPr>
-      </w:pPr>
+        <w:spacing w:line="252" w:lineRule="auto"/>
+        <w:rPr>
+          <w:sz w:val="28"/>
+          <w:szCs w:val="28"/>
+          <w:lang w:val="en-US"/>
+        </w:rPr>
+      </w:pPr>
+      <w:r>
+        <w:rPr>
+          <w:sz w:val="28"/>
+          <w:szCs w:val="28"/>
+          <w:lang w:val="en-US"/>
+        </w:rPr>
+        <w:t xml:space="preserve">Open </w:t>
+      </w:r>
+      <w:hyperlink r:id="rId25" w:history="1">
+        <w:r>
+          <w:rPr>
+            <w:rStyle w:val="Hyperlink"/>
+            <w:sz w:val="28"/>
+            <w:szCs w:val="28"/>
+          </w:rPr>
+          <w:t>https://money.rediff.com/gainers/bse/daily/groupa?src=gain_lose</w:t>
+        </w:r>
+      </w:hyperlink>
+    </w:p>
+    <w:p>
+      <w:pPr>
+        <w:pStyle w:val="ListParagraph"/>
+        <w:numPr>
+          <w:ilvl w:val="1"/>
+          <w:numId w:val="1"/>
+        </w:numPr>
+        <w:spacing w:line="252" w:lineRule="auto"/>
+        <w:rPr>
+          <w:sz w:val="28"/>
+          <w:szCs w:val="28"/>
+          <w:lang w:val="en-US"/>
+        </w:rPr>
+      </w:pPr>
+      <w:r>
+        <w:rPr>
+          <w:sz w:val="28"/>
+          <w:szCs w:val="28"/>
+          <w:lang w:val="en-US"/>
+        </w:rPr>
+        <w:t>Display total no of rows</w:t>
+      </w:r>
+    </w:p>
+    <w:p>
+      <w:pPr>
+        <w:pStyle w:val="ListParagraph"/>
+        <w:numPr>
+          <w:ilvl w:val="1"/>
+          <w:numId w:val="1"/>
+        </w:numPr>
+        <w:spacing w:line="252" w:lineRule="auto"/>
+        <w:rPr>
+          <w:sz w:val="28"/>
+          <w:szCs w:val="28"/>
+          <w:lang w:val="en-US"/>
+        </w:rPr>
+      </w:pPr>
+      <w:r>
+        <w:rPr>
+          <w:sz w:val="28"/>
+          <w:szCs w:val="28"/>
+          <w:lang w:val="en-US"/>
+        </w:rPr>
+        <w:t>Display any row randomly</w:t>
+      </w:r>
+      <w:r>
+        <w:rPr>
+          <w:sz w:val="28"/>
+          <w:szCs w:val="28"/>
+          <w:lang w:val="en-US"/>
+        </w:rPr>
+        <w:t xml:space="preserve"> (Use Random Class from Java)</w:t>
+      </w:r>
+    </w:p>
+    <w:p>
+      <w:pPr>
+        <w:pStyle w:val="ListParagraph"/>
+        <w:numPr>
+          <w:ilvl w:val="1"/>
+          <w:numId w:val="1"/>
+        </w:numPr>
+        <w:spacing w:line="252" w:lineRule="auto"/>
+        <w:rPr>
+          <w:sz w:val="28"/>
+          <w:szCs w:val="28"/>
+          <w:lang w:val="en-US"/>
+        </w:rPr>
+      </w:pPr>
+      <w:r>
+        <w:rPr>
+          <w:sz w:val="28"/>
+          <w:szCs w:val="28"/>
+          <w:lang w:val="en-US"/>
+        </w:rPr>
+        <w:lastRenderedPageBreak/>
+        <w:t>Display list of all the companies (Company name only)</w:t>
+      </w:r>
+    </w:p>
+    <w:p>
+      <w:pPr>
+        <w:pStyle w:val="ListParagraph"/>
+        <w:numPr>
+          <w:ilvl w:val="1"/>
+          <w:numId w:val="1"/>
+        </w:numPr>
+        <w:spacing w:line="256" w:lineRule="auto"/>
+        <w:rPr>
+          <w:sz w:val="28"/>
+          <w:szCs w:val="28"/>
+          <w:lang w:val="en-US"/>
+        </w:rPr>
+      </w:pPr>
+      <w:r>
+        <w:rPr>
+          <w:sz w:val="28"/>
+          <w:szCs w:val="28"/>
+          <w:lang w:val="en-US"/>
+        </w:rPr>
+        <w:t>Read all current price and display the highest price.</w:t>
+      </w:r>
+      <w:r>
+        <w:rPr>
+          <w:sz w:val="28"/>
+          <w:szCs w:val="28"/>
+          <w:lang w:val="en-US"/>
+        </w:rPr>
+        <w:br/>
+        <w:t>(Read all the current price, store in array and then sort an array so you will get highest price)</w:t>
+      </w:r>
+    </w:p>
+    <w:p>
+      <w:pPr>
+        <w:pStyle w:val="ListParagraph"/>
+        <w:numPr>
+          <w:ilvl w:val="0"/>
+          <w:numId w:val="1"/>
+        </w:numPr>
+        <w:spacing w:line="252" w:lineRule="auto"/>
+        <w:rPr>
+          <w:sz w:val="28"/>
+          <w:szCs w:val="28"/>
+          <w:highlight w:val="yellow"/>
+          <w:lang w:val="en-US"/>
+        </w:rPr>
+      </w:pPr>
+      <w:r>
+        <w:rPr>
+          <w:sz w:val="28"/>
+          <w:szCs w:val="28"/>
+          <w:highlight w:val="yellow"/>
+          <w:lang w:val="en-US"/>
+        </w:rPr>
+        <w:t xml:space="preserve">Open </w:t>
+      </w:r>
+      <w:hyperlink r:id="rId26" w:history="1">
+        <w:r>
+          <w:rPr>
+            <w:rStyle w:val="Hyperlink"/>
+            <w:sz w:val="28"/>
+            <w:szCs w:val="28"/>
+            <w:highlight w:val="yellow"/>
+            <w:lang w:val="en-US"/>
+          </w:rPr>
+          <w:t>https://opensource-demo.orangehrmlive.com/web/index.php/auth/login</w:t>
+        </w:r>
+      </w:hyperlink>
+    </w:p>
+    <w:p>
+      <w:pPr>
+        <w:pStyle w:val="ListParagraph"/>
+        <w:numPr>
+          <w:ilvl w:val="1"/>
+          <w:numId w:val="1"/>
+        </w:numPr>
+        <w:spacing w:line="252" w:lineRule="auto"/>
+        <w:rPr>
+          <w:sz w:val="28"/>
+          <w:szCs w:val="28"/>
+          <w:highlight w:val="yellow"/>
+          <w:lang w:val="en-US"/>
+        </w:rPr>
+      </w:pPr>
+      <w:r>
+        <w:rPr>
+          <w:sz w:val="28"/>
+          <w:szCs w:val="28"/>
+          <w:highlight w:val="yellow"/>
+          <w:lang w:val="en-US"/>
+        </w:rPr>
+        <w:t>Login with Admin (admin, admin123)</w:t>
+      </w:r>
+    </w:p>
+    <w:p>
+      <w:pPr>
+        <w:pStyle w:val="ListParagraph"/>
+        <w:numPr>
+          <w:ilvl w:val="1"/>
+          <w:numId w:val="1"/>
+        </w:numPr>
+        <w:spacing w:line="252" w:lineRule="auto"/>
+        <w:rPr>
+          <w:sz w:val="28"/>
+          <w:szCs w:val="28"/>
+          <w:highlight w:val="yellow"/>
+          <w:lang w:val="en-US"/>
+        </w:rPr>
+      </w:pPr>
+      <w:r>
+        <w:rPr>
+          <w:sz w:val="28"/>
+          <w:szCs w:val="28"/>
+          <w:highlight w:val="yellow"/>
+          <w:lang w:val="en-US"/>
+        </w:rPr>
+        <w:t>Click on PIM</w:t>
+      </w:r>
+    </w:p>
+    <w:p>
+      <w:pPr>
+        <w:pStyle w:val="ListParagraph"/>
+        <w:numPr>
+          <w:ilvl w:val="1"/>
+          <w:numId w:val="1"/>
+        </w:numPr>
+        <w:spacing w:line="252" w:lineRule="auto"/>
+        <w:rPr>
+          <w:sz w:val="28"/>
+          <w:szCs w:val="28"/>
+          <w:highlight w:val="yellow"/>
+          <w:lang w:val="en-US"/>
+        </w:rPr>
+      </w:pPr>
+      <w:r>
+        <w:rPr>
+          <w:sz w:val="28"/>
+          <w:szCs w:val="28"/>
+          <w:highlight w:val="yellow"/>
+          <w:lang w:val="en-US"/>
+        </w:rPr>
+        <w:t>Click on + Add button</w:t>
+      </w:r>
+    </w:p>
+    <w:p>
+      <w:pPr>
+        <w:pStyle w:val="ListParagraph"/>
+        <w:numPr>
+          <w:ilvl w:val="1"/>
+          <w:numId w:val="1"/>
+        </w:numPr>
+        <w:spacing w:line="252" w:lineRule="auto"/>
+        <w:rPr>
+          <w:sz w:val="28"/>
+          <w:szCs w:val="28"/>
+          <w:highlight w:val="yellow"/>
+          <w:lang w:val="en-US"/>
+        </w:rPr>
+      </w:pPr>
+      <w:r>
+        <w:rPr>
+          <w:sz w:val="28"/>
+          <w:szCs w:val="28"/>
+          <w:highlight w:val="yellow"/>
+          <w:lang w:val="en-US"/>
+        </w:rPr>
+        <w:t>Enter First Name</w:t>
+      </w:r>
+    </w:p>
+    <w:p>
+      <w:pPr>
+        <w:pStyle w:val="ListParagraph"/>
+        <w:numPr>
+          <w:ilvl w:val="1"/>
+          <w:numId w:val="1"/>
+        </w:numPr>
+        <w:spacing w:line="252" w:lineRule="auto"/>
+        <w:rPr>
+          <w:sz w:val="28"/>
+          <w:szCs w:val="28"/>
+          <w:highlight w:val="yellow"/>
+          <w:lang w:val="en-US"/>
+        </w:rPr>
+      </w:pPr>
+      <w:r>
+        <w:rPr>
+          <w:sz w:val="28"/>
+          <w:szCs w:val="28"/>
+          <w:highlight w:val="yellow"/>
+          <w:lang w:val="en-US"/>
+        </w:rPr>
+        <w:t>Enter Middle Name</w:t>
+      </w:r>
+    </w:p>
+    <w:p>
+      <w:pPr>
+        <w:pStyle w:val="ListParagraph"/>
+        <w:numPr>
+          <w:ilvl w:val="1"/>
+          <w:numId w:val="1"/>
+        </w:numPr>
+        <w:spacing w:line="252" w:lineRule="auto"/>
+        <w:rPr>
+          <w:sz w:val="28"/>
+          <w:szCs w:val="28"/>
+          <w:highlight w:val="yellow"/>
+          <w:lang w:val="en-US"/>
+        </w:rPr>
+      </w:pPr>
+      <w:r>
+        <w:rPr>
+          <w:sz w:val="28"/>
+          <w:szCs w:val="28"/>
+          <w:highlight w:val="yellow"/>
+          <w:lang w:val="en-US"/>
+        </w:rPr>
+        <w:t>Enter Last Name</w:t>
+      </w:r>
+    </w:p>
+    <w:p>
+      <w:pPr>
+        <w:pStyle w:val="ListParagraph"/>
+        <w:numPr>
+          <w:ilvl w:val="1"/>
+          <w:numId w:val="1"/>
+        </w:numPr>
+        <w:spacing w:line="252" w:lineRule="auto"/>
+        <w:rPr>
+          <w:sz w:val="28"/>
+          <w:szCs w:val="28"/>
+          <w:highlight w:val="yellow"/>
+          <w:lang w:val="en-US"/>
+        </w:rPr>
+      </w:pPr>
+      <w:r>
+        <w:rPr>
+          <w:sz w:val="28"/>
+          <w:szCs w:val="28"/>
+          <w:highlight w:val="yellow"/>
+          <w:lang w:val="en-US"/>
+        </w:rPr>
+        <w:t>Click on Create Login Details</w:t>
+      </w:r>
+    </w:p>
+    <w:p>
+      <w:pPr>
+        <w:pStyle w:val="ListParagraph"/>
+        <w:numPr>
+          <w:ilvl w:val="1"/>
+          <w:numId w:val="1"/>
+        </w:numPr>
+        <w:spacing w:line="252" w:lineRule="auto"/>
+        <w:rPr>
+          <w:sz w:val="28"/>
+          <w:szCs w:val="28"/>
+          <w:highlight w:val="yellow"/>
+          <w:lang w:val="en-US"/>
+        </w:rPr>
+      </w:pPr>
+      <w:r>
+        <w:rPr>
+          <w:sz w:val="28"/>
+          <w:szCs w:val="28"/>
+          <w:highlight w:val="yellow"/>
+          <w:lang w:val="en-US"/>
+        </w:rPr>
+        <w:t>Enter User Name</w:t>
+      </w:r>
+    </w:p>
+    <w:p>
+      <w:pPr>
+        <w:pStyle w:val="ListParagraph"/>
+        <w:numPr>
+          <w:ilvl w:val="1"/>
+          <w:numId w:val="1"/>
+        </w:numPr>
+        <w:spacing w:line="252" w:lineRule="auto"/>
+        <w:rPr>
+          <w:sz w:val="28"/>
+          <w:szCs w:val="28"/>
+          <w:highlight w:val="yellow"/>
+          <w:lang w:val="en-US"/>
+        </w:rPr>
+      </w:pPr>
+      <w:r>
+        <w:rPr>
+          <w:sz w:val="28"/>
+          <w:szCs w:val="28"/>
+          <w:highlight w:val="yellow"/>
+          <w:lang w:val="en-US"/>
+        </w:rPr>
+        <w:t>Enter Password</w:t>
+      </w:r>
+    </w:p>
+    <w:p>
+      <w:pPr>
+        <w:pStyle w:val="ListParagraph"/>
+        <w:numPr>
+          <w:ilvl w:val="1"/>
+          <w:numId w:val="1"/>
+        </w:numPr>
+        <w:spacing w:line="252" w:lineRule="auto"/>
+        <w:rPr>
+          <w:sz w:val="28"/>
+          <w:szCs w:val="28"/>
+          <w:highlight w:val="yellow"/>
+          <w:lang w:val="en-US"/>
+        </w:rPr>
+      </w:pPr>
+      <w:r>
+        <w:rPr>
+          <w:sz w:val="28"/>
+          <w:szCs w:val="28"/>
+          <w:highlight w:val="yellow"/>
+          <w:lang w:val="en-US"/>
+        </w:rPr>
+        <w:t>Enter Confirm Password</w:t>
+      </w:r>
+    </w:p>
+    <w:p>
+      <w:pPr>
+        <w:pStyle w:val="ListParagraph"/>
+        <w:numPr>
+          <w:ilvl w:val="1"/>
+          <w:numId w:val="1"/>
+        </w:numPr>
+        <w:spacing w:line="252" w:lineRule="auto"/>
+        <w:rPr>
+          <w:sz w:val="28"/>
+          <w:szCs w:val="28"/>
+          <w:highlight w:val="yellow"/>
+          <w:lang w:val="en-US"/>
+        </w:rPr>
+      </w:pPr>
+      <w:r>
+        <w:rPr>
+          <w:sz w:val="28"/>
+          <w:szCs w:val="28"/>
+          <w:highlight w:val="yellow"/>
+          <w:lang w:val="en-US"/>
+        </w:rPr>
+        <w:t>Click on Save Button</w:t>
+      </w:r>
+    </w:p>
+    <w:p>
+      <w:pPr>
+        <w:pStyle w:val="ListParagraph"/>
+        <w:numPr>
+          <w:ilvl w:val="1"/>
+          <w:numId w:val="1"/>
+        </w:numPr>
+        <w:spacing w:line="252" w:lineRule="auto"/>
+        <w:rPr>
+          <w:sz w:val="28"/>
+          <w:szCs w:val="28"/>
+          <w:highlight w:val="yellow"/>
+          <w:lang w:val="en-US"/>
+        </w:rPr>
+      </w:pPr>
+      <w:r>
+        <w:rPr>
+          <w:sz w:val="28"/>
+          <w:szCs w:val="28"/>
+          <w:highlight w:val="yellow"/>
+          <w:lang w:val="en-US"/>
+        </w:rPr>
+        <w:t>Logout</w:t>
+      </w:r>
+    </w:p>
+    <w:p>
+      <w:pPr>
+        <w:pStyle w:val="ListParagraph"/>
+        <w:numPr>
+          <w:ilvl w:val="1"/>
+          <w:numId w:val="1"/>
+        </w:numPr>
+        <w:spacing w:line="252" w:lineRule="auto"/>
+        <w:rPr>
+          <w:sz w:val="28"/>
+          <w:szCs w:val="28"/>
+          <w:highlight w:val="yellow"/>
+          <w:lang w:val="en-US"/>
+        </w:rPr>
+      </w:pPr>
+      <w:r>
+        <w:rPr>
+          <w:sz w:val="28"/>
+          <w:szCs w:val="28"/>
+          <w:highlight w:val="yellow"/>
+          <w:lang w:val="en-US"/>
+        </w:rPr>
+        <w:t>Login using data provided in step no h &amp; i</w:t>
+      </w:r>
+    </w:p>
+    <w:p>
+      <w:pPr>
+        <w:pStyle w:val="ListParagraph"/>
+        <w:numPr>
+          <w:ilvl w:val="1"/>
+          <w:numId w:val="1"/>
+        </w:numPr>
+        <w:spacing w:line="252" w:lineRule="auto"/>
+        <w:rPr>
+          <w:sz w:val="28"/>
+          <w:szCs w:val="28"/>
+          <w:highlight w:val="yellow"/>
+          <w:lang w:val="en-US"/>
+        </w:rPr>
+      </w:pPr>
+      <w:r>
+        <w:rPr>
+          <w:sz w:val="28"/>
+          <w:szCs w:val="28"/>
+          <w:highlight w:val="yellow"/>
+          <w:lang w:val="en-US"/>
+        </w:rPr>
+        <w:t>Display name of employee on logout link</w:t>
+      </w:r>
+    </w:p>
+    <w:p>
+      <w:pPr>
+        <w:pStyle w:val="ListParagraph"/>
+        <w:numPr>
+          <w:ilvl w:val="1"/>
+          <w:numId w:val="1"/>
+        </w:numPr>
+        <w:spacing w:line="252" w:lineRule="auto"/>
+        <w:rPr>
+          <w:sz w:val="28"/>
+          <w:szCs w:val="28"/>
+          <w:highlight w:val="yellow"/>
+          <w:lang w:val="en-US"/>
+        </w:rPr>
+      </w:pPr>
+      <w:r>
+        <w:rPr>
+          <w:sz w:val="28"/>
+          <w:szCs w:val="28"/>
+          <w:highlight w:val="yellow"/>
+          <w:lang w:val="en-US"/>
+        </w:rPr>
+        <w:t>Click on My Info</w:t>
+      </w:r>
+    </w:p>
+    <w:p>
+      <w:pPr>
+        <w:pStyle w:val="ListParagraph"/>
+        <w:numPr>
+          <w:ilvl w:val="1"/>
+          <w:numId w:val="1"/>
+        </w:numPr>
+        <w:spacing w:line="252" w:lineRule="auto"/>
+        <w:rPr>
+          <w:sz w:val="28"/>
+          <w:szCs w:val="28"/>
+          <w:highlight w:val="yellow"/>
+          <w:lang w:val="en-US"/>
+        </w:rPr>
+      </w:pPr>
+      <w:r>
+        <w:rPr>
+          <w:sz w:val="28"/>
+          <w:szCs w:val="28"/>
+          <w:highlight w:val="yellow"/>
+          <w:lang w:val="en-US"/>
+        </w:rPr>
+        <w:t>Display the Employee ID</w:t>
+      </w:r>
+    </w:p>
+    <w:p>
+      <w:pPr>
+        <w:pStyle w:val="ListParagraph"/>
+        <w:numPr>
+          <w:ilvl w:val="1"/>
+          <w:numId w:val="1"/>
+        </w:numPr>
+        <w:spacing w:line="252" w:lineRule="auto"/>
+        <w:rPr>
+          <w:sz w:val="28"/>
+          <w:szCs w:val="28"/>
+          <w:highlight w:val="yellow"/>
+          <w:lang w:val="en-US"/>
+        </w:rPr>
+      </w:pPr>
+      <w:r>
+        <w:rPr>
+          <w:sz w:val="28"/>
+          <w:szCs w:val="28"/>
+          <w:highlight w:val="yellow"/>
+          <w:lang w:val="en-US"/>
+        </w:rPr>
+        <w:t>Logout</w:t>
+      </w:r>
+    </w:p>
+    <w:p>
+      <w:pPr>
+        <w:pStyle w:val="ListParagraph"/>
+        <w:numPr>
+          <w:ilvl w:val="1"/>
+          <w:numId w:val="1"/>
+        </w:numPr>
+        <w:spacing w:line="252" w:lineRule="auto"/>
+        <w:rPr>
+          <w:sz w:val="28"/>
+          <w:szCs w:val="28"/>
+          <w:highlight w:val="yellow"/>
+          <w:lang w:val="en-US"/>
+        </w:rPr>
+      </w:pPr>
+      <w:r>
+        <w:rPr>
+          <w:sz w:val="28"/>
+          <w:szCs w:val="28"/>
+          <w:highlight w:val="yellow"/>
+          <w:lang w:val="en-US"/>
+        </w:rPr>
+        <w:t>Login with admin</w:t>
+      </w:r>
+    </w:p>
+    <w:p>
+      <w:pPr>
+        <w:pStyle w:val="ListParagraph"/>
+        <w:numPr>
+          <w:ilvl w:val="1"/>
+          <w:numId w:val="1"/>
+        </w:numPr>
+        <w:spacing w:line="252" w:lineRule="auto"/>
+        <w:rPr>
+          <w:sz w:val="28"/>
+          <w:szCs w:val="28"/>
+          <w:highlight w:val="yellow"/>
+          <w:lang w:val="en-US"/>
+        </w:rPr>
+      </w:pPr>
+      <w:r>
+        <w:rPr>
+          <w:sz w:val="28"/>
+          <w:szCs w:val="28"/>
+          <w:highlight w:val="yellow"/>
+          <w:lang w:val="en-US"/>
+        </w:rPr>
+        <w:t>Click on Admin</w:t>
+      </w:r>
+    </w:p>
+    <w:p>
+      <w:pPr>
+        <w:pStyle w:val="ListParagraph"/>
+        <w:numPr>
+          <w:ilvl w:val="1"/>
+          <w:numId w:val="1"/>
+        </w:numPr>
+        <w:spacing w:line="252" w:lineRule="auto"/>
+        <w:rPr>
+          <w:sz w:val="28"/>
+          <w:szCs w:val="28"/>
+          <w:highlight w:val="yellow"/>
+          <w:lang w:val="en-US"/>
+        </w:rPr>
+      </w:pPr>
+      <w:r>
+        <w:rPr>
+          <w:sz w:val="28"/>
+          <w:szCs w:val="28"/>
+          <w:highlight w:val="yellow"/>
+          <w:lang w:val="en-US"/>
+        </w:rPr>
+        <w:t>Enter user name</w:t>
+      </w:r>
+    </w:p>
+    <w:p>
+      <w:pPr>
+        <w:pStyle w:val="ListParagraph"/>
+        <w:numPr>
+          <w:ilvl w:val="1"/>
+          <w:numId w:val="1"/>
+        </w:numPr>
+        <w:spacing w:line="252" w:lineRule="auto"/>
+        <w:rPr>
+          <w:sz w:val="28"/>
+          <w:szCs w:val="28"/>
+          <w:highlight w:val="yellow"/>
+          <w:lang w:val="en-US"/>
+        </w:rPr>
+      </w:pPr>
+      <w:r>
+        <w:rPr>
+          <w:sz w:val="28"/>
+          <w:szCs w:val="28"/>
+          <w:highlight w:val="yellow"/>
+          <w:lang w:val="en-US"/>
+        </w:rPr>
+        <w:t xml:space="preserve">Click on Search </w:t>
+      </w:r>
+    </w:p>
+    <w:p>
+      <w:pPr>
+        <w:pStyle w:val="ListParagraph"/>
+        <w:numPr>
+          <w:ilvl w:val="1"/>
+          <w:numId w:val="1"/>
+        </w:numPr>
+        <w:spacing w:line="252" w:lineRule="auto"/>
+        <w:rPr>
+          <w:sz w:val="28"/>
+          <w:szCs w:val="28"/>
+          <w:highlight w:val="yellow"/>
+          <w:lang w:val="en-US"/>
+        </w:rPr>
+      </w:pPr>
+      <w:r>
+        <w:rPr>
+          <w:sz w:val="28"/>
+          <w:szCs w:val="28"/>
+          <w:highlight w:val="yellow"/>
+          <w:lang w:val="en-US"/>
+        </w:rPr>
+        <w:t>Delete the record displayed</w:t>
+      </w:r>
+    </w:p>
+    <w:p>
+      <w:pPr>
+        <w:pStyle w:val="ListParagraph"/>
+        <w:numPr>
+          <w:ilvl w:val="1"/>
+          <w:numId w:val="1"/>
+        </w:numPr>
+        <w:spacing w:line="252" w:lineRule="auto"/>
+        <w:rPr>
+          <w:sz w:val="28"/>
+          <w:szCs w:val="28"/>
+          <w:highlight w:val="yellow"/>
+          <w:lang w:val="en-US"/>
+        </w:rPr>
+      </w:pPr>
+      <w:r>
+        <w:rPr>
+          <w:sz w:val="28"/>
+          <w:szCs w:val="28"/>
+          <w:highlight w:val="yellow"/>
+          <w:lang w:val="en-US"/>
+        </w:rPr>
+        <w:t>Logout</w:t>
+      </w:r>
+    </w:p>
+    <w:p>
+      <w:pPr>
+        <w:pStyle w:val="ListParagraph"/>
+        <w:numPr>
+          <w:ilvl w:val="0"/>
+          <w:numId w:val="1"/>
+        </w:numPr>
+        <w:spacing w:line="252" w:lineRule="auto"/>
+        <w:rPr>
+          <w:sz w:val="28"/>
+          <w:szCs w:val="28"/>
+          <w:lang w:val="en-US"/>
+        </w:rPr>
+      </w:pPr>
+      <w:r>
+        <w:rPr>
+          <w:sz w:val="28"/>
+          <w:szCs w:val="28"/>
+          <w:lang w:val="en-US"/>
+        </w:rPr>
+        <w:t xml:space="preserve">Open </w:t>
+      </w:r>
+      <w:hyperlink r:id="rId27" w:history="1">
+        <w:r>
+          <w:rPr>
+            <w:rStyle w:val="Hyperlink"/>
+            <w:sz w:val="28"/>
+            <w:szCs w:val="28"/>
+            <w:lang w:val="en-US"/>
+          </w:rPr>
+          <w:t>https://www.iplt20.com/points-table</w:t>
+        </w:r>
+      </w:hyperlink>
+      <w:r>
+        <w:rPr>
+          <w:sz w:val="28"/>
+          <w:szCs w:val="28"/>
+          <w:lang w:val="en-US"/>
+        </w:rPr>
+        <w:t xml:space="preserve"> </w:t>
+      </w:r>
       <w:bookmarkStart w:id="0" w:name="_GoBack"/>
       <w:bookmarkEnd w:id="0"/>
+    </w:p>
+    <w:p>
+      <w:pPr>
+        <w:pStyle w:val="ListParagraph"/>
+        <w:numPr>
+          <w:ilvl w:val="1"/>
+          <w:numId w:val="1"/>
+        </w:numPr>
+        <w:spacing w:line="252" w:lineRule="auto"/>
+        <w:rPr>
+          <w:sz w:val="28"/>
+          <w:szCs w:val="28"/>
+          <w:lang w:val="en-US"/>
+        </w:rPr>
+      </w:pPr>
+      <w:r>
+        <w:rPr>
+          <w:sz w:val="28"/>
+          <w:szCs w:val="28"/>
+          <w:lang w:val="en-US"/>
+        </w:rPr>
+        <w:t>Display list of all the Teams</w:t>
+      </w:r>
+    </w:p>
+    <w:p>
+      <w:pPr>
+        <w:pStyle w:val="ListParagraph"/>
+        <w:numPr>
+          <w:ilvl w:val="1"/>
+          <w:numId w:val="1"/>
+        </w:numPr>
+        <w:spacing w:line="252" w:lineRule="auto"/>
+        <w:rPr>
+          <w:sz w:val="28"/>
+          <w:szCs w:val="28"/>
+          <w:lang w:val="en-US"/>
+        </w:rPr>
+      </w:pPr>
+      <w:r>
+        <w:rPr>
+          <w:sz w:val="28"/>
+          <w:szCs w:val="28"/>
+          <w:lang w:val="en-US"/>
+        </w:rPr>
+        <w:t>Display all result of each team about N W L</w:t>
+      </w:r>
+    </w:p>
+    <w:p>
+      <w:pPr>
+        <w:pStyle w:val="ListParagraph"/>
+        <w:rPr>
+          <w:sz w:val="28"/>
+          <w:szCs w:val="28"/>
+          <w:lang w:val="en-US"/>
+        </w:rPr>
+      </w:pPr>
+      <w:r>
+        <w:rPr>
+          <w:sz w:val="28"/>
+          <w:szCs w:val="28"/>
+          <w:lang w:val="en-US"/>
+        </w:rPr>
+        <w:t>Display count of N, W &amp; L</w:t>
+      </w:r>
+      <w:r>
+        <w:rPr>
+          <w:sz w:val="28"/>
+          <w:szCs w:val="28"/>
+          <w:lang w:val="en-US"/>
+        </w:rPr>
+        <w:br/>
+        <w:t>Displa</w:t>
+      </w:r>
+      <w:r>
+        <w:rPr>
+          <w:sz w:val="28"/>
+          <w:szCs w:val="28"/>
+          <w:lang w:val="en-US"/>
+        </w:rPr>
+        <w:t>y the result as follow</w:t>
+      </w:r>
+      <w:r>
+        <w:rPr>
+          <w:sz w:val="28"/>
+          <w:szCs w:val="28"/>
+          <w:lang w:val="en-US"/>
+        </w:rPr>
+        <w:br/>
+        <w:t>KKR</w:t>
+      </w:r>
+      <w:r>
+        <w:rPr>
+          <w:sz w:val="28"/>
+          <w:szCs w:val="28"/>
+          <w:lang w:val="en-US"/>
+        </w:rPr>
+        <w:tab/>
+        <w:t>NNW</w:t>
+      </w:r>
+      <w:r>
+        <w:rPr>
+          <w:sz w:val="28"/>
+          <w:szCs w:val="28"/>
+          <w:lang w:val="en-US"/>
+        </w:rPr>
+        <w:tab/>
+        <w:t>N-2, W-3, L-0</w:t>
+      </w:r>
+    </w:p>
+    <w:p>
+      <w:pPr>
+        <w:pStyle w:val="ListParagraph"/>
+        <w:numPr>
+          <w:ilvl w:val="0"/>
+          <w:numId w:val="1"/>
+        </w:numPr>
+        <w:rPr>
+          <w:sz w:val="28"/>
+          <w:szCs w:val="28"/>
+        </w:rPr>
+      </w:pPr>
     </w:p>
     <w:sectPr>
       <w:pgSz w:w="11906" w:h="16838"/>
@@ -3322,6 +4146,18 @@
       <w:u w:val="single"/>
     </w:rPr>
   </w:style>
+  <w:style w:type="character" w:styleId="FollowedHyperlink">
+    <w:name w:val="FollowedHyperlink"/>
+    <w:basedOn w:val="DefaultParagraphFont"/>
+    <w:uiPriority w:val="99"/>
+    <w:semiHidden/>
+    <w:unhideWhenUsed/>
+    <w:rsid w:val="00D5459B"/>
+    <w:rPr>
+      <w:color w:val="954F72" w:themeColor="followedHyperlink"/>
+      <w:u w:val="single"/>
+    </w:rPr>
+  </w:style>
 </w:styles>
 </file>
 

</xml_diff>